<commit_message>
Expand analysis brief with completed steps
</commit_message>
<xml_diff>
--- a/deliverables/Antiwork_Exploratory_Analysis_Brief.docx
+++ b/deliverables/Antiwork_Exploratory_Analysis_Brief.docx
@@ -788,6 +788,211 @@
       </w:r>
     </w:p>
     <w:p>
+      <w:r>
+        <w:br w:type="page"/>
+      </w:r>
+    </w:p>
+    <w:p>
+      <w:pPr>
+        <w:pStyle w:val="Heading1"/>
+      </w:pPr>
+      <w:r>
+        <w:rPr>
+          <w:rFonts w:ascii="Calibri" w:hAnsi="Calibri"/>
+          <w:b/>
+          <w:i w:val="0"/>
+          <w:color w:val="2E74B5"/>
+          <w:sz w:val="32"/>
+        </w:rPr>
+        <w:t>Analysis steps completed</w:t>
+      </w:r>
+    </w:p>
+    <w:p>
+      <w:pPr>
+        <w:spacing w:after="160"/>
+      </w:pPr>
+      <w:r>
+        <w:rPr>
+          <w:rFonts w:ascii="Calibri" w:hAnsi="Calibri"/>
+          <w:b w:val="0"/>
+          <w:i w:val="0"/>
+          <w:color w:val="5D6B7A"/>
+          <w:sz w:val="19"/>
+        </w:rPr>
+        <w:t>This sequence was completed before the writing handoff. It separates deterministic corpus checks, model-based topic discovery, descriptive prevalence estimates, and robustness evidence.</w:t>
+      </w:r>
+    </w:p>
+    <w:p>
+      <w:pPr>
+        <w:spacing w:after="120"/>
+      </w:pPr>
+      <w:r>
+        <w:rPr>
+          <w:rFonts w:ascii="Calibri" w:hAnsi="Calibri"/>
+          <w:b/>
+          <w:i w:val="0"/>
+          <w:color w:val="17365D"/>
+          <w:sz w:val="20"/>
+        </w:rPr>
+        <w:t xml:space="preserve">1. Freeze and audit the corpus. </w:t>
+      </w:r>
+      <w:r>
+        <w:rPr>
+          <w:rFonts w:ascii="Calibri" w:hAnsi="Calibri"/>
+          <w:b w:val="0"/>
+          <w:i w:val="0"/>
+          <w:color w:val="1F2937"/>
+          <w:sz w:val="19"/>
+        </w:rPr>
+        <w:t>Matched the management-related filter to the preprocessed analysis corpus and confirmed 97,254 unique post IDs. A duplicate audit found 1.2% residual duplicate non-placeholder texts; this is reported rather than silently removed.</w:t>
+      </w:r>
+    </w:p>
+    <w:p>
+      <w:pPr>
+        <w:spacing w:after="120"/>
+      </w:pPr>
+      <w:r>
+        <w:rPr>
+          <w:rFonts w:ascii="Calibri" w:hAnsi="Calibri"/>
+          <w:b/>
+          <w:i w:val="0"/>
+          <w:color w:val="17365D"/>
+          <w:sz w:val="20"/>
+        </w:rPr>
+        <w:t xml:space="preserve">2. Construct the primary text field. </w:t>
+      </w:r>
+      <w:r>
+        <w:rPr>
+          <w:rFonts w:ascii="Calibri" w:hAnsi="Calibri"/>
+          <w:b w:val="0"/>
+          <w:i w:val="0"/>
+          <w:color w:val="1F2937"/>
+          <w:sz w:val="19"/>
+        </w:rPr>
+        <w:t>Used post title plus body after handling deleted and placeholder content. A title-only run was retained as a sensitivity analysis, not substituted for the primary representation.</w:t>
+      </w:r>
+    </w:p>
+    <w:p>
+      <w:pPr>
+        <w:spacing w:after="120"/>
+      </w:pPr>
+      <w:r>
+        <w:rPr>
+          <w:rFonts w:ascii="Calibri" w:hAnsi="Calibri"/>
+          <w:b/>
+          <w:i w:val="0"/>
+          <w:color w:val="17365D"/>
+          <w:sz w:val="20"/>
+        </w:rPr>
+        <w:t xml:space="preserve">3. Discover topics with a current topic-modeling pipeline. </w:t>
+      </w:r>
+      <w:r>
+        <w:rPr>
+          <w:rFonts w:ascii="Calibri" w:hAnsi="Calibri"/>
+          <w:b w:val="0"/>
+          <w:i w:val="0"/>
+          <w:color w:val="1F2937"/>
+          <w:sz w:val="19"/>
+        </w:rPr>
+        <w:t>Embedded documents with all-MiniLM-L6-v2, reduced the embedding space with UMAP, clustered with HDBSCAN, and represented topics with BERTopic c-TF-IDF. The full-corpus model produced 199 non-outlier clusters and assigned 38.6% of posts.</w:t>
+      </w:r>
+    </w:p>
+    <w:p>
+      <w:pPr>
+        <w:spacing w:after="120"/>
+      </w:pPr>
+      <w:r>
+        <w:rPr>
+          <w:rFonts w:ascii="Calibri" w:hAnsi="Calibri"/>
+          <w:b/>
+          <w:i w:val="0"/>
+          <w:color w:val="17365D"/>
+          <w:sz w:val="20"/>
+        </w:rPr>
+        <w:t xml:space="preserve">4. Document the theme map. </w:t>
+      </w:r>
+      <w:r>
+        <w:rPr>
+          <w:rFonts w:ascii="Calibri" w:hAnsi="Calibri"/>
+          <w:b w:val="0"/>
+          <w:i w:val="0"/>
+          <w:color w:val="1F2937"/>
+          <w:sz w:val="19"/>
+        </w:rPr>
+        <w:t>Reviewed the largest 30 clusters and retained 27 interpretable clusters in a nine-theme candidate codebook. Generic, deleted, and community-meta clusters were excluded, yielding 18,506 mapped posts (19.0% of the full filtered corpus).</w:t>
+      </w:r>
+    </w:p>
+    <w:p>
+      <w:pPr>
+        <w:spacing w:after="120"/>
+      </w:pPr>
+      <w:r>
+        <w:rPr>
+          <w:rFonts w:ascii="Calibri" w:hAnsi="Calibri"/>
+          <w:b/>
+          <w:i w:val="0"/>
+          <w:color w:val="17365D"/>
+          <w:sz w:val="20"/>
+        </w:rPr>
+        <w:t xml:space="preserve">5. Estimate descriptive longitudinal patterns. </w:t>
+      </w:r>
+      <w:r>
+        <w:rPr>
+          <w:rFonts w:ascii="Calibri" w:hAnsi="Calibri"/>
+          <w:b w:val="0"/>
+          <w:i w:val="0"/>
+          <w:color w:val="1F2937"/>
+          <w:sz w:val="19"/>
+        </w:rPr>
+        <w:t>Calculated each theme's share of every filtered post in four March-to-February rolling windows. Figure 1 shows the resulting exploratory prevalence patterns; Figure 2 shows monthly assignment coverage so the mapped share is visible.</w:t>
+      </w:r>
+    </w:p>
+    <w:p>
+      <w:pPr>
+        <w:spacing w:after="120"/>
+      </w:pPr>
+      <w:r>
+        <w:rPr>
+          <w:rFonts w:ascii="Calibri" w:hAnsi="Calibri"/>
+          <w:b/>
+          <w:i w:val="0"/>
+          <w:color w:val="17365D"/>
+          <w:sz w:val="20"/>
+        </w:rPr>
+        <w:t xml:space="preserve">6. Test stability and state the boundary. </w:t>
+      </w:r>
+      <w:r>
+        <w:rPr>
+          <w:rFonts w:ascii="Calibri" w:hAnsi="Calibri"/>
+          <w:b w:val="0"/>
+          <w:i w:val="0"/>
+          <w:color w:val="1F2937"/>
+          <w:sz w:val="19"/>
+        </w:rPr>
+        <w:t>Ran seed-stability checks, title-only sensitivity, and unique-post overlap checks across rolling windows. Sentiment was intentionally not analyzed, and the paper will make no causal or full-conversation prevalence claims.</w:t>
+      </w:r>
+    </w:p>
+    <w:p>
+      <w:pPr>
+        <w:spacing w:after="0"/>
+      </w:pPr>
+      <w:r>
+        <w:rPr>
+          <w:rFonts w:ascii="Calibri" w:hAnsi="Calibri"/>
+          <w:b w:val="0"/>
+          <w:i/>
+          <w:color w:val="5D6B7A"/>
+          <w:sz w:val="17"/>
+        </w:rPr>
+        <w:t>The repository retains the reproducible scripts, codebook, diagnostics, and the evidence used for the brief; the brief itself contains the decisions and figures needed for a writing handoff.</w:t>
+      </w:r>
+    </w:p>
+    <w:p>
+      <w:r>
+        <w:br w:type="page"/>
+      </w:r>
+    </w:p>
+    <w:p>
       <w:pPr>
         <w:jc w:val="center"/>
       </w:pPr>
@@ -1474,7 +1679,7 @@
         <w:color w:val="5D6B7A"/>
         <w:sz w:val="16"/>
       </w:rPr>
-      <w:t>Prepared 26 August 2026 | Exploratory evidence package</w:t>
+      <w:t>Prepared 1 September 2026 | Exploratory evidence package</w:t>
     </w:r>
   </w:p>
 </w:ftr>

</xml_diff>

<commit_message>
Add manuscript status to analysis brief
</commit_message>
<xml_diff>
--- a/deliverables/Antiwork_Exploratory_Analysis_Brief.docx
+++ b/deliverables/Antiwork_Exploratory_Analysis_Brief.docx
@@ -1580,6 +1580,109 @@
           <w:color w:val="2E74B5"/>
           <w:sz w:val="26"/>
         </w:rPr>
+        <w:t>Manuscript status</w:t>
+      </w:r>
+    </w:p>
+    <w:tbl>
+      <w:tblPr>
+        <w:tblW w:type="dxa" w:w="9360"/>
+        <w:jc w:val="left"/>
+        <w:tblLayout w:type="fixed"/>
+        <w:tblLook w:firstColumn="1" w:firstRow="1" w:lastColumn="0" w:lastRow="0" w:noHBand="0" w:noVBand="1" w:val="04A0"/>
+      </w:tblPr>
+      <w:tblGrid>
+        <w:gridCol w:w="4680"/>
+        <w:gridCol w:w="4680"/>
+      </w:tblGrid>
+      <w:tr>
+        <w:tc>
+          <w:tcPr>
+            <w:tcW w:type="dxa" w:w="4680"/>
+            <w:tcMar>
+              <w:top w:w="80" w:type="dxa"/>
+              <w:start w:w="120" w:type="dxa"/>
+              <w:bottom w:w="80" w:type="dxa"/>
+              <w:end w:w="120" w:type="dxa"/>
+            </w:tcMar>
+            <w:vAlign w:val="center"/>
+            <w:shd w:fill="F2F4F7"/>
+          </w:tcPr>
+          <w:p>
+            <w:r>
+              <w:rPr>
+                <w:rFonts w:ascii="Calibri" w:hAnsi="Calibri"/>
+                <w:b/>
+                <w:i w:val="0"/>
+                <w:color w:val="17365D"/>
+                <w:sz w:val="20"/>
+              </w:rPr>
+              <w:t>Draft updated</w:t>
+            </w:r>
+          </w:p>
+          <w:p>
+            <w:r>
+              <w:rPr>
+                <w:rFonts w:ascii="Calibri" w:hAnsi="Calibri"/>
+                <w:b w:val="0"/>
+                <w:i w:val="0"/>
+                <w:color w:val="1F2937"/>
+                <w:sz w:val="18"/>
+              </w:rPr>
+              <w:t>A revised manuscript draft now includes the updated title and abstract; current-study framing and research question; Methods, Results, Discussion, implications, limitations; figures; and primary BERTopic references.</w:t>
+            </w:r>
+          </w:p>
+        </w:tc>
+        <w:tc>
+          <w:tcPr>
+            <w:tcW w:type="dxa" w:w="4680"/>
+            <w:tcMar>
+              <w:top w:w="80" w:type="dxa"/>
+              <w:start w:w="120" w:type="dxa"/>
+              <w:bottom w:w="80" w:type="dxa"/>
+              <w:end w:w="120" w:type="dxa"/>
+            </w:tcMar>
+            <w:vAlign w:val="center"/>
+            <w:shd w:fill="F2F4F7"/>
+          </w:tcPr>
+          <w:p>
+            <w:r>
+              <w:rPr>
+                <w:rFonts w:ascii="Calibri" w:hAnsi="Calibri"/>
+                <w:b/>
+                <w:i w:val="0"/>
+                <w:color w:val="17365D"/>
+                <w:sz w:val="20"/>
+              </w:rPr>
+              <w:t>Final editorial pass</w:t>
+            </w:r>
+          </w:p>
+          <w:p>
+            <w:r>
+              <w:rPr>
+                <w:rFonts w:ascii="Calibri" w:hAnsi="Calibri"/>
+                <w:b w:val="0"/>
+                <w:i w:val="0"/>
+                <w:color w:val="1F2937"/>
+                <w:sz w:val="18"/>
+              </w:rPr>
+              <w:t>Before external circulation, harmonize retained Background language with the paper's exploratory, descriptive scope. Historical theory and prior turnover findings should remain context, not claims tested by this study.</w:t>
+            </w:r>
+          </w:p>
+        </w:tc>
+      </w:tr>
+    </w:tbl>
+    <w:p>
+      <w:pPr>
+        <w:pStyle w:val="Heading2"/>
+      </w:pPr>
+      <w:r>
+        <w:rPr>
+          <w:rFonts w:ascii="Calibri" w:hAnsi="Calibri"/>
+          <w:b/>
+          <w:i w:val="0"/>
+          <w:color w:val="2E74B5"/>
+          <w:sz w:val="26"/>
+        </w:rPr>
         <w:t>Writing handoff</w:t>
       </w:r>
     </w:p>

</xml_diff>

<commit_message>
Refine analysis brief into research memo
</commit_message>
<xml_diff>
--- a/deliverables/Antiwork_Exploratory_Analysis_Brief.docx
+++ b/deliverables/Antiwork_Exploratory_Analysis_Brief.docx
@@ -9,12 +9,12 @@
       <w:r>
         <w:rPr>
           <w:rFonts w:ascii="Calibri" w:hAnsi="Calibri"/>
-          <w:b/>
+          <w:b w:val="0"/>
           <w:i w:val="0"/>
-          <w:color w:val="4978A8"/>
-          <w:sz w:val="19"/>
+          <w:color w:val="5D6B7A"/>
+          <w:sz w:val="18"/>
         </w:rPr>
-        <w:t>ANALYSIS BRIEF</w:t>
+        <w:t>Analysis brief</w:t>
       </w:r>
     </w:p>
     <w:p>
@@ -27,14 +27,14 @@
           <w:b/>
           <w:i w:val="0"/>
           <w:color w:val="17365D"/>
-          <w:sz w:val="52"/>
+          <w:sz w:val="44"/>
         </w:rPr>
         <w:t>Antiwork Topic Modeling</w:t>
       </w:r>
     </w:p>
     <w:p>
       <w:pPr>
-        <w:spacing w:after="280"/>
+        <w:spacing w:after="240"/>
       </w:pPr>
       <w:r>
         <w:rPr>
@@ -42,9 +42,9 @@
           <w:b w:val="0"/>
           <w:i w:val="0"/>
           <w:color w:val="5D6B7A"/>
-          <w:sz w:val="26"/>
+          <w:sz w:val="23"/>
         </w:rPr>
-        <w:t>Exploratory longitudinal findings and writing handoff</w:t>
+        <w:t>Exploratory longitudinal analysis for collaborator review</w:t>
       </w:r>
     </w:p>
     <w:tbl>
@@ -71,7 +71,7 @@
               <w:end w:w="120" w:type="dxa"/>
             </w:tcMar>
             <w:vAlign w:val="center"/>
-            <w:shd w:fill="17365D"/>
+            <w:shd w:fill="FAFBFC"/>
           </w:tcPr>
           <w:p>
             <w:pPr>
@@ -82,8 +82,8 @@
                 <w:rFonts w:ascii="Calibri" w:hAnsi="Calibri"/>
                 <w:b/>
                 <w:i w:val="0"/>
-                <w:color w:val="FFFFFF"/>
-                <w:sz w:val="30"/>
+                <w:color w:val="17365D"/>
+                <w:sz w:val="26"/>
               </w:rPr>
               <w:t>97,254</w:t>
             </w:r>
@@ -97,7 +97,7 @@
                 <w:rFonts w:ascii="Calibri" w:hAnsi="Calibri"/>
                 <w:b w:val="0"/>
                 <w:i w:val="0"/>
-                <w:color w:val="D9E6F2"/>
+                <w:color w:val="5D6B7A"/>
                 <w:sz w:val="16"/>
               </w:rPr>
               <w:t>filtered posts</w:t>
@@ -114,7 +114,7 @@
               <w:end w:w="120" w:type="dxa"/>
             </w:tcMar>
             <w:vAlign w:val="center"/>
-            <w:shd w:fill="17365D"/>
+            <w:shd w:fill="FAFBFC"/>
           </w:tcPr>
           <w:p>
             <w:pPr>
@@ -125,8 +125,8 @@
                 <w:rFonts w:ascii="Calibri" w:hAnsi="Calibri"/>
                 <w:b/>
                 <w:i w:val="0"/>
-                <w:color w:val="FFFFFF"/>
-                <w:sz w:val="30"/>
+                <w:color w:val="17365D"/>
+                <w:sz w:val="26"/>
               </w:rPr>
               <w:t>199</w:t>
             </w:r>
@@ -140,7 +140,7 @@
                 <w:rFonts w:ascii="Calibri" w:hAnsi="Calibri"/>
                 <w:b w:val="0"/>
                 <w:i w:val="0"/>
-                <w:color w:val="D9E6F2"/>
+                <w:color w:val="5D6B7A"/>
                 <w:sz w:val="16"/>
               </w:rPr>
               <w:t>non-outlier clusters</w:t>
@@ -157,7 +157,7 @@
               <w:end w:w="120" w:type="dxa"/>
             </w:tcMar>
             <w:vAlign w:val="center"/>
-            <w:shd w:fill="17365D"/>
+            <w:shd w:fill="FAFBFC"/>
           </w:tcPr>
           <w:p>
             <w:pPr>
@@ -168,8 +168,8 @@
                 <w:rFonts w:ascii="Calibri" w:hAnsi="Calibri"/>
                 <w:b/>
                 <w:i w:val="0"/>
-                <w:color w:val="FFFFFF"/>
-                <w:sz w:val="30"/>
+                <w:color w:val="17365D"/>
+                <w:sz w:val="26"/>
               </w:rPr>
               <w:t>38.6%</w:t>
             </w:r>
@@ -183,7 +183,7 @@
                 <w:rFonts w:ascii="Calibri" w:hAnsi="Calibri"/>
                 <w:b w:val="0"/>
                 <w:i w:val="0"/>
-                <w:color w:val="D9E6F2"/>
+                <w:color w:val="5D6B7A"/>
                 <w:sz w:val="16"/>
               </w:rPr>
               <w:t>topic assignment</w:t>
@@ -200,7 +200,7 @@
               <w:end w:w="120" w:type="dxa"/>
             </w:tcMar>
             <w:vAlign w:val="center"/>
-            <w:shd w:fill="17365D"/>
+            <w:shd w:fill="FAFBFC"/>
           </w:tcPr>
           <w:p>
             <w:pPr>
@@ -211,8 +211,8 @@
                 <w:rFonts w:ascii="Calibri" w:hAnsi="Calibri"/>
                 <w:b/>
                 <w:i w:val="0"/>
-                <w:color w:val="FFFFFF"/>
-                <w:sz w:val="30"/>
+                <w:color w:val="17365D"/>
+                <w:sz w:val="26"/>
               </w:rPr>
               <w:t>19.0%</w:t>
             </w:r>
@@ -226,7 +226,7 @@
                 <w:rFonts w:ascii="Calibri" w:hAnsi="Calibri"/>
                 <w:b w:val="0"/>
                 <w:i w:val="0"/>
-                <w:color w:val="D9E6F2"/>
+                <w:color w:val="5D6B7A"/>
                 <w:sz w:val="16"/>
               </w:rPr>
               <w:t>theme-map coverage</w:t>
@@ -244,10 +244,10 @@
           <w:rFonts w:ascii="Calibri" w:hAnsi="Calibri"/>
           <w:b/>
           <w:i w:val="0"/>
-          <w:color w:val="2E74B5"/>
-          <w:sz w:val="32"/>
+          <w:color w:val="17365D"/>
+          <w:sz w:val="30"/>
         </w:rPr>
-        <w:t>Bottom line</w:t>
+        <w:t>Study summary</w:t>
       </w:r>
     </w:p>
     <w:p>
@@ -287,7 +287,7 @@
               <w:end w:w="120" w:type="dxa"/>
             </w:tcMar>
             <w:vAlign w:val="center"/>
-            <w:shd w:fill="F2F4F7"/>
+            <w:shd w:fill="FAFBFC"/>
           </w:tcPr>
           <w:p>
             <w:r>
@@ -296,9 +296,9 @@
                 <w:b/>
                 <w:i w:val="0"/>
                 <w:color w:val="17365D"/>
-                <w:sz w:val="20"/>
+                <w:sz w:val="19"/>
               </w:rPr>
-              <w:t>What I completed</w:t>
+              <w:t>Completed analysis</w:t>
             </w:r>
           </w:p>
           <w:p>
@@ -310,7 +310,7 @@
                 <w:color w:val="1F2937"/>
                 <w:sz w:val="18"/>
               </w:rPr>
-              <w:t>Rebuilt the analysis with a modern BERTopic pipeline; exported document-level assignments and four rolling-window fits; finalized a 27-cluster, nine-theme codebook; and generated trends, figures, and a reproducibility record.</w:t>
+              <w:t>Rebuilt the analysis with BERTopic; exported document-level assignments and four rolling-window fits; finalized a 27-cluster, nine-theme codebook; and produced figures and reproducibility materials.</w:t>
             </w:r>
           </w:p>
         </w:tc>
@@ -324,7 +324,7 @@
               <w:end w:w="120" w:type="dxa"/>
             </w:tcMar>
             <w:vAlign w:val="center"/>
-            <w:shd w:fill="F2F4F7"/>
+            <w:shd w:fill="FAFBFC"/>
           </w:tcPr>
           <w:p>
             <w:r>
@@ -333,9 +333,9 @@
                 <w:b/>
                 <w:i w:val="0"/>
                 <w:color w:val="17365D"/>
-                <w:sz w:val="20"/>
+                <w:sz w:val="19"/>
               </w:rPr>
-              <w:t>What the paper should claim</w:t>
+              <w:t>Interpretive scope</w:t>
             </w:r>
           </w:p>
           <w:p>
@@ -347,7 +347,7 @@
                 <w:color w:val="1F2937"/>
                 <w:sz w:val="18"/>
               </w:rPr>
-              <w:t>Descriptive prevalence patterns within the documented theme map. The paper should not claim causal effects, full-conversation prevalence, or sentiment change.</w:t>
+              <w:t>The findings describe prevalence patterns within the documented theme map. They do not support causal claims, full-conversation prevalence estimates, or sentiment conclusions.</w:t>
             </w:r>
           </w:p>
         </w:tc>
@@ -362,10 +362,10 @@
           <w:rFonts w:ascii="Calibri" w:hAnsi="Calibri"/>
           <w:b/>
           <w:i w:val="0"/>
-          <w:color w:val="2E74B5"/>
-          <w:sz w:val="32"/>
+          <w:color w:val="17365D"/>
+          <w:sz w:val="30"/>
         </w:rPr>
-        <w:t>Headline patterns</w:t>
+        <w:t>Selected findings</w:t>
       </w:r>
     </w:p>
     <w:tbl>
@@ -478,7 +478,7 @@
                 <w:color w:val="17365D"/>
                 <w:sz w:val="18"/>
               </w:rPr>
-              <w:t>Descriptive readout</w:t>
+              <w:t>Interpretation</w:t>
             </w:r>
           </w:p>
         </w:tc>
@@ -801,10 +801,10 @@
           <w:rFonts w:ascii="Calibri" w:hAnsi="Calibri"/>
           <w:b/>
           <w:i w:val="0"/>
-          <w:color w:val="2E74B5"/>
-          <w:sz w:val="32"/>
+          <w:color w:val="17365D"/>
+          <w:sz w:val="30"/>
         </w:rPr>
-        <w:t>Analysis steps completed</w:t>
+        <w:t>Analytic workflow</w:t>
       </w:r>
     </w:p>
     <w:p>
@@ -819,7 +819,7 @@
           <w:color w:val="5D6B7A"/>
           <w:sz w:val="19"/>
         </w:rPr>
-        <w:t>This sequence was completed before the writing handoff. It separates deterministic corpus checks, model-based topic discovery, descriptive prevalence estimates, and robustness evidence.</w:t>
+        <w:t>The analysis proceeded as follows. Corpus checks, model-based topic discovery, descriptive prevalence estimates, and robustness evidence are reported separately.</w:t>
       </w:r>
     </w:p>
     <w:p>
@@ -984,7 +984,7 @@
           <w:color w:val="5D6B7A"/>
           <w:sz w:val="17"/>
         </w:rPr>
-        <w:t>The repository retains the reproducible scripts, codebook, diagnostics, and the evidence used for the brief; the brief itself contains the decisions and figures needed for a writing handoff.</w:t>
+        <w:t>The repository includes the reproducible scripts, codebook, diagnostics, and aggregate evidence used in this brief.</w:t>
       </w:r>
     </w:p>
     <w:p>
@@ -1012,7 +1012,7 @@
                     <pic:cNvPicPr/>
                   </pic:nvPicPr>
                   <pic:blipFill>
-                    <a:blip r:embed="rId11"/>
+                    <a:blip r:embed="rId13"/>
                     <a:stretch>
                       <a:fillRect/>
                     </a:stretch>
@@ -1055,10 +1055,10 @@
           <w:rFonts w:ascii="Calibri" w:hAnsi="Calibri"/>
           <w:b/>
           <w:i w:val="0"/>
-          <w:color w:val="2E74B5"/>
-          <w:sz w:val="32"/>
+          <w:color w:val="17365D"/>
+          <w:sz w:val="30"/>
         </w:rPr>
-        <w:t>Method and evidence boundary</w:t>
+        <w:t>Analytic approach and scope</w:t>
       </w:r>
     </w:p>
     <w:tbl>
@@ -1083,7 +1083,7 @@
               <w:end w:w="120" w:type="dxa"/>
             </w:tcMar>
             <w:vAlign w:val="center"/>
-            <w:shd w:fill="F2F4F7"/>
+            <w:shd w:fill="FAFBFC"/>
           </w:tcPr>
           <w:p>
             <w:r>
@@ -1092,9 +1092,9 @@
                 <w:b/>
                 <w:i w:val="0"/>
                 <w:color w:val="17365D"/>
-                <w:sz w:val="20"/>
+                <w:sz w:val="19"/>
               </w:rPr>
-              <w:t>Primary method</w:t>
+              <w:t>Primary analysis</w:t>
             </w:r>
           </w:p>
           <w:p>
@@ -1106,7 +1106,7 @@
                 <w:color w:val="1F2937"/>
                 <w:sz w:val="18"/>
               </w:rPr>
-              <w:t>Sentence-transformer embeddings (all-MiniLM-L6-v2), UMAP, HDBSCAN, BERTopic topic representations, and a full-corpus model used for longitudinal prevalence. Per-window fits are supporting stability diagnostics.</w:t>
+              <w:t>Sentence-transformer embeddings (all-MiniLM-L6-v2), UMAP, HDBSCAN, BERTopic topic representations, and a full-corpus model for longitudinal prevalence. Per-window fits serve as stability diagnostics.</w:t>
             </w:r>
           </w:p>
         </w:tc>
@@ -1120,7 +1120,7 @@
               <w:end w:w="120" w:type="dxa"/>
             </w:tcMar>
             <w:vAlign w:val="center"/>
-            <w:shd w:fill="F2F4F7"/>
+            <w:shd w:fill="FAFBFC"/>
           </w:tcPr>
           <w:p>
             <w:r>
@@ -1129,9 +1129,9 @@
                 <w:b/>
                 <w:i w:val="0"/>
                 <w:color w:val="17365D"/>
-                <w:sz w:val="20"/>
+                <w:sz w:val="19"/>
               </w:rPr>
-              <w:t>Interpretation boundary</w:t>
+              <w:t>Coverage of estimates</w:t>
             </w:r>
           </w:p>
           <w:p>
@@ -1158,10 +1158,10 @@
           <w:rFonts w:ascii="Calibri" w:hAnsi="Calibri"/>
           <w:b/>
           <w:i w:val="0"/>
-          <w:color w:val="2E74B5"/>
-          <w:sz w:val="26"/>
+          <w:color w:val="17365D"/>
+          <w:sz w:val="25"/>
         </w:rPr>
-        <w:t>Coverage is visible, not hidden</w:t>
+        <w:t>Assignment coverage</w:t>
       </w:r>
     </w:p>
     <w:p>
@@ -1184,7 +1184,7 @@
                     <pic:cNvPicPr/>
                   </pic:nvPicPr>
                   <pic:blipFill>
-                    <a:blip r:embed="rId12"/>
+                    <a:blip r:embed="rId14"/>
                     <a:stretch>
                       <a:fillRect/>
                     </a:stretch>
@@ -1232,10 +1232,10 @@
           <w:rFonts w:ascii="Calibri" w:hAnsi="Calibri"/>
           <w:b/>
           <w:i w:val="0"/>
-          <w:color w:val="2E74B5"/>
-          <w:sz w:val="26"/>
+          <w:color w:val="17365D"/>
+          <w:sz w:val="25"/>
         </w:rPr>
-        <w:t>Robustness checks completed</w:t>
+        <w:t>Robustness checks</w:t>
       </w:r>
     </w:p>
     <w:tbl>
@@ -1474,10 +1474,10 @@
           <w:rFonts w:ascii="Calibri" w:hAnsi="Calibri"/>
           <w:b/>
           <w:i w:val="0"/>
-          <w:color w:val="2E74B5"/>
-          <w:sz w:val="32"/>
+          <w:color w:val="17365D"/>
+          <w:sz w:val="30"/>
         </w:rPr>
-        <w:t>What is left</w:t>
+        <w:t>Remaining work</w:t>
       </w:r>
     </w:p>
     <w:tbl>
@@ -1502,7 +1502,7 @@
               <w:end w:w="120" w:type="dxa"/>
             </w:tcMar>
             <w:vAlign w:val="center"/>
-            <w:shd w:fill="F2F4F7"/>
+            <w:shd w:fill="FAFBFC"/>
           </w:tcPr>
           <w:p>
             <w:r>
@@ -1511,9 +1511,9 @@
                 <w:b/>
                 <w:i w:val="0"/>
                 <w:color w:val="17365D"/>
-                <w:sz w:val="20"/>
+                <w:sz w:val="19"/>
               </w:rPr>
-              <w:t>Ready now</w:t>
+              <w:t>Available for drafting</w:t>
             </w:r>
           </w:p>
           <w:p>
@@ -1525,7 +1525,7 @@
                 <w:color w:val="1F2937"/>
                 <w:sz w:val="18"/>
               </w:rPr>
-              <w:t>Results, figures, a theme codebook, coverage diagnostics, seed stability, text-mode sensitivity, and a bounded writing frame. The collaborator meeting can focus on interpretation and drafting.</w:t>
+              <w:t>Results, figures, a theme codebook, coverage diagnostics, seed stability, text-mode sensitivity, and a defined interpretive scope are ready for the manuscript.</w:t>
             </w:r>
           </w:p>
         </w:tc>
@@ -1539,7 +1539,7 @@
               <w:end w:w="120" w:type="dxa"/>
             </w:tcMar>
             <w:vAlign w:val="center"/>
-            <w:shd w:fill="F2F4F7"/>
+            <w:shd w:fill="FAFBFC"/>
           </w:tcPr>
           <w:p>
             <w:r>
@@ -1548,9 +1548,9 @@
                 <w:b/>
                 <w:i w:val="0"/>
                 <w:color w:val="17365D"/>
-                <w:sz w:val="20"/>
+                <w:sz w:val="19"/>
               </w:rPr>
-              <w:t>Defer unless claims broaden</w:t>
+              <w:t>Optional extensions</w:t>
             </w:r>
           </w:p>
           <w:p>
@@ -1562,7 +1562,7 @@
                 <w:color w:val="1F2937"/>
                 <w:sz w:val="18"/>
               </w:rPr>
-              <w:t>Sentiment annotation, a larger codebook, saved-model refit, TopicGPT comparison, and the MPNet check are useful extensions, not blockers for this exploratory paper.</w:t>
+              <w:t>Sentiment annotation, a larger codebook, saved-model refit, TopicGPT comparison, and the MPNet check are possible extensions, but are not required for this exploratory paper.</w:t>
             </w:r>
           </w:p>
         </w:tc>
@@ -1577,10 +1577,10 @@
           <w:rFonts w:ascii="Calibri" w:hAnsi="Calibri"/>
           <w:b/>
           <w:i w:val="0"/>
-          <w:color w:val="2E74B5"/>
-          <w:sz w:val="26"/>
+          <w:color w:val="17365D"/>
+          <w:sz w:val="25"/>
         </w:rPr>
-        <w:t>Manuscript status</w:t>
+        <w:t>Manuscript revision status</w:t>
       </w:r>
     </w:p>
     <w:tbl>
@@ -1605,7 +1605,7 @@
               <w:end w:w="120" w:type="dxa"/>
             </w:tcMar>
             <w:vAlign w:val="center"/>
-            <w:shd w:fill="F2F4F7"/>
+            <w:shd w:fill="FAFBFC"/>
           </w:tcPr>
           <w:p>
             <w:r>
@@ -1614,9 +1614,9 @@
                 <w:b/>
                 <w:i w:val="0"/>
                 <w:color w:val="17365D"/>
-                <w:sz w:val="20"/>
+                <w:sz w:val="19"/>
               </w:rPr>
-              <w:t>Draft updated</w:t>
+              <w:t>Sections revised</w:t>
             </w:r>
           </w:p>
           <w:p>
@@ -1628,7 +1628,7 @@
                 <w:color w:val="1F2937"/>
                 <w:sz w:val="18"/>
               </w:rPr>
-              <w:t>A revised manuscript draft now includes the updated title and abstract; current-study framing and research question; Methods, Results, Discussion, implications, limitations; figures; and primary BERTopic references.</w:t>
+              <w:t>The revised manuscript includes the title and abstract; current-study framing and research question; Methods, Results, Discussion, implications, limitations; figures; and primary BERTopic references.</w:t>
             </w:r>
           </w:p>
         </w:tc>
@@ -1642,7 +1642,7 @@
               <w:end w:w="120" w:type="dxa"/>
             </w:tcMar>
             <w:vAlign w:val="center"/>
-            <w:shd w:fill="F2F4F7"/>
+            <w:shd w:fill="FAFBFC"/>
           </w:tcPr>
           <w:p>
             <w:r>
@@ -1651,9 +1651,9 @@
                 <w:b/>
                 <w:i w:val="0"/>
                 <w:color w:val="17365D"/>
-                <w:sz w:val="20"/>
+                <w:sz w:val="19"/>
               </w:rPr>
-              <w:t>Final editorial pass</w:t>
+              <w:t>Before circulation</w:t>
             </w:r>
           </w:p>
           <w:p>
@@ -1665,7 +1665,7 @@
                 <w:color w:val="1F2937"/>
                 <w:sz w:val="18"/>
               </w:rPr>
-              <w:t>Before external circulation, harmonize retained Background language with the paper's exploratory, descriptive scope. Historical theory and prior turnover findings should remain context, not claims tested by this study.</w:t>
+              <w:t>Harmonize retained Background language with the paper's exploratory, descriptive scope. Historical theory and prior turnover findings should remain context, not claims tested by this study.</w:t>
             </w:r>
           </w:p>
         </w:tc>
@@ -1680,10 +1680,10 @@
           <w:rFonts w:ascii="Calibri" w:hAnsi="Calibri"/>
           <w:b/>
           <w:i w:val="0"/>
-          <w:color w:val="2E74B5"/>
-          <w:sz w:val="26"/>
+          <w:color w:val="17365D"/>
+          <w:sz w:val="25"/>
         </w:rPr>
-        <w:t>Writing handoff</w:t>
+        <w:t>Materials for drafting</w:t>
       </w:r>
     </w:p>
     <w:p>
@@ -1715,7 +1715,7 @@
         </w:rPr>
         <w:t xml:space="preserve">Reproducible code and shareable evidence: </w:t>
       </w:r>
-      <w:hyperlink r:id="rId13">
+      <w:hyperlink r:id="rId15">
         <w:r>
           <w:rPr>
             <w:color w:val="2E74B5"/>
@@ -1750,14 +1750,16 @@
           <w:b/>
           <w:i w:val="0"/>
           <w:color w:val="17365D"/>
-          <w:sz w:val="19"/>
+          <w:sz w:val="18"/>
         </w:rPr>
-        <w:t>Meeting frame: the updated exploratory analysis is complete and ready to become a bounded, reproducible topic-prevalence paper, without sentiment or causal claims.</w:t>
+        <w:t>Current status: the analysis package is complete and ready for drafting as a descriptive, exploratory topic-prevalence study.</w:t>
       </w:r>
     </w:p>
     <w:sectPr>
       <w:headerReference w:type="default" r:id="rId9"/>
-      <w:footerReference w:type="default" r:id="rId10"/>
+      <w:headerReference w:type="even" r:id="rId10"/>
+      <w:footerReference w:type="default" r:id="rId11"/>
+      <w:footerReference w:type="even" r:id="rId12"/>
       <w:pgSz w:w="12240" w:h="15840"/>
       <w:pgMar w:top="1094" w:right="1181" w:bottom="1008" w:left="1181" w:header="403" w:footer="403" w:gutter="0"/>
       <w:cols w:space="720"/>
@@ -1788,6 +1790,27 @@
 </w:ftr>
 </file>
 
+<file path=word/footer2.xml><?xml version="1.0" encoding="utf-8"?>
+<w:ftr xmlns:m="http://schemas.openxmlformats.org/officeDocument/2006/math" xmlns:mc="http://schemas.openxmlformats.org/markup-compatibility/2006" xmlns:mo="http://schemas.microsoft.com/office/mac/office/2008/main" xmlns:mv="urn:schemas-microsoft-com:mac:vml" xmlns:o="urn:schemas-microsoft-com:office:office" xmlns:r="http://schemas.openxmlformats.org/officeDocument/2006/relationships" xmlns:v="urn:schemas-microsoft-com:vml" xmlns:w10="urn:schemas-microsoft-com:office:word" xmlns:w14="http://schemas.microsoft.com/office/word/2010/wordml" xmlns:w="http://schemas.openxmlformats.org/wordprocessingml/2006/main" xmlns:wne="http://schemas.microsoft.com/office/word/2006/wordml" xmlns:wp14="http://schemas.microsoft.com/office/word/2010/wordprocessingDrawing" xmlns:wp="http://schemas.openxmlformats.org/drawingml/2006/wordprocessingDrawing" xmlns:wpc="http://schemas.microsoft.com/office/word/2010/wordprocessingCanvas" xmlns:wpg="http://schemas.microsoft.com/office/word/2010/wordprocessingGroup" xmlns:wpi="http://schemas.microsoft.com/office/word/2010/wordprocessingInk" xmlns:wps="http://schemas.microsoft.com/office/word/2010/wordprocessingShape" mc:Ignorable="w14 wp14">
+  <w:p>
+    <w:pPr>
+      <w:pStyle w:val="Footer"/>
+      <w:jc w:val="center"/>
+    </w:pPr>
+    <w:r>
+      <w:rPr>
+        <w:rFonts w:ascii="Calibri" w:hAnsi="Calibri"/>
+        <w:b w:val="0"/>
+        <w:i w:val="0"/>
+        <w:color w:val="5D6B7A"/>
+        <w:sz w:val="16"/>
+      </w:rPr>
+      <w:t>Prepared 1 September 2026 | Exploratory evidence package</w:t>
+    </w:r>
+  </w:p>
+</w:ftr>
+</file>
+
 <file path=word/header1.xml><?xml version="1.0" encoding="utf-8"?>
 <w:hdr xmlns:m="http://schemas.openxmlformats.org/officeDocument/2006/math" xmlns:mc="http://schemas.openxmlformats.org/markup-compatibility/2006" xmlns:mo="http://schemas.microsoft.com/office/mac/office/2008/main" xmlns:mv="urn:schemas-microsoft-com:mac:vml" xmlns:o="urn:schemas-microsoft-com:office:office" xmlns:r="http://schemas.openxmlformats.org/officeDocument/2006/relationships" xmlns:v="urn:schemas-microsoft-com:vml" xmlns:w10="urn:schemas-microsoft-com:office:word" xmlns:w14="http://schemas.microsoft.com/office/word/2010/wordml" xmlns:w="http://schemas.openxmlformats.org/wordprocessingml/2006/main" xmlns:wne="http://schemas.microsoft.com/office/word/2006/wordml" xmlns:wp14="http://schemas.microsoft.com/office/word/2010/wordprocessingDrawing" xmlns:wp="http://schemas.openxmlformats.org/drawingml/2006/wordprocessingDrawing" xmlns:wpc="http://schemas.microsoft.com/office/word/2010/wordprocessingCanvas" xmlns:wpg="http://schemas.microsoft.com/office/word/2010/wordprocessingGroup" xmlns:wpi="http://schemas.microsoft.com/office/word/2010/wordprocessingInk" xmlns:wps="http://schemas.microsoft.com/office/word/2010/wordprocessingShape" mc:Ignorable="w14 wp14">
   <w:p>
@@ -1798,12 +1821,33 @@
     <w:r>
       <w:rPr>
         <w:rFonts w:ascii="Calibri" w:hAnsi="Calibri"/>
-        <w:b/>
+        <w:b w:val="0"/>
         <w:i w:val="0"/>
         <w:color w:val="5D6B7A"/>
         <w:sz w:val="16"/>
       </w:rPr>
-      <w:t>ANTIWORK TOPIC MODELING | EXPLORATORY ANALYSIS BRIEF</w:t>
+      <w:t>Antiwork topic modeling | Analysis brief</w:t>
+    </w:r>
+  </w:p>
+</w:hdr>
+</file>
+
+<file path=word/header2.xml><?xml version="1.0" encoding="utf-8"?>
+<w:hdr xmlns:m="http://schemas.openxmlformats.org/officeDocument/2006/math" xmlns:mc="http://schemas.openxmlformats.org/markup-compatibility/2006" xmlns:mo="http://schemas.microsoft.com/office/mac/office/2008/main" xmlns:mv="urn:schemas-microsoft-com:mac:vml" xmlns:o="urn:schemas-microsoft-com:office:office" xmlns:r="http://schemas.openxmlformats.org/officeDocument/2006/relationships" xmlns:v="urn:schemas-microsoft-com:vml" xmlns:w10="urn:schemas-microsoft-com:office:word" xmlns:w14="http://schemas.microsoft.com/office/word/2010/wordml" xmlns:w="http://schemas.openxmlformats.org/wordprocessingml/2006/main" xmlns:wne="http://schemas.microsoft.com/office/word/2006/wordml" xmlns:wp14="http://schemas.microsoft.com/office/word/2010/wordprocessingDrawing" xmlns:wp="http://schemas.openxmlformats.org/drawingml/2006/wordprocessingDrawing" xmlns:wpc="http://schemas.microsoft.com/office/word/2010/wordprocessingCanvas" xmlns:wpg="http://schemas.microsoft.com/office/word/2010/wordprocessingGroup" xmlns:wpi="http://schemas.microsoft.com/office/word/2010/wordprocessingInk" xmlns:wps="http://schemas.microsoft.com/office/word/2010/wordprocessingShape" mc:Ignorable="w14 wp14">
+  <w:p>
+    <w:pPr>
+      <w:pStyle w:val="Header"/>
+      <w:jc w:val="right"/>
+    </w:pPr>
+    <w:r>
+      <w:rPr>
+        <w:rFonts w:ascii="Calibri" w:hAnsi="Calibri"/>
+        <w:b w:val="0"/>
+        <w:i w:val="0"/>
+        <w:color w:val="5D6B7A"/>
+        <w:sz w:val="16"/>
+      </w:rPr>
+      <w:t>Antiwork topic modeling | Analysis brief</w:t>
     </w:r>
   </w:p>
 </w:hdr>
@@ -2242,8 +2286,8 @@
       <w:rFonts w:asciiTheme="majorHAnsi" w:eastAsiaTheme="majorEastAsia" w:hAnsiTheme="majorHAnsi" w:cstheme="majorBidi" w:ascii="Calibri" w:hAnsi="Calibri"/>
       <w:b/>
       <w:bCs/>
-      <w:color w:val="2E74B5"/>
-      <w:sz w:val="32"/>
+      <w:color w:val="17365D"/>
+      <w:sz w:val="30"/>
       <w:szCs w:val="28"/>
     </w:rPr>
   </w:style>
@@ -2266,8 +2310,8 @@
       <w:rFonts w:asciiTheme="majorHAnsi" w:eastAsiaTheme="majorEastAsia" w:hAnsiTheme="majorHAnsi" w:cstheme="majorBidi" w:ascii="Calibri" w:hAnsi="Calibri"/>
       <w:b/>
       <w:bCs/>
-      <w:color w:val="2E74B5"/>
-      <w:sz w:val="26"/>
+      <w:color w:val="17365D"/>
+      <w:sz w:val="25"/>
       <w:szCs w:val="26"/>
     </w:rPr>
   </w:style>

</xml_diff>

<commit_message>
Add data provenance and takeaways to brief
</commit_message>
<xml_diff>
--- a/deliverables/Antiwork_Exploratory_Analysis_Brief.docx
+++ b/deliverables/Antiwork_Exploratory_Analysis_Brief.docx
@@ -788,6 +788,36 @@
       </w:r>
     </w:p>
     <w:p>
+      <w:pPr>
+        <w:pStyle w:val="Heading2"/>
+      </w:pPr>
+      <w:r>
+        <w:rPr>
+          <w:rFonts w:ascii="Calibri" w:hAnsi="Calibri"/>
+          <w:b/>
+          <w:i w:val="0"/>
+          <w:color w:val="17365D"/>
+          <w:sz w:val="25"/>
+        </w:rPr>
+        <w:t>Data collection</w:t>
+      </w:r>
+    </w:p>
+    <w:p>
+      <w:pPr>
+        <w:spacing w:after="0"/>
+      </w:pPr>
+      <w:r>
+        <w:rPr>
+          <w:rFonts w:ascii="Calibri" w:hAnsi="Calibri"/>
+          <w:b w:val="0"/>
+          <w:i w:val="0"/>
+          <w:color w:val="1F2937"/>
+          <w:sz w:val="18"/>
+        </w:rPr>
+        <w:t>Public r/antiwork submissions were retrieved through the Arctic Shift archive API in monthly UTC batches from 1 March 2021 through 1 March 2025. The analysis retained unique posts whose title or body matched the established management terms boss, manager, supervisor, or team lead, including plural variants. The resulting corpus is an archive-based sample of public discourse, not a representative sample of employees or an author-level panel.</w:t>
+      </w:r>
+    </w:p>
+    <w:p>
       <w:r>
         <w:br w:type="page"/>
       </w:r>
@@ -1467,6 +1497,109 @@
     </w:p>
     <w:p>
       <w:pPr>
+        <w:pStyle w:val="Heading2"/>
+      </w:pPr>
+      <w:r>
+        <w:rPr>
+          <w:rFonts w:ascii="Calibri" w:hAnsi="Calibri"/>
+          <w:b/>
+          <w:i w:val="0"/>
+          <w:color w:val="17365D"/>
+          <w:sz w:val="25"/>
+        </w:rPr>
+        <w:t>Interpreting the results</w:t>
+      </w:r>
+    </w:p>
+    <w:tbl>
+      <w:tblPr>
+        <w:tblW w:type="dxa" w:w="9360"/>
+        <w:jc w:val="left"/>
+        <w:tblLayout w:type="fixed"/>
+        <w:tblLook w:firstColumn="1" w:firstRow="1" w:lastColumn="0" w:lastRow="0" w:noHBand="0" w:noVBand="1" w:val="04A0"/>
+      </w:tblPr>
+      <w:tblGrid>
+        <w:gridCol w:w="4680"/>
+        <w:gridCol w:w="4680"/>
+      </w:tblGrid>
+      <w:tr>
+        <w:tc>
+          <w:tcPr>
+            <w:tcW w:type="dxa" w:w="4680"/>
+            <w:tcMar>
+              <w:top w:w="80" w:type="dxa"/>
+              <w:start w:w="120" w:type="dxa"/>
+              <w:bottom w:w="80" w:type="dxa"/>
+              <w:end w:w="120" w:type="dxa"/>
+            </w:tcMar>
+            <w:vAlign w:val="center"/>
+            <w:shd w:fill="FAFBFC"/>
+          </w:tcPr>
+          <w:p>
+            <w:r>
+              <w:rPr>
+                <w:rFonts w:ascii="Calibri" w:hAnsi="Calibri"/>
+                <w:b/>
+                <w:i w:val="0"/>
+                <w:color w:val="17365D"/>
+                <w:sz w:val="19"/>
+              </w:rPr>
+              <w:t>Observed patterns</w:t>
+            </w:r>
+          </w:p>
+          <w:p>
+            <w:r>
+              <w:rPr>
+                <w:rFonts w:ascii="Calibri" w:hAnsi="Calibri"/>
+                <w:b w:val="0"/>
+                <w:i w:val="0"/>
+                <w:color w:val="1F2937"/>
+                <w:sz w:val="18"/>
+              </w:rPr>
+              <w:t>Within the mapped themes, health, safety, and attendance discussion declined over the four windows, while scheduling, hours, and time-off discussion increased. Compensation, career precarity, and recruitment remained visible throughout.</w:t>
+            </w:r>
+          </w:p>
+        </w:tc>
+        <w:tc>
+          <w:tcPr>
+            <w:tcW w:type="dxa" w:w="4680"/>
+            <w:tcMar>
+              <w:top w:w="80" w:type="dxa"/>
+              <w:start w:w="120" w:type="dxa"/>
+              <w:bottom w:w="80" w:type="dxa"/>
+              <w:end w:w="120" w:type="dxa"/>
+            </w:tcMar>
+            <w:vAlign w:val="center"/>
+            <w:shd w:fill="FAFBFC"/>
+          </w:tcPr>
+          <w:p>
+            <w:r>
+              <w:rPr>
+                <w:rFonts w:ascii="Calibri" w:hAnsi="Calibri"/>
+                <w:b/>
+                <w:i w:val="0"/>
+                <w:color w:val="17365D"/>
+                <w:sz w:val="19"/>
+              </w:rPr>
+              <w:t>What the results support</w:t>
+            </w:r>
+          </w:p>
+          <w:p>
+            <w:r>
+              <w:rPr>
+                <w:rFonts w:ascii="Calibri" w:hAnsi="Calibri"/>
+                <w:b w:val="0"/>
+                <w:i w:val="0"/>
+                <w:color w:val="1F2937"/>
+                <w:sz w:val="18"/>
+              </w:rPr>
+              <w:t>These patterns describe changes in the composition of management-related public discussion. They identify domains for follow-up with representative employee data; they do not establish employee sentiment, turnover drivers, or policy effects.</w:t>
+            </w:r>
+          </w:p>
+        </w:tc>
+      </w:tr>
+    </w:tbl>
+    <w:p>
+      <w:pPr>
         <w:pStyle w:val="Heading1"/>
       </w:pPr>
       <w:r>
@@ -1735,9 +1868,9 @@
           <w:b w:val="0"/>
           <w:i w:val="0"/>
           <w:color w:val="5D6B7A"/>
-          <w:sz w:val="17"/>
+          <w:sz w:val="16"/>
         </w:rPr>
-        <w:t>Core references: planning/WRITING_HANDOFF.md, planning/ROBUSTNESS.md, and planning/CANDIDATE_THEME_CODEBOOK.csv.</w:t>
+        <w:t>Method records: planning/SCRAPING.md, planning/PREPROCESSING.md, planning/WRITING_HANDOFF.md, planning/ROBUSTNESS.md, and planning/CANDIDATE_THEME_CODEBOOK.csv.</w:t>
       </w:r>
     </w:p>
     <w:p>

</xml_diff>

<commit_message>
Add method and takeaway visuals to brief
</commit_message>
<xml_diff>
--- a/deliverables/Antiwork_Exploratory_Analysis_Brief.docx
+++ b/deliverables/Antiwork_Exploratory_Analysis_Brief.docx
@@ -974,7 +974,7 @@
           <w:color w:val="1F2937"/>
           <w:sz w:val="19"/>
         </w:rPr>
-        <w:t>Calculated each theme's share of every filtered post in four March-to-February rolling windows. Figure 1 shows the resulting exploratory prevalence patterns; Figure 2 shows monthly assignment coverage so the mapped share is visible.</w:t>
+        <w:t>Calculated each theme's share of every filtered post in four March-to-February rolling windows. The figures in this brief show the main monthly patterns, the full reviewed-theme comparison, and monthly assignment coverage.</w:t>
       </w:r>
     </w:p>
     <w:p>
@@ -1018,8 +1018,166 @@
       </w:r>
     </w:p>
     <w:p>
+      <w:pPr>
+        <w:pStyle w:val="Heading2"/>
+      </w:pPr>
+      <w:r>
+        <w:rPr>
+          <w:rFonts w:ascii="Calibri" w:hAnsi="Calibri"/>
+          <w:b/>
+          <w:i w:val="0"/>
+          <w:color w:val="17365D"/>
+          <w:sz w:val="25"/>
+        </w:rPr>
+        <w:t>From collection to estimates</w:t>
+      </w:r>
+    </w:p>
+    <w:p>
+      <w:pPr>
+        <w:jc w:val="center"/>
+      </w:pPr>
+      <w:r>
+        <w:drawing>
+          <wp:inline xmlns:a="http://schemas.openxmlformats.org/drawingml/2006/main" xmlns:pic="http://schemas.openxmlformats.org/drawingml/2006/picture">
+            <wp:extent cx="5760720" cy="2108749"/>
+            <wp:docPr id="1" name="Picture 1"/>
+            <wp:cNvGraphicFramePr>
+              <a:graphicFrameLocks noChangeAspect="1"/>
+            </wp:cNvGraphicFramePr>
+            <a:graphic>
+              <a:graphicData uri="http://schemas.openxmlformats.org/drawingml/2006/picture">
+                <pic:pic>
+                  <pic:nvPicPr>
+                    <pic:cNvPr id="0" name="brief_collection_to_results_flow.png"/>
+                    <pic:cNvPicPr/>
+                  </pic:nvPicPr>
+                  <pic:blipFill>
+                    <a:blip r:embed="rId13"/>
+                    <a:stretch>
+                      <a:fillRect/>
+                    </a:stretch>
+                  </pic:blipFill>
+                  <pic:spPr>
+                    <a:xfrm>
+                      <a:off x="0" y="0"/>
+                      <a:ext cx="5760720" cy="2108749"/>
+                    </a:xfrm>
+                    <a:prstGeom prst="rect"/>
+                  </pic:spPr>
+                </pic:pic>
+              </a:graphicData>
+            </a:graphic>
+          </wp:inline>
+        </w:drawing>
+      </w:r>
+    </w:p>
+    <w:p>
+      <w:pPr>
+        <w:spacing w:after="0"/>
+      </w:pPr>
+      <w:r>
+        <w:rPr>
+          <w:rFonts w:ascii="Calibri" w:hAnsi="Calibri"/>
+          <w:b w:val="0"/>
+          <w:i/>
+          <w:color w:val="5D6B7A"/>
+          <w:sz w:val="16"/>
+        </w:rPr>
+        <w:t>Figure 1. The collection, filtering, modeling, review, and estimation sequence used for the exploratory analysis.</w:t>
+      </w:r>
+    </w:p>
+    <w:p>
       <w:r>
         <w:br w:type="page"/>
+      </w:r>
+    </w:p>
+    <w:p>
+      <w:pPr>
+        <w:pStyle w:val="Heading1"/>
+      </w:pPr>
+      <w:r>
+        <w:rPr>
+          <w:rFonts w:ascii="Calibri" w:hAnsi="Calibri"/>
+          <w:b/>
+          <w:i w:val="0"/>
+          <w:color w:val="17365D"/>
+          <w:sz w:val="30"/>
+        </w:rPr>
+        <w:t>Monthly patterns in the main themes</w:t>
+      </w:r>
+    </w:p>
+    <w:p>
+      <w:pPr>
+        <w:jc w:val="center"/>
+      </w:pPr>
+      <w:r>
+        <w:drawing>
+          <wp:inline xmlns:a="http://schemas.openxmlformats.org/drawingml/2006/main" xmlns:pic="http://schemas.openxmlformats.org/drawingml/2006/picture">
+            <wp:extent cx="5760720" cy="2704529"/>
+            <wp:docPr id="2" name="Picture 2"/>
+            <wp:cNvGraphicFramePr>
+              <a:graphicFrameLocks noChangeAspect="1"/>
+            </wp:cNvGraphicFramePr>
+            <a:graphic>
+              <a:graphicData uri="http://schemas.openxmlformats.org/drawingml/2006/picture">
+                <pic:pic>
+                  <pic:nvPicPr>
+                    <pic:cNvPr id="0" name="brief_key_theme_monthly_trends.png"/>
+                    <pic:cNvPicPr/>
+                  </pic:nvPicPr>
+                  <pic:blipFill>
+                    <a:blip r:embed="rId14"/>
+                    <a:stretch>
+                      <a:fillRect/>
+                    </a:stretch>
+                  </pic:blipFill>
+                  <pic:spPr>
+                    <a:xfrm>
+                      <a:off x="0" y="0"/>
+                      <a:ext cx="5760720" cy="2704529"/>
+                    </a:xfrm>
+                    <a:prstGeom prst="rect"/>
+                  </pic:spPr>
+                </pic:pic>
+              </a:graphicData>
+            </a:graphic>
+          </wp:inline>
+        </w:drawing>
+      </w:r>
+    </w:p>
+    <w:p>
+      <w:pPr>
+        <w:spacing w:after="0"/>
+      </w:pPr>
+      <w:r>
+        <w:rPr>
+          <w:rFonts w:ascii="Calibri" w:hAnsi="Calibri"/>
+          <w:b w:val="0"/>
+          <w:i/>
+          <w:color w:val="5D6B7A"/>
+          <w:sz w:val="16"/>
+        </w:rPr>
+        <w:t>Figure 2. Three-month rolling prevalence of the themes that anchor the main interpretation. Shares use all filtered posts each month as the denominator.</w:t>
+      </w:r>
+    </w:p>
+    <w:p>
+      <w:r>
+        <w:br w:type="page"/>
+      </w:r>
+    </w:p>
+    <w:p>
+      <w:pPr>
+        <w:pStyle w:val="Heading1"/>
+      </w:pPr>
+      <w:r>
+        <w:rPr>
+          <w:rFonts w:ascii="Calibri" w:hAnsi="Calibri"/>
+          <w:b/>
+          <w:i w:val="0"/>
+          <w:color w:val="17365D"/>
+          <w:sz w:val="30"/>
+        </w:rPr>
+        <w:t>All reviewed themes by rolling window</w:t>
       </w:r>
     </w:p>
     <w:p>
@@ -1030,7 +1188,7 @@
         <w:drawing>
           <wp:inline xmlns:a="http://schemas.openxmlformats.org/drawingml/2006/main" xmlns:pic="http://schemas.openxmlformats.org/drawingml/2006/picture">
             <wp:extent cx="4160520" cy="2277728"/>
-            <wp:docPr id="1" name="Picture 1"/>
+            <wp:docPr id="3" name="Picture 3"/>
             <wp:cNvGraphicFramePr>
               <a:graphicFrameLocks noChangeAspect="1"/>
             </wp:cNvGraphicFramePr>
@@ -1042,7 +1200,7 @@
                     <pic:cNvPicPr/>
                   </pic:nvPicPr>
                   <pic:blipFill>
-                    <a:blip r:embed="rId13"/>
+                    <a:blip r:embed="rId15"/>
                     <a:stretch>
                       <a:fillRect/>
                     </a:stretch>
@@ -1073,7 +1231,7 @@
           <w:color w:val="5D6B7A"/>
           <w:sz w:val="16"/>
         </w:rPr>
-        <w:t>Figure 1. Exploratory prevalence by rolling window. The 27-cluster map excludes generic, deleted, and community-meta clusters.</w:t>
+        <w:t>Figure 3. Exploratory prevalence by rolling window. The 27-cluster map excludes generic, deleted, and community-meta clusters.</w:t>
       </w:r>
     </w:p>
     <w:p>
@@ -1202,7 +1360,7 @@
         <w:drawing>
           <wp:inline xmlns:a="http://schemas.openxmlformats.org/drawingml/2006/main" xmlns:pic="http://schemas.openxmlformats.org/drawingml/2006/picture">
             <wp:extent cx="5303520" cy="3128606"/>
-            <wp:docPr id="2" name="Picture 2"/>
+            <wp:docPr id="4" name="Picture 4"/>
             <wp:cNvGraphicFramePr>
               <a:graphicFrameLocks noChangeAspect="1"/>
             </wp:cNvGraphicFramePr>
@@ -1214,7 +1372,7 @@
                     <pic:cNvPicPr/>
                   </pic:nvPicPr>
                   <pic:blipFill>
-                    <a:blip r:embed="rId14"/>
+                    <a:blip r:embed="rId16"/>
                     <a:stretch>
                       <a:fillRect/>
                     </a:stretch>
@@ -1245,7 +1403,7 @@
           <w:color w:val="5D6B7A"/>
           <w:sz w:val="16"/>
         </w:rPr>
-        <w:t>Figure 2. Assignment coverage varied from 33.1% to 44.0% by month. Outliers are a coverage limitation, not a substantive category.</w:t>
+        <w:t>Figure 4. Assignment coverage varied from 33.1% to 44.0% by month. Outliers are a coverage limitation, not a substantive category.</w:t>
       </w:r>
     </w:p>
     <w:p>
@@ -1848,7 +2006,7 @@
         </w:rPr>
         <w:t xml:space="preserve">Reproducible code and shareable evidence: </w:t>
       </w:r>
-      <w:hyperlink r:id="rId15">
+      <w:hyperlink r:id="rId17">
         <w:r>
           <w:rPr>
             <w:color w:val="2E74B5"/>

</xml_diff>

<commit_message>
Add reviewed cluster map to analysis brief
</commit_message>
<xml_diff>
--- a/deliverables/Antiwork_Exploratory_Analysis_Brief.docx
+++ b/deliverables/Antiwork_Exploratory_Analysis_Brief.docx
@@ -347,7 +347,7 @@
                 <w:color w:val="1F2937"/>
                 <w:sz w:val="18"/>
               </w:rPr>
-              <w:t>The findings describe prevalence patterns within the documented theme map. They do not support causal claims, full-conversation prevalence estimates, or sentiment conclusions.</w:t>
+              <w:t>The figures show the share of all filtered posts captured by included candidate-theme clusters. The 27-cluster map is not a full taxonomy or a complete estimate of management-related content.</w:t>
             </w:r>
           </w:p>
         </w:tc>
@@ -784,7 +784,7 @@
           <w:color w:val="5D6B7A"/>
           <w:sz w:val="17"/>
         </w:rPr>
-        <w:t>All percentages use every filtered post in each rolling window as the denominator. They describe the mapped subset, not all potentially relevant content in the corpus.</w:t>
+        <w:t>All percentages divide posts in included candidate-theme clusters by every filtered post in the same rolling window. They show the portion of the filtered corpus captured by this 27-cluster map, not a complete measure of all management-related content.</w:t>
       </w:r>
     </w:p>
     <w:p>
@@ -814,7 +814,7 @@
           <w:color w:val="1F2937"/>
           <w:sz w:val="18"/>
         </w:rPr>
-        <w:t>Public r/antiwork submissions were retrieved through the Arctic Shift archive API in monthly UTC batches from 1 March 2021 through 1 March 2025. The analysis retained unique posts whose title or body matched the established management terms boss, manager, supervisor, or team lead, including plural variants. The resulting corpus is an archive-based sample of public discourse, not a representative sample of employees or an author-level panel.</w:t>
+        <w:t>Public r/antiwork submissions were retrieved through the Arctic Shift archive API in monthly UTC batches from 1 March 2021 through 1 March 2025. The analysis retained unique posts whose title or body matched the established management terms boss, manager, supervisor, or team lead, including plural variants. The resulting corpus is an archive-based sample of public discourse, not a representative sample of employees or an author-level panel. Archive records may differ from content displayed on Reddit after collection.</w:t>
       </w:r>
     </w:p>
     <w:p>
@@ -999,7 +999,7 @@
           <w:color w:val="1F2937"/>
           <w:sz w:val="19"/>
         </w:rPr>
-        <w:t>Ran seed-stability checks, title-only sensitivity, and unique-post overlap checks across rolling windows. Sentiment was intentionally not analyzed, and the paper will make no causal or full-conversation prevalence claims.</w:t>
+        <w:t>Ran seed-stability checks, title-only sensitivity, and one-to-one top-term alignment checks across rolling-window fits. Sentiment was intentionally not analyzed, and the paper will make no causal or full-conversation prevalence claims.</w:t>
       </w:r>
     </w:p>
     <w:p>
@@ -1014,7 +1014,7 @@
           <w:color w:val="5D6B7A"/>
           <w:sz w:val="17"/>
         </w:rPr>
-        <w:t>The repository includes the reproducible scripts, codebook, diagnostics, and aggregate evidence used in this brief.</w:t>
+        <w:t>The private repository includes the analysis scripts, codebook, diagnostics, and aggregate evidence used in this brief. Raw posts and text-level samples remain local.</w:t>
       </w:r>
     </w:p>
     <w:p>
@@ -1841,7 +1841,7 @@
                 <w:color w:val="17365D"/>
                 <w:sz w:val="19"/>
               </w:rPr>
-              <w:t>Optional extensions</w:t>
+              <w:t>Out-of-scope extensions</w:t>
             </w:r>
           </w:p>
           <w:p>
@@ -1853,7 +1853,7 @@
                 <w:color w:val="1F2937"/>
                 <w:sz w:val="18"/>
               </w:rPr>
-              <w:t>Sentiment annotation, a larger codebook, saved-model refit, TopicGPT comparison, and the MPNet check are possible extensions, but are not required for this exploratory paper.</w:t>
+              <w:t>A broader cluster review, an independent encoder check when compute permits, or a future sentiment study with a validated human reference set can be considered separately. None are required for this paper.</w:t>
             </w:r>
           </w:p>
         </w:tc>
@@ -1956,7 +1956,7 @@
                 <w:color w:val="1F2937"/>
                 <w:sz w:val="18"/>
               </w:rPr>
-              <w:t>Harmonize retained Background language with the paper's exploratory, descriptive scope. Historical theory and prior turnover findings should remain context, not claims tested by this study.</w:t>
+              <w:t>Correct the denominator language, add the archive-source statement, and harmonize retained Background language with the paper's exploratory, descriptive scope. Historical theory and prior turnover findings should remain context, not claims tested by this study.</w:t>
             </w:r>
           </w:p>
         </w:tc>
@@ -2043,9 +2043,2598 @@
           <w:color w:val="17365D"/>
           <w:sz w:val="18"/>
         </w:rPr>
-        <w:t>Current status: the analysis package is complete and ready for drafting as a descriptive, exploratory topic-prevalence study.</w:t>
+        <w:t>Current status: the analysis outputs are complete. The manuscript needs a focused wording pass before circulation as a descriptive, exploratory topic-prevalence study.</w:t>
       </w:r>
     </w:p>
+    <w:p>
+      <w:pPr>
+        <w:pStyle w:val="Heading1"/>
+      </w:pPr>
+      <w:r>
+        <w:rPr>
+          <w:rFonts w:ascii="Calibri" w:hAnsi="Calibri"/>
+          <w:b/>
+          <w:i w:val="0"/>
+          <w:color w:val="17365D"/>
+          <w:sz w:val="30"/>
+        </w:rPr>
+        <w:t>Appendix: Reviewed cluster map</w:t>
+      </w:r>
+    </w:p>
+    <w:p>
+      <w:pPr>
+        <w:spacing w:after="120"/>
+      </w:pPr>
+      <w:r>
+        <w:rPr>
+          <w:rFonts w:ascii="Calibri" w:hAnsi="Calibri"/>
+          <w:b w:val="0"/>
+          <w:i w:val="0"/>
+          <w:color w:val="1F2937"/>
+          <w:sz w:val="18"/>
+        </w:rPr>
+        <w:t>The table below makes the review trail visible. It lists all 30 largest clusters examined for the candidate-theme map, their representative terms, the assigned candidate theme and subtheme, and the inclusion decision.</w:t>
+      </w:r>
+    </w:p>
+    <w:p>
+      <w:pPr>
+        <w:pStyle w:val="Heading2"/>
+      </w:pPr>
+      <w:r>
+        <w:rPr>
+          <w:rFonts w:ascii="Calibri" w:hAnsi="Calibri"/>
+          <w:b/>
+          <w:i w:val="0"/>
+          <w:color w:val="17365D"/>
+          <w:sz w:val="25"/>
+        </w:rPr>
+        <w:t>Reviewed clusters 1-15</w:t>
+      </w:r>
+    </w:p>
+    <w:tbl>
+      <w:tblPr>
+        <w:tblW w:type="dxa" w:w="9360"/>
+        <w:jc w:val="left"/>
+        <w:tblLayout w:type="fixed"/>
+        <w:tblLook w:firstColumn="1" w:firstRow="1" w:lastColumn="0" w:lastRow="0" w:noHBand="0" w:noVBand="1" w:val="04A0"/>
+      </w:tblPr>
+      <w:tblGrid>
+        <w:gridCol w:w="620"/>
+        <w:gridCol w:w="2200"/>
+        <w:gridCol w:w="4800"/>
+        <w:gridCol w:w="1740"/>
+      </w:tblGrid>
+      <w:tr>
+        <w:tc>
+          <w:tcPr>
+            <w:tcW w:type="dxa" w:w="620"/>
+            <w:tcMar>
+              <w:top w:w="80" w:type="dxa"/>
+              <w:start w:w="120" w:type="dxa"/>
+              <w:bottom w:w="80" w:type="dxa"/>
+              <w:end w:w="120" w:type="dxa"/>
+            </w:tcMar>
+            <w:vAlign w:val="center"/>
+            <w:shd w:fill="E8EEF5"/>
+          </w:tcPr>
+          <w:p>
+            <w:r>
+              <w:rPr>
+                <w:rFonts w:ascii="Calibri" w:hAnsi="Calibri"/>
+                <w:b/>
+                <w:i w:val="0"/>
+                <w:color w:val="17365D"/>
+                <w:sz w:val="16"/>
+              </w:rPr>
+              <w:t>ID</w:t>
+            </w:r>
+          </w:p>
+        </w:tc>
+        <w:tc>
+          <w:tcPr>
+            <w:tcW w:type="dxa" w:w="2200"/>
+            <w:tcMar>
+              <w:top w:w="80" w:type="dxa"/>
+              <w:start w:w="120" w:type="dxa"/>
+              <w:bottom w:w="80" w:type="dxa"/>
+              <w:end w:w="120" w:type="dxa"/>
+            </w:tcMar>
+            <w:vAlign w:val="center"/>
+            <w:shd w:fill="E8EEF5"/>
+          </w:tcPr>
+          <w:p>
+            <w:r>
+              <w:rPr>
+                <w:rFonts w:ascii="Calibri" w:hAnsi="Calibri"/>
+                <w:b/>
+                <w:i w:val="0"/>
+                <w:color w:val="17365D"/>
+                <w:sz w:val="16"/>
+              </w:rPr>
+              <w:t>Representative terms</w:t>
+            </w:r>
+          </w:p>
+        </w:tc>
+        <w:tc>
+          <w:tcPr>
+            <w:tcW w:type="dxa" w:w="4800"/>
+            <w:tcMar>
+              <w:top w:w="80" w:type="dxa"/>
+              <w:start w:w="120" w:type="dxa"/>
+              <w:bottom w:w="80" w:type="dxa"/>
+              <w:end w:w="120" w:type="dxa"/>
+            </w:tcMar>
+            <w:vAlign w:val="center"/>
+            <w:shd w:fill="E8EEF5"/>
+          </w:tcPr>
+          <w:p>
+            <w:r>
+              <w:rPr>
+                <w:rFonts w:ascii="Calibri" w:hAnsi="Calibri"/>
+                <w:b/>
+                <w:i w:val="0"/>
+                <w:color w:val="17365D"/>
+                <w:sz w:val="16"/>
+              </w:rPr>
+              <w:t>Candidate theme and subtheme</w:t>
+            </w:r>
+          </w:p>
+        </w:tc>
+        <w:tc>
+          <w:tcPr>
+            <w:tcW w:type="dxa" w:w="1740"/>
+            <w:tcMar>
+              <w:top w:w="80" w:type="dxa"/>
+              <w:start w:w="120" w:type="dxa"/>
+              <w:bottom w:w="80" w:type="dxa"/>
+              <w:end w:w="120" w:type="dxa"/>
+            </w:tcMar>
+            <w:vAlign w:val="center"/>
+            <w:shd w:fill="E8EEF5"/>
+          </w:tcPr>
+          <w:p>
+            <w:r>
+              <w:rPr>
+                <w:rFonts w:ascii="Calibri" w:hAnsi="Calibri"/>
+                <w:b/>
+                <w:i w:val="0"/>
+                <w:color w:val="17365D"/>
+                <w:sz w:val="16"/>
+              </w:rPr>
+              <w:t>Decision</w:t>
+            </w:r>
+          </w:p>
+        </w:tc>
+      </w:tr>
+      <w:tr>
+        <w:tc>
+          <w:tcPr>
+            <w:tcW w:type="dxa" w:w="620"/>
+          </w:tcPr>
+          <w:p>
+            <w:r>
+              <w:rPr>
+                <w:rFonts w:ascii="Calibri" w:hAnsi="Calibri"/>
+                <w:b/>
+                <w:i w:val="0"/>
+                <w:color w:val="1F2937"/>
+                <w:sz w:val="15"/>
+              </w:rPr>
+              <w:t>0</w:t>
+            </w:r>
+          </w:p>
+        </w:tc>
+        <w:tc>
+          <w:tcPr>
+            <w:tcW w:type="dxa" w:w="2200"/>
+          </w:tcPr>
+          <w:p>
+            <w:r>
+              <w:rPr>
+                <w:rFonts w:ascii="Calibri" w:hAnsi="Calibri"/>
+                <w:b w:val="0"/>
+                <w:i w:val="0"/>
+                <w:color w:val="1F2937"/>
+                <w:sz w:val="15"/>
+              </w:rPr>
+              <w:t>interview hiring interviews recruiter applied resume</w:t>
+            </w:r>
+          </w:p>
+        </w:tc>
+        <w:tc>
+          <w:tcPr>
+            <w:tcW w:type="dxa" w:w="4800"/>
+          </w:tcPr>
+          <w:p>
+            <w:r>
+              <w:rPr>
+                <w:rFonts w:ascii="Calibri" w:hAnsi="Calibri"/>
+                <w:b w:val="0"/>
+                <w:i w:val="0"/>
+                <w:color w:val="1F2937"/>
+                <w:sz w:val="15"/>
+              </w:rPr>
+              <w:t>Recruitment and labor market</w:t>
+              <w:br/>
+              <w:t>Hiring and interviews</w:t>
+            </w:r>
+          </w:p>
+        </w:tc>
+        <w:tc>
+          <w:tcPr>
+            <w:tcW w:type="dxa" w:w="1740"/>
+            <w:shd w:fill="E2F0D9"/>
+          </w:tcPr>
+          <w:p>
+            <w:r>
+              <w:rPr>
+                <w:rFonts w:ascii="Calibri" w:hAnsi="Calibri"/>
+                <w:b w:val="0"/>
+                <w:i w:val="0"/>
+                <w:color w:val="1F2937"/>
+                <w:sz w:val="15"/>
+              </w:rPr>
+              <w:t>Include</w:t>
+              <w:br/>
+              <w:t>high confidence</w:t>
+            </w:r>
+          </w:p>
+        </w:tc>
+      </w:tr>
+      <w:tr>
+        <w:tc>
+          <w:tcPr>
+            <w:tcW w:type="dxa" w:w="620"/>
+            <w:shd w:fill="FAFBFC"/>
+          </w:tcPr>
+          <w:p>
+            <w:r>
+              <w:rPr>
+                <w:rFonts w:ascii="Calibri" w:hAnsi="Calibri"/>
+                <w:b/>
+                <w:i w:val="0"/>
+                <w:color w:val="1F2937"/>
+                <w:sz w:val="15"/>
+              </w:rPr>
+              <w:t>1</w:t>
+            </w:r>
+          </w:p>
+        </w:tc>
+        <w:tc>
+          <w:tcPr>
+            <w:tcW w:type="dxa" w:w="2200"/>
+            <w:shd w:fill="FAFBFC"/>
+          </w:tcPr>
+          <w:p>
+            <w:r>
+              <w:rPr>
+                <w:rFonts w:ascii="Calibri" w:hAnsi="Calibri"/>
+                <w:b w:val="0"/>
+                <w:i w:val="0"/>
+                <w:color w:val="1F2937"/>
+                <w:sz w:val="15"/>
+              </w:rPr>
+              <w:t>bad good hate conversation like worst</w:t>
+            </w:r>
+          </w:p>
+        </w:tc>
+        <w:tc>
+          <w:tcPr>
+            <w:tcW w:type="dxa" w:w="4800"/>
+            <w:shd w:fill="FAFBFC"/>
+          </w:tcPr>
+          <w:p>
+            <w:r>
+              <w:rPr>
+                <w:rFonts w:ascii="Calibri" w:hAnsi="Calibri"/>
+                <w:b w:val="0"/>
+                <w:i w:val="0"/>
+                <w:color w:val="1F2937"/>
+                <w:sz w:val="15"/>
+              </w:rPr>
+              <w:t>Other</w:t>
+              <w:br/>
+              <w:t>Generic/deleted manager posts</w:t>
+            </w:r>
+          </w:p>
+        </w:tc>
+        <w:tc>
+          <w:tcPr>
+            <w:tcW w:type="dxa" w:w="1740"/>
+            <w:shd w:fill="F2F4F7"/>
+          </w:tcPr>
+          <w:p>
+            <w:r>
+              <w:rPr>
+                <w:rFonts w:ascii="Calibri" w:hAnsi="Calibri"/>
+                <w:b w:val="0"/>
+                <w:i w:val="0"/>
+                <w:color w:val="1F2937"/>
+                <w:sz w:val="15"/>
+              </w:rPr>
+              <w:t>Exclude</w:t>
+              <w:br/>
+              <w:t>high confidence</w:t>
+            </w:r>
+          </w:p>
+        </w:tc>
+      </w:tr>
+      <w:tr>
+        <w:tc>
+          <w:tcPr>
+            <w:tcW w:type="dxa" w:w="620"/>
+          </w:tcPr>
+          <w:p>
+            <w:r>
+              <w:rPr>
+                <w:rFonts w:ascii="Calibri" w:hAnsi="Calibri"/>
+                <w:b/>
+                <w:i w:val="0"/>
+                <w:color w:val="1F2937"/>
+                <w:sz w:val="15"/>
+              </w:rPr>
+              <w:t>2</w:t>
+            </w:r>
+          </w:p>
+        </w:tc>
+        <w:tc>
+          <w:tcPr>
+            <w:tcW w:type="dxa" w:w="2200"/>
+          </w:tcPr>
+          <w:p>
+            <w:r>
+              <w:rPr>
+                <w:rFonts w:ascii="Calibri" w:hAnsi="Calibri"/>
+                <w:b w:val="0"/>
+                <w:i w:val="0"/>
+                <w:color w:val="1F2937"/>
+                <w:sz w:val="15"/>
+              </w:rPr>
+              <w:t>raise raises increase salary inflation pay</w:t>
+            </w:r>
+          </w:p>
+        </w:tc>
+        <w:tc>
+          <w:tcPr>
+            <w:tcW w:type="dxa" w:w="4800"/>
+          </w:tcPr>
+          <w:p>
+            <w:r>
+              <w:rPr>
+                <w:rFonts w:ascii="Calibri" w:hAnsi="Calibri"/>
+                <w:b w:val="0"/>
+                <w:i w:val="0"/>
+                <w:color w:val="1F2937"/>
+                <w:sz w:val="15"/>
+              </w:rPr>
+              <w:t>Compensation and pay rights</w:t>
+              <w:br/>
+              <w:t>Raises and salary</w:t>
+            </w:r>
+          </w:p>
+        </w:tc>
+        <w:tc>
+          <w:tcPr>
+            <w:tcW w:type="dxa" w:w="1740"/>
+            <w:shd w:fill="E2F0D9"/>
+          </w:tcPr>
+          <w:p>
+            <w:r>
+              <w:rPr>
+                <w:rFonts w:ascii="Calibri" w:hAnsi="Calibri"/>
+                <w:b w:val="0"/>
+                <w:i w:val="0"/>
+                <w:color w:val="1F2937"/>
+                <w:sz w:val="15"/>
+              </w:rPr>
+              <w:t>Include</w:t>
+              <w:br/>
+              <w:t>high confidence</w:t>
+            </w:r>
+          </w:p>
+        </w:tc>
+      </w:tr>
+      <w:tr>
+        <w:tc>
+          <w:tcPr>
+            <w:tcW w:type="dxa" w:w="620"/>
+            <w:shd w:fill="FAFBFC"/>
+          </w:tcPr>
+          <w:p>
+            <w:r>
+              <w:rPr>
+                <w:rFonts w:ascii="Calibri" w:hAnsi="Calibri"/>
+                <w:b/>
+                <w:i w:val="0"/>
+                <w:color w:val="1F2937"/>
+                <w:sz w:val="15"/>
+              </w:rPr>
+              <w:t>3</w:t>
+            </w:r>
+          </w:p>
+        </w:tc>
+        <w:tc>
+          <w:tcPr>
+            <w:tcW w:type="dxa" w:w="2200"/>
+            <w:shd w:fill="FAFBFC"/>
+          </w:tcPr>
+          <w:p>
+            <w:r>
+              <w:rPr>
+                <w:rFonts w:ascii="Calibri" w:hAnsi="Calibri"/>
+                <w:b w:val="0"/>
+                <w:i w:val="0"/>
+                <w:color w:val="1F2937"/>
+                <w:sz w:val="15"/>
+              </w:rPr>
+              <w:t>rehearsal good team bad employees people</w:t>
+            </w:r>
+          </w:p>
+        </w:tc>
+        <w:tc>
+          <w:tcPr>
+            <w:tcW w:type="dxa" w:w="4800"/>
+            <w:shd w:fill="FAFBFC"/>
+          </w:tcPr>
+          <w:p>
+            <w:r>
+              <w:rPr>
+                <w:rFonts w:ascii="Calibri" w:hAnsi="Calibri"/>
+                <w:b w:val="0"/>
+                <w:i w:val="0"/>
+                <w:color w:val="1F2937"/>
+                <w:sz w:val="15"/>
+              </w:rPr>
+              <w:t>Other</w:t>
+              <w:br/>
+              <w:t>Generic manager-role discussion</w:t>
+            </w:r>
+          </w:p>
+        </w:tc>
+        <w:tc>
+          <w:tcPr>
+            <w:tcW w:type="dxa" w:w="1740"/>
+            <w:shd w:fill="F2F4F7"/>
+          </w:tcPr>
+          <w:p>
+            <w:r>
+              <w:rPr>
+                <w:rFonts w:ascii="Calibri" w:hAnsi="Calibri"/>
+                <w:b w:val="0"/>
+                <w:i w:val="0"/>
+                <w:color w:val="1F2937"/>
+                <w:sz w:val="15"/>
+              </w:rPr>
+              <w:t>Exclude</w:t>
+              <w:br/>
+              <w:t>medium confidence</w:t>
+            </w:r>
+          </w:p>
+        </w:tc>
+      </w:tr>
+      <w:tr>
+        <w:tc>
+          <w:tcPr>
+            <w:tcW w:type="dxa" w:w="620"/>
+          </w:tcPr>
+          <w:p>
+            <w:r>
+              <w:rPr>
+                <w:rFonts w:ascii="Calibri" w:hAnsi="Calibri"/>
+                <w:b/>
+                <w:i w:val="0"/>
+                <w:color w:val="1F2937"/>
+                <w:sz w:val="15"/>
+              </w:rPr>
+              <w:t>4</w:t>
+            </w:r>
+          </w:p>
+        </w:tc>
+        <w:tc>
+          <w:tcPr>
+            <w:tcW w:type="dxa" w:w="2200"/>
+          </w:tcPr>
+          <w:p>
+            <w:r>
+              <w:rPr>
+                <w:rFonts w:ascii="Calibri" w:hAnsi="Calibri"/>
+                <w:b w:val="0"/>
+                <w:i w:val="0"/>
+                <w:color w:val="1F2937"/>
+                <w:sz w:val="15"/>
+              </w:rPr>
+              <w:t>covid positive tested test sick symptoms</w:t>
+            </w:r>
+          </w:p>
+        </w:tc>
+        <w:tc>
+          <w:tcPr>
+            <w:tcW w:type="dxa" w:w="4800"/>
+          </w:tcPr>
+          <w:p>
+            <w:r>
+              <w:rPr>
+                <w:rFonts w:ascii="Calibri" w:hAnsi="Calibri"/>
+                <w:b w:val="0"/>
+                <w:i w:val="0"/>
+                <w:color w:val="1F2937"/>
+                <w:sz w:val="15"/>
+              </w:rPr>
+              <w:t>Health safety and attendance</w:t>
+              <w:br/>
+              <w:t>COVID and workplace illness</w:t>
+            </w:r>
+          </w:p>
+        </w:tc>
+        <w:tc>
+          <w:tcPr>
+            <w:tcW w:type="dxa" w:w="1740"/>
+            <w:shd w:fill="E2F0D9"/>
+          </w:tcPr>
+          <w:p>
+            <w:r>
+              <w:rPr>
+                <w:rFonts w:ascii="Calibri" w:hAnsi="Calibri"/>
+                <w:b w:val="0"/>
+                <w:i w:val="0"/>
+                <w:color w:val="1F2937"/>
+                <w:sz w:val="15"/>
+              </w:rPr>
+              <w:t>Include</w:t>
+              <w:br/>
+              <w:t>high confidence</w:t>
+            </w:r>
+          </w:p>
+        </w:tc>
+      </w:tr>
+      <w:tr>
+        <w:tc>
+          <w:tcPr>
+            <w:tcW w:type="dxa" w:w="620"/>
+            <w:shd w:fill="FAFBFC"/>
+          </w:tcPr>
+          <w:p>
+            <w:r>
+              <w:rPr>
+                <w:rFonts w:ascii="Calibri" w:hAnsi="Calibri"/>
+                <w:b/>
+                <w:i w:val="0"/>
+                <w:color w:val="1F2937"/>
+                <w:sz w:val="15"/>
+              </w:rPr>
+              <w:t>5</w:t>
+            </w:r>
+          </w:p>
+        </w:tc>
+        <w:tc>
+          <w:tcPr>
+            <w:tcW w:type="dxa" w:w="2200"/>
+            <w:shd w:fill="FAFBFC"/>
+          </w:tcPr>
+          <w:p>
+            <w:r>
+              <w:rPr>
+                <w:rFonts w:ascii="Calibri" w:hAnsi="Calibri"/>
+                <w:b w:val="0"/>
+                <w:i w:val="0"/>
+                <w:color w:val="1F2937"/>
+                <w:sz w:val="15"/>
+              </w:rPr>
+              <w:t>check paycheck paid pay deposit payroll</w:t>
+            </w:r>
+          </w:p>
+        </w:tc>
+        <w:tc>
+          <w:tcPr>
+            <w:tcW w:type="dxa" w:w="4800"/>
+            <w:shd w:fill="FAFBFC"/>
+          </w:tcPr>
+          <w:p>
+            <w:r>
+              <w:rPr>
+                <w:rFonts w:ascii="Calibri" w:hAnsi="Calibri"/>
+                <w:b w:val="0"/>
+                <w:i w:val="0"/>
+                <w:color w:val="1F2937"/>
+                <w:sz w:val="15"/>
+              </w:rPr>
+              <w:t>Compensation and pay rights</w:t>
+              <w:br/>
+              <w:t>Payroll and withheld wages</w:t>
+            </w:r>
+          </w:p>
+        </w:tc>
+        <w:tc>
+          <w:tcPr>
+            <w:tcW w:type="dxa" w:w="1740"/>
+            <w:shd w:fill="E2F0D9"/>
+          </w:tcPr>
+          <w:p>
+            <w:r>
+              <w:rPr>
+                <w:rFonts w:ascii="Calibri" w:hAnsi="Calibri"/>
+                <w:b w:val="0"/>
+                <w:i w:val="0"/>
+                <w:color w:val="1F2937"/>
+                <w:sz w:val="15"/>
+              </w:rPr>
+              <w:t>Include</w:t>
+              <w:br/>
+              <w:t>high confidence</w:t>
+            </w:r>
+          </w:p>
+        </w:tc>
+      </w:tr>
+      <w:tr>
+        <w:tc>
+          <w:tcPr>
+            <w:tcW w:type="dxa" w:w="620"/>
+          </w:tcPr>
+          <w:p>
+            <w:r>
+              <w:rPr>
+                <w:rFonts w:ascii="Calibri" w:hAnsi="Calibri"/>
+                <w:b/>
+                <w:i w:val="0"/>
+                <w:color w:val="1F2937"/>
+                <w:sz w:val="15"/>
+              </w:rPr>
+              <w:t>6</w:t>
+            </w:r>
+          </w:p>
+        </w:tc>
+        <w:tc>
+          <w:tcPr>
+            <w:tcW w:type="dxa" w:w="2200"/>
+          </w:tcPr>
+          <w:p>
+            <w:r>
+              <w:rPr>
+                <w:rFonts w:ascii="Calibri" w:hAnsi="Calibri"/>
+                <w:b w:val="0"/>
+                <w:i w:val="0"/>
+                <w:color w:val="1F2937"/>
+                <w:sz w:val="15"/>
+              </w:rPr>
+              <w:t>remote office home hybrid wfh remotely</w:t>
+            </w:r>
+          </w:p>
+        </w:tc>
+        <w:tc>
+          <w:tcPr>
+            <w:tcW w:type="dxa" w:w="4800"/>
+          </w:tcPr>
+          <w:p>
+            <w:r>
+              <w:rPr>
+                <w:rFonts w:ascii="Calibri" w:hAnsi="Calibri"/>
+                <w:b w:val="0"/>
+                <w:i w:val="0"/>
+                <w:color w:val="1F2937"/>
+                <w:sz w:val="15"/>
+              </w:rPr>
+              <w:t>Work arrangements and control</w:t>
+              <w:br/>
+              <w:t>Remote hybrid and return-to-office</w:t>
+            </w:r>
+          </w:p>
+        </w:tc>
+        <w:tc>
+          <w:tcPr>
+            <w:tcW w:type="dxa" w:w="1740"/>
+            <w:shd w:fill="E2F0D9"/>
+          </w:tcPr>
+          <w:p>
+            <w:r>
+              <w:rPr>
+                <w:rFonts w:ascii="Calibri" w:hAnsi="Calibri"/>
+                <w:b w:val="0"/>
+                <w:i w:val="0"/>
+                <w:color w:val="1F2937"/>
+                <w:sz w:val="15"/>
+              </w:rPr>
+              <w:t>Include</w:t>
+              <w:br/>
+              <w:t>high confidence</w:t>
+            </w:r>
+          </w:p>
+        </w:tc>
+      </w:tr>
+      <w:tr>
+        <w:tc>
+          <w:tcPr>
+            <w:tcW w:type="dxa" w:w="620"/>
+            <w:shd w:fill="FAFBFC"/>
+          </w:tcPr>
+          <w:p>
+            <w:r>
+              <w:rPr>
+                <w:rFonts w:ascii="Calibri" w:hAnsi="Calibri"/>
+                <w:b/>
+                <w:i w:val="0"/>
+                <w:color w:val="1F2937"/>
+                <w:sz w:val="15"/>
+              </w:rPr>
+              <w:t>7</w:t>
+            </w:r>
+          </w:p>
+        </w:tc>
+        <w:tc>
+          <w:tcPr>
+            <w:tcW w:type="dxa" w:w="2200"/>
+            <w:shd w:fill="FAFBFC"/>
+          </w:tcPr>
+          <w:p>
+            <w:r>
+              <w:rPr>
+                <w:rFonts w:ascii="Calibri" w:hAnsi="Calibri"/>
+                <w:b w:val="0"/>
+                <w:i w:val="0"/>
+                <w:color w:val="1F2937"/>
+                <w:sz w:val="15"/>
+              </w:rPr>
+              <w:t>coworker like things said just doesn</w:t>
+            </w:r>
+          </w:p>
+        </w:tc>
+        <w:tc>
+          <w:tcPr>
+            <w:tcW w:type="dxa" w:w="4800"/>
+            <w:shd w:fill="FAFBFC"/>
+          </w:tcPr>
+          <w:p>
+            <w:r>
+              <w:rPr>
+                <w:rFonts w:ascii="Calibri" w:hAnsi="Calibri"/>
+                <w:b w:val="0"/>
+                <w:i w:val="0"/>
+                <w:color w:val="1F2937"/>
+                <w:sz w:val="15"/>
+              </w:rPr>
+              <w:t>Workplace authority and interpersonal conflict</w:t>
+              <w:br/>
+              <w:t>Interpersonal mistreatment and role overload</w:t>
+            </w:r>
+          </w:p>
+        </w:tc>
+        <w:tc>
+          <w:tcPr>
+            <w:tcW w:type="dxa" w:w="1740"/>
+            <w:shd w:fill="E2F0D9"/>
+          </w:tcPr>
+          <w:p>
+            <w:r>
+              <w:rPr>
+                <w:rFonts w:ascii="Calibri" w:hAnsi="Calibri"/>
+                <w:b w:val="0"/>
+                <w:i w:val="0"/>
+                <w:color w:val="1F2937"/>
+                <w:sz w:val="15"/>
+              </w:rPr>
+              <w:t>Include</w:t>
+              <w:br/>
+              <w:t>medium confidence</w:t>
+            </w:r>
+          </w:p>
+        </w:tc>
+      </w:tr>
+      <w:tr>
+        <w:tc>
+          <w:tcPr>
+            <w:tcW w:type="dxa" w:w="620"/>
+          </w:tcPr>
+          <w:p>
+            <w:r>
+              <w:rPr>
+                <w:rFonts w:ascii="Calibri" w:hAnsi="Calibri"/>
+                <w:b/>
+                <w:i w:val="0"/>
+                <w:color w:val="1F2937"/>
+                <w:sz w:val="15"/>
+              </w:rPr>
+              <w:t>8</w:t>
+            </w:r>
+          </w:p>
+        </w:tc>
+        <w:tc>
+          <w:tcPr>
+            <w:tcW w:type="dxa" w:w="2200"/>
+          </w:tcPr>
+          <w:p>
+            <w:r>
+              <w:rPr>
+                <w:rFonts w:ascii="Calibri" w:hAnsi="Calibri"/>
+                <w:b w:val="0"/>
+                <w:i w:val="0"/>
+                <w:color w:val="1F2937"/>
+                <w:sz w:val="15"/>
+              </w:rPr>
+              <w:t>life school want career college money</w:t>
+            </w:r>
+          </w:p>
+        </w:tc>
+        <w:tc>
+          <w:tcPr>
+            <w:tcW w:type="dxa" w:w="4800"/>
+          </w:tcPr>
+          <w:p>
+            <w:r>
+              <w:rPr>
+                <w:rFonts w:ascii="Calibri" w:hAnsi="Calibri"/>
+                <w:b w:val="0"/>
+                <w:i w:val="0"/>
+                <w:color w:val="1F2937"/>
+                <w:sz w:val="15"/>
+              </w:rPr>
+              <w:t>Career precarity and exit</w:t>
+              <w:br/>
+              <w:t>Economic strain and career pressure</w:t>
+            </w:r>
+          </w:p>
+        </w:tc>
+        <w:tc>
+          <w:tcPr>
+            <w:tcW w:type="dxa" w:w="1740"/>
+            <w:shd w:fill="E2F0D9"/>
+          </w:tcPr>
+          <w:p>
+            <w:r>
+              <w:rPr>
+                <w:rFonts w:ascii="Calibri" w:hAnsi="Calibri"/>
+                <w:b w:val="0"/>
+                <w:i w:val="0"/>
+                <w:color w:val="1F2937"/>
+                <w:sz w:val="15"/>
+              </w:rPr>
+              <w:t>Include</w:t>
+              <w:br/>
+              <w:t>medium confidence</w:t>
+            </w:r>
+          </w:p>
+        </w:tc>
+      </w:tr>
+      <w:tr>
+        <w:tc>
+          <w:tcPr>
+            <w:tcW w:type="dxa" w:w="620"/>
+            <w:shd w:fill="FAFBFC"/>
+          </w:tcPr>
+          <w:p>
+            <w:r>
+              <w:rPr>
+                <w:rFonts w:ascii="Calibri" w:hAnsi="Calibri"/>
+                <w:b/>
+                <w:i w:val="0"/>
+                <w:color w:val="1F2937"/>
+                <w:sz w:val="15"/>
+              </w:rPr>
+              <w:t>9</w:t>
+            </w:r>
+          </w:p>
+        </w:tc>
+        <w:tc>
+          <w:tcPr>
+            <w:tcW w:type="dxa" w:w="2200"/>
+            <w:shd w:fill="FAFBFC"/>
+          </w:tcPr>
+          <w:p>
+            <w:r>
+              <w:rPr>
+                <w:rFonts w:ascii="Calibri" w:hAnsi="Calibri"/>
+                <w:b w:val="0"/>
+                <w:i w:val="0"/>
+                <w:color w:val="1F2937"/>
+                <w:sz w:val="15"/>
+              </w:rPr>
+              <w:t>notice weeks period week giving resignation</w:t>
+            </w:r>
+          </w:p>
+        </w:tc>
+        <w:tc>
+          <w:tcPr>
+            <w:tcW w:type="dxa" w:w="4800"/>
+            <w:shd w:fill="FAFBFC"/>
+          </w:tcPr>
+          <w:p>
+            <w:r>
+              <w:rPr>
+                <w:rFonts w:ascii="Calibri" w:hAnsi="Calibri"/>
+                <w:b w:val="0"/>
+                <w:i w:val="0"/>
+                <w:color w:val="1F2937"/>
+                <w:sz w:val="15"/>
+              </w:rPr>
+              <w:t>Career precarity and exit</w:t>
+              <w:br/>
+              <w:t>Notice periods and resignation</w:t>
+            </w:r>
+          </w:p>
+        </w:tc>
+        <w:tc>
+          <w:tcPr>
+            <w:tcW w:type="dxa" w:w="1740"/>
+            <w:shd w:fill="E2F0D9"/>
+          </w:tcPr>
+          <w:p>
+            <w:r>
+              <w:rPr>
+                <w:rFonts w:ascii="Calibri" w:hAnsi="Calibri"/>
+                <w:b w:val="0"/>
+                <w:i w:val="0"/>
+                <w:color w:val="1F2937"/>
+                <w:sz w:val="15"/>
+              </w:rPr>
+              <w:t>Include</w:t>
+              <w:br/>
+              <w:t>high confidence</w:t>
+            </w:r>
+          </w:p>
+        </w:tc>
+      </w:tr>
+      <w:tr>
+        <w:tc>
+          <w:tcPr>
+            <w:tcW w:type="dxa" w:w="620"/>
+          </w:tcPr>
+          <w:p>
+            <w:r>
+              <w:rPr>
+                <w:rFonts w:ascii="Calibri" w:hAnsi="Calibri"/>
+                <w:b/>
+                <w:i w:val="0"/>
+                <w:color w:val="1F2937"/>
+                <w:sz w:val="15"/>
+              </w:rPr>
+              <w:t>10</w:t>
+            </w:r>
+          </w:p>
+        </w:tc>
+        <w:tc>
+          <w:tcPr>
+            <w:tcW w:type="dxa" w:w="2200"/>
+          </w:tcPr>
+          <w:p>
+            <w:r>
+              <w:rPr>
+                <w:rFonts w:ascii="Calibri" w:hAnsi="Calibri"/>
+                <w:b w:val="0"/>
+                <w:i w:val="0"/>
+                <w:color w:val="1F2937"/>
+                <w:sz w:val="15"/>
+              </w:rPr>
+              <w:t>schedule availability scheduled saturday sunday days</w:t>
+            </w:r>
+          </w:p>
+        </w:tc>
+        <w:tc>
+          <w:tcPr>
+            <w:tcW w:type="dxa" w:w="4800"/>
+          </w:tcPr>
+          <w:p>
+            <w:r>
+              <w:rPr>
+                <w:rFonts w:ascii="Calibri" w:hAnsi="Calibri"/>
+                <w:b w:val="0"/>
+                <w:i w:val="0"/>
+                <w:color w:val="1F2937"/>
+                <w:sz w:val="15"/>
+              </w:rPr>
+              <w:t>Scheduling hours and time off</w:t>
+              <w:br/>
+              <w:t>Scheduling and availability</w:t>
+            </w:r>
+          </w:p>
+        </w:tc>
+        <w:tc>
+          <w:tcPr>
+            <w:tcW w:type="dxa" w:w="1740"/>
+            <w:shd w:fill="E2F0D9"/>
+          </w:tcPr>
+          <w:p>
+            <w:r>
+              <w:rPr>
+                <w:rFonts w:ascii="Calibri" w:hAnsi="Calibri"/>
+                <w:b w:val="0"/>
+                <w:i w:val="0"/>
+                <w:color w:val="1F2937"/>
+                <w:sz w:val="15"/>
+              </w:rPr>
+              <w:t>Include</w:t>
+              <w:br/>
+              <w:t>high confidence</w:t>
+            </w:r>
+          </w:p>
+        </w:tc>
+      </w:tr>
+      <w:tr>
+        <w:tc>
+          <w:tcPr>
+            <w:tcW w:type="dxa" w:w="620"/>
+            <w:shd w:fill="FAFBFC"/>
+          </w:tcPr>
+          <w:p>
+            <w:r>
+              <w:rPr>
+                <w:rFonts w:ascii="Calibri" w:hAnsi="Calibri"/>
+                <w:b/>
+                <w:i w:val="0"/>
+                <w:color w:val="1F2937"/>
+                <w:sz w:val="15"/>
+              </w:rPr>
+              <w:t>11</w:t>
+            </w:r>
+          </w:p>
+        </w:tc>
+        <w:tc>
+          <w:tcPr>
+            <w:tcW w:type="dxa" w:w="2200"/>
+            <w:shd w:fill="FAFBFC"/>
+          </w:tcPr>
+          <w:p>
+            <w:r>
+              <w:rPr>
+                <w:rFonts w:ascii="Calibri" w:hAnsi="Calibri"/>
+                <w:b w:val="0"/>
+                <w:i w:val="0"/>
+                <w:color w:val="1F2937"/>
+                <w:sz w:val="15"/>
+              </w:rPr>
+              <w:t>pto vacation use approved days request</w:t>
+            </w:r>
+          </w:p>
+        </w:tc>
+        <w:tc>
+          <w:tcPr>
+            <w:tcW w:type="dxa" w:w="4800"/>
+            <w:shd w:fill="FAFBFC"/>
+          </w:tcPr>
+          <w:p>
+            <w:r>
+              <w:rPr>
+                <w:rFonts w:ascii="Calibri" w:hAnsi="Calibri"/>
+                <w:b w:val="0"/>
+                <w:i w:val="0"/>
+                <w:color w:val="1F2937"/>
+                <w:sz w:val="15"/>
+              </w:rPr>
+              <w:t>Scheduling hours and time off</w:t>
+              <w:br/>
+              <w:t>PTO and unpaid time off</w:t>
+            </w:r>
+          </w:p>
+        </w:tc>
+        <w:tc>
+          <w:tcPr>
+            <w:tcW w:type="dxa" w:w="1740"/>
+            <w:shd w:fill="E2F0D9"/>
+          </w:tcPr>
+          <w:p>
+            <w:r>
+              <w:rPr>
+                <w:rFonts w:ascii="Calibri" w:hAnsi="Calibri"/>
+                <w:b w:val="0"/>
+                <w:i w:val="0"/>
+                <w:color w:val="1F2937"/>
+                <w:sz w:val="15"/>
+              </w:rPr>
+              <w:t>Include</w:t>
+              <w:br/>
+              <w:t>high confidence</w:t>
+            </w:r>
+          </w:p>
+        </w:tc>
+      </w:tr>
+      <w:tr>
+        <w:tc>
+          <w:tcPr>
+            <w:tcW w:type="dxa" w:w="620"/>
+          </w:tcPr>
+          <w:p>
+            <w:r>
+              <w:rPr>
+                <w:rFonts w:ascii="Calibri" w:hAnsi="Calibri"/>
+                <w:b/>
+                <w:i w:val="0"/>
+                <w:color w:val="1F2937"/>
+                <w:sz w:val="15"/>
+              </w:rPr>
+              <w:t>12</w:t>
+            </w:r>
+          </w:p>
+        </w:tc>
+        <w:tc>
+          <w:tcPr>
+            <w:tcW w:type="dxa" w:w="2200"/>
+          </w:tcPr>
+          <w:p>
+            <w:r>
+              <w:rPr>
+                <w:rFonts w:ascii="Calibri" w:hAnsi="Calibri"/>
+                <w:b w:val="0"/>
+                <w:i w:val="0"/>
+                <w:color w:val="1F2937"/>
+                <w:sz w:val="15"/>
+              </w:rPr>
+              <w:t>tips tip tipping restaurant pool cash</w:t>
+            </w:r>
+          </w:p>
+        </w:tc>
+        <w:tc>
+          <w:tcPr>
+            <w:tcW w:type="dxa" w:w="4800"/>
+          </w:tcPr>
+          <w:p>
+            <w:r>
+              <w:rPr>
+                <w:rFonts w:ascii="Calibri" w:hAnsi="Calibri"/>
+                <w:b w:val="0"/>
+                <w:i w:val="0"/>
+                <w:color w:val="1F2937"/>
+                <w:sz w:val="15"/>
+              </w:rPr>
+              <w:t>Service work and tips</w:t>
+              <w:br/>
+              <w:t>Tipping and tip withholding</w:t>
+            </w:r>
+          </w:p>
+        </w:tc>
+        <w:tc>
+          <w:tcPr>
+            <w:tcW w:type="dxa" w:w="1740"/>
+            <w:shd w:fill="E2F0D9"/>
+          </w:tcPr>
+          <w:p>
+            <w:r>
+              <w:rPr>
+                <w:rFonts w:ascii="Calibri" w:hAnsi="Calibri"/>
+                <w:b w:val="0"/>
+                <w:i w:val="0"/>
+                <w:color w:val="1F2937"/>
+                <w:sz w:val="15"/>
+              </w:rPr>
+              <w:t>Include</w:t>
+              <w:br/>
+              <w:t>medium confidence</w:t>
+            </w:r>
+          </w:p>
+        </w:tc>
+      </w:tr>
+      <w:tr>
+        <w:tc>
+          <w:tcPr>
+            <w:tcW w:type="dxa" w:w="620"/>
+            <w:shd w:fill="FAFBFC"/>
+          </w:tcPr>
+          <w:p>
+            <w:r>
+              <w:rPr>
+                <w:rFonts w:ascii="Calibri" w:hAnsi="Calibri"/>
+                <w:b/>
+                <w:i w:val="0"/>
+                <w:color w:val="1F2937"/>
+                <w:sz w:val="15"/>
+              </w:rPr>
+              <w:t>13</w:t>
+            </w:r>
+          </w:p>
+        </w:tc>
+        <w:tc>
+          <w:tcPr>
+            <w:tcW w:type="dxa" w:w="2200"/>
+            <w:shd w:fill="FAFBFC"/>
+          </w:tcPr>
+          <w:p>
+            <w:r>
+              <w:rPr>
+                <w:rFonts w:ascii="Calibri" w:hAnsi="Calibri"/>
+                <w:b w:val="0"/>
+                <w:i w:val="0"/>
+                <w:color w:val="1F2937"/>
+                <w:sz w:val="15"/>
+              </w:rPr>
+              <w:t>vacation request trip days approved time</w:t>
+            </w:r>
+          </w:p>
+        </w:tc>
+        <w:tc>
+          <w:tcPr>
+            <w:tcW w:type="dxa" w:w="4800"/>
+            <w:shd w:fill="FAFBFC"/>
+          </w:tcPr>
+          <w:p>
+            <w:r>
+              <w:rPr>
+                <w:rFonts w:ascii="Calibri" w:hAnsi="Calibri"/>
+                <w:b w:val="0"/>
+                <w:i w:val="0"/>
+                <w:color w:val="1F2937"/>
+                <w:sz w:val="15"/>
+              </w:rPr>
+              <w:t>Scheduling hours and time off</w:t>
+              <w:br/>
+              <w:t>Vacation denial</w:t>
+            </w:r>
+          </w:p>
+        </w:tc>
+        <w:tc>
+          <w:tcPr>
+            <w:tcW w:type="dxa" w:w="1740"/>
+            <w:shd w:fill="E2F0D9"/>
+          </w:tcPr>
+          <w:p>
+            <w:r>
+              <w:rPr>
+                <w:rFonts w:ascii="Calibri" w:hAnsi="Calibri"/>
+                <w:b w:val="0"/>
+                <w:i w:val="0"/>
+                <w:color w:val="1F2937"/>
+                <w:sz w:val="15"/>
+              </w:rPr>
+              <w:t>Include</w:t>
+              <w:br/>
+              <w:t>high confidence</w:t>
+            </w:r>
+          </w:p>
+        </w:tc>
+      </w:tr>
+      <w:tr>
+        <w:tc>
+          <w:tcPr>
+            <w:tcW w:type="dxa" w:w="620"/>
+          </w:tcPr>
+          <w:p>
+            <w:r>
+              <w:rPr>
+                <w:rFonts w:ascii="Calibri" w:hAnsi="Calibri"/>
+                <w:b/>
+                <w:i w:val="0"/>
+                <w:color w:val="1F2937"/>
+                <w:sz w:val="15"/>
+              </w:rPr>
+              <w:t>14</w:t>
+            </w:r>
+          </w:p>
+        </w:tc>
+        <w:tc>
+          <w:tcPr>
+            <w:tcW w:type="dxa" w:w="2200"/>
+          </w:tcPr>
+          <w:p>
+            <w:r>
+              <w:rPr>
+                <w:rFonts w:ascii="Calibri" w:hAnsi="Calibri"/>
+                <w:b w:val="0"/>
+                <w:i w:val="0"/>
+                <w:color w:val="1F2937"/>
+                <w:sz w:val="15"/>
+              </w:rPr>
+              <w:t>union unions strike unionize workers unionizing</w:t>
+            </w:r>
+          </w:p>
+        </w:tc>
+        <w:tc>
+          <w:tcPr>
+            <w:tcW w:type="dxa" w:w="4800"/>
+          </w:tcPr>
+          <w:p>
+            <w:r>
+              <w:rPr>
+                <w:rFonts w:ascii="Calibri" w:hAnsi="Calibri"/>
+                <w:b w:val="0"/>
+                <w:i w:val="0"/>
+                <w:color w:val="1F2937"/>
+                <w:sz w:val="15"/>
+              </w:rPr>
+              <w:t>Collective worker power and rights</w:t>
+              <w:br/>
+              <w:t>Unionization and strikes</w:t>
+            </w:r>
+          </w:p>
+        </w:tc>
+        <w:tc>
+          <w:tcPr>
+            <w:tcW w:type="dxa" w:w="1740"/>
+            <w:shd w:fill="E2F0D9"/>
+          </w:tcPr>
+          <w:p>
+            <w:r>
+              <w:rPr>
+                <w:rFonts w:ascii="Calibri" w:hAnsi="Calibri"/>
+                <w:b w:val="0"/>
+                <w:i w:val="0"/>
+                <w:color w:val="1F2937"/>
+                <w:sz w:val="15"/>
+              </w:rPr>
+              <w:t>Include</w:t>
+              <w:br/>
+              <w:t>high confidence</w:t>
+            </w:r>
+          </w:p>
+        </w:tc>
+      </w:tr>
+    </w:tbl>
+    <w:p>
+      <w:r>
+        <w:br w:type="page"/>
+      </w:r>
+    </w:p>
+    <w:p>
+      <w:pPr>
+        <w:pStyle w:val="Heading2"/>
+      </w:pPr>
+      <w:r>
+        <w:rPr>
+          <w:rFonts w:ascii="Calibri" w:hAnsi="Calibri"/>
+          <w:b/>
+          <w:i w:val="0"/>
+          <w:color w:val="17365D"/>
+          <w:sz w:val="25"/>
+        </w:rPr>
+        <w:t>Reviewed clusters 16-30</w:t>
+      </w:r>
+    </w:p>
+    <w:tbl>
+      <w:tblPr>
+        <w:tblW w:type="dxa" w:w="9360"/>
+        <w:jc w:val="left"/>
+        <w:tblLayout w:type="fixed"/>
+        <w:tblLook w:firstColumn="1" w:firstRow="1" w:lastColumn="0" w:lastRow="0" w:noHBand="0" w:noVBand="1" w:val="04A0"/>
+      </w:tblPr>
+      <w:tblGrid>
+        <w:gridCol w:w="620"/>
+        <w:gridCol w:w="2200"/>
+        <w:gridCol w:w="4800"/>
+        <w:gridCol w:w="1740"/>
+      </w:tblGrid>
+      <w:tr>
+        <w:tc>
+          <w:tcPr>
+            <w:tcW w:type="dxa" w:w="620"/>
+            <w:tcMar>
+              <w:top w:w="80" w:type="dxa"/>
+              <w:start w:w="120" w:type="dxa"/>
+              <w:bottom w:w="80" w:type="dxa"/>
+              <w:end w:w="120" w:type="dxa"/>
+            </w:tcMar>
+            <w:vAlign w:val="center"/>
+            <w:shd w:fill="E8EEF5"/>
+          </w:tcPr>
+          <w:p>
+            <w:r>
+              <w:rPr>
+                <w:rFonts w:ascii="Calibri" w:hAnsi="Calibri"/>
+                <w:b/>
+                <w:i w:val="0"/>
+                <w:color w:val="17365D"/>
+                <w:sz w:val="16"/>
+              </w:rPr>
+              <w:t>ID</w:t>
+            </w:r>
+          </w:p>
+        </w:tc>
+        <w:tc>
+          <w:tcPr>
+            <w:tcW w:type="dxa" w:w="2200"/>
+            <w:tcMar>
+              <w:top w:w="80" w:type="dxa"/>
+              <w:start w:w="120" w:type="dxa"/>
+              <w:bottom w:w="80" w:type="dxa"/>
+              <w:end w:w="120" w:type="dxa"/>
+            </w:tcMar>
+            <w:vAlign w:val="center"/>
+            <w:shd w:fill="E8EEF5"/>
+          </w:tcPr>
+          <w:p>
+            <w:r>
+              <w:rPr>
+                <w:rFonts w:ascii="Calibri" w:hAnsi="Calibri"/>
+                <w:b/>
+                <w:i w:val="0"/>
+                <w:color w:val="17365D"/>
+                <w:sz w:val="16"/>
+              </w:rPr>
+              <w:t>Representative terms</w:t>
+            </w:r>
+          </w:p>
+        </w:tc>
+        <w:tc>
+          <w:tcPr>
+            <w:tcW w:type="dxa" w:w="4800"/>
+            <w:tcMar>
+              <w:top w:w="80" w:type="dxa"/>
+              <w:start w:w="120" w:type="dxa"/>
+              <w:bottom w:w="80" w:type="dxa"/>
+              <w:end w:w="120" w:type="dxa"/>
+            </w:tcMar>
+            <w:vAlign w:val="center"/>
+            <w:shd w:fill="E8EEF5"/>
+          </w:tcPr>
+          <w:p>
+            <w:r>
+              <w:rPr>
+                <w:rFonts w:ascii="Calibri" w:hAnsi="Calibri"/>
+                <w:b/>
+                <w:i w:val="0"/>
+                <w:color w:val="17365D"/>
+                <w:sz w:val="16"/>
+              </w:rPr>
+              <w:t>Candidate theme and subtheme</w:t>
+            </w:r>
+          </w:p>
+        </w:tc>
+        <w:tc>
+          <w:tcPr>
+            <w:tcW w:type="dxa" w:w="1740"/>
+            <w:tcMar>
+              <w:top w:w="80" w:type="dxa"/>
+              <w:start w:w="120" w:type="dxa"/>
+              <w:bottom w:w="80" w:type="dxa"/>
+              <w:end w:w="120" w:type="dxa"/>
+            </w:tcMar>
+            <w:vAlign w:val="center"/>
+            <w:shd w:fill="E8EEF5"/>
+          </w:tcPr>
+          <w:p>
+            <w:r>
+              <w:rPr>
+                <w:rFonts w:ascii="Calibri" w:hAnsi="Calibri"/>
+                <w:b/>
+                <w:i w:val="0"/>
+                <w:color w:val="17365D"/>
+                <w:sz w:val="16"/>
+              </w:rPr>
+              <w:t>Decision</w:t>
+            </w:r>
+          </w:p>
+        </w:tc>
+      </w:tr>
+      <w:tr>
+        <w:tc>
+          <w:tcPr>
+            <w:tcW w:type="dxa" w:w="620"/>
+          </w:tcPr>
+          <w:p>
+            <w:r>
+              <w:rPr>
+                <w:rFonts w:ascii="Calibri" w:hAnsi="Calibri"/>
+                <w:b/>
+                <w:i w:val="0"/>
+                <w:color w:val="1F2937"/>
+                <w:sz w:val="15"/>
+              </w:rPr>
+              <w:t>15</w:t>
+            </w:r>
+          </w:p>
+        </w:tc>
+        <w:tc>
+          <w:tcPr>
+            <w:tcW w:type="dxa" w:w="2200"/>
+          </w:tcPr>
+          <w:p>
+            <w:r>
+              <w:rPr>
+                <w:rFonts w:ascii="Calibri" w:hAnsi="Calibri"/>
+                <w:b w:val="0"/>
+                <w:i w:val="0"/>
+                <w:color w:val="1F2937"/>
+                <w:sz w:val="15"/>
+              </w:rPr>
+              <w:t>restaurant kitchen chef cook food bar</w:t>
+            </w:r>
+          </w:p>
+        </w:tc>
+        <w:tc>
+          <w:tcPr>
+            <w:tcW w:type="dxa" w:w="4800"/>
+          </w:tcPr>
+          <w:p>
+            <w:r>
+              <w:rPr>
+                <w:rFonts w:ascii="Calibri" w:hAnsi="Calibri"/>
+                <w:b w:val="0"/>
+                <w:i w:val="0"/>
+                <w:color w:val="1F2937"/>
+                <w:sz w:val="15"/>
+              </w:rPr>
+              <w:t>Service work and tips</w:t>
+              <w:br/>
+              <w:t>Hospitality and restaurant conditions</w:t>
+            </w:r>
+          </w:p>
+        </w:tc>
+        <w:tc>
+          <w:tcPr>
+            <w:tcW w:type="dxa" w:w="1740"/>
+            <w:shd w:fill="E2F0D9"/>
+          </w:tcPr>
+          <w:p>
+            <w:r>
+              <w:rPr>
+                <w:rFonts w:ascii="Calibri" w:hAnsi="Calibri"/>
+                <w:b w:val="0"/>
+                <w:i w:val="0"/>
+                <w:color w:val="1F2937"/>
+                <w:sz w:val="15"/>
+              </w:rPr>
+              <w:t>Include</w:t>
+              <w:br/>
+              <w:t>high confidence</w:t>
+            </w:r>
+          </w:p>
+        </w:tc>
+      </w:tr>
+      <w:tr>
+        <w:tc>
+          <w:tcPr>
+            <w:tcW w:type="dxa" w:w="620"/>
+            <w:shd w:fill="FAFBFC"/>
+          </w:tcPr>
+          <w:p>
+            <w:r>
+              <w:rPr>
+                <w:rFonts w:ascii="Calibri" w:hAnsi="Calibri"/>
+                <w:b/>
+                <w:i w:val="0"/>
+                <w:color w:val="1F2937"/>
+                <w:sz w:val="15"/>
+              </w:rPr>
+              <w:t>16</w:t>
+            </w:r>
+          </w:p>
+        </w:tc>
+        <w:tc>
+          <w:tcPr>
+            <w:tcW w:type="dxa" w:w="2200"/>
+            <w:shd w:fill="FAFBFC"/>
+          </w:tcPr>
+          <w:p>
+            <w:r>
+              <w:rPr>
+                <w:rFonts w:ascii="Calibri" w:hAnsi="Calibri"/>
+                <w:b w:val="0"/>
+                <w:i w:val="0"/>
+                <w:color w:val="1F2937"/>
+                <w:sz w:val="15"/>
+              </w:rPr>
+              <w:t>break breaks lunch minute 30 minutes</w:t>
+            </w:r>
+          </w:p>
+        </w:tc>
+        <w:tc>
+          <w:tcPr>
+            <w:tcW w:type="dxa" w:w="4800"/>
+            <w:shd w:fill="FAFBFC"/>
+          </w:tcPr>
+          <w:p>
+            <w:r>
+              <w:rPr>
+                <w:rFonts w:ascii="Calibri" w:hAnsi="Calibri"/>
+                <w:b w:val="0"/>
+                <w:i w:val="0"/>
+                <w:color w:val="1F2937"/>
+                <w:sz w:val="15"/>
+              </w:rPr>
+              <w:t>Scheduling hours and time off</w:t>
+              <w:br/>
+              <w:t>Meal and rest breaks</w:t>
+            </w:r>
+          </w:p>
+        </w:tc>
+        <w:tc>
+          <w:tcPr>
+            <w:tcW w:type="dxa" w:w="1740"/>
+            <w:shd w:fill="E2F0D9"/>
+          </w:tcPr>
+          <w:p>
+            <w:r>
+              <w:rPr>
+                <w:rFonts w:ascii="Calibri" w:hAnsi="Calibri"/>
+                <w:b w:val="0"/>
+                <w:i w:val="0"/>
+                <w:color w:val="1F2937"/>
+                <w:sz w:val="15"/>
+              </w:rPr>
+              <w:t>Include</w:t>
+              <w:br/>
+              <w:t>high confidence</w:t>
+            </w:r>
+          </w:p>
+        </w:tc>
+      </w:tr>
+      <w:tr>
+        <w:tc>
+          <w:tcPr>
+            <w:tcW w:type="dxa" w:w="620"/>
+          </w:tcPr>
+          <w:p>
+            <w:r>
+              <w:rPr>
+                <w:rFonts w:ascii="Calibri" w:hAnsi="Calibri"/>
+                <w:b/>
+                <w:i w:val="0"/>
+                <w:color w:val="1F2937"/>
+                <w:sz w:val="15"/>
+              </w:rPr>
+              <w:t>17</w:t>
+            </w:r>
+          </w:p>
+        </w:tc>
+        <w:tc>
+          <w:tcPr>
+            <w:tcW w:type="dxa" w:w="2200"/>
+          </w:tcPr>
+          <w:p>
+            <w:r>
+              <w:rPr>
+                <w:rFonts w:ascii="Calibri" w:hAnsi="Calibri"/>
+                <w:b w:val="0"/>
+                <w:i w:val="0"/>
+                <w:color w:val="1F2937"/>
+                <w:sz w:val="15"/>
+              </w:rPr>
+              <w:t>review reviews performance glassdoor feedback rating</w:t>
+            </w:r>
+          </w:p>
+        </w:tc>
+        <w:tc>
+          <w:tcPr>
+            <w:tcW w:type="dxa" w:w="4800"/>
+          </w:tcPr>
+          <w:p>
+            <w:r>
+              <w:rPr>
+                <w:rFonts w:ascii="Calibri" w:hAnsi="Calibri"/>
+                <w:b w:val="0"/>
+                <w:i w:val="0"/>
+                <w:color w:val="1F2937"/>
+                <w:sz w:val="15"/>
+              </w:rPr>
+              <w:t>Workplace authority and interpersonal conflict</w:t>
+              <w:br/>
+              <w:t>Performance reviews feedback and employer reputation</w:t>
+            </w:r>
+          </w:p>
+        </w:tc>
+        <w:tc>
+          <w:tcPr>
+            <w:tcW w:type="dxa" w:w="1740"/>
+            <w:shd w:fill="E2F0D9"/>
+          </w:tcPr>
+          <w:p>
+            <w:r>
+              <w:rPr>
+                <w:rFonts w:ascii="Calibri" w:hAnsi="Calibri"/>
+                <w:b w:val="0"/>
+                <w:i w:val="0"/>
+                <w:color w:val="1F2937"/>
+                <w:sz w:val="15"/>
+              </w:rPr>
+              <w:t>Include</w:t>
+              <w:br/>
+              <w:t>medium confidence</w:t>
+            </w:r>
+          </w:p>
+        </w:tc>
+      </w:tr>
+      <w:tr>
+        <w:tc>
+          <w:tcPr>
+            <w:tcW w:type="dxa" w:w="620"/>
+            <w:shd w:fill="FAFBFC"/>
+          </w:tcPr>
+          <w:p>
+            <w:r>
+              <w:rPr>
+                <w:rFonts w:ascii="Calibri" w:hAnsi="Calibri"/>
+                <w:b/>
+                <w:i w:val="0"/>
+                <w:color w:val="1F2937"/>
+                <w:sz w:val="15"/>
+              </w:rPr>
+              <w:t>18</w:t>
+            </w:r>
+          </w:p>
+        </w:tc>
+        <w:tc>
+          <w:tcPr>
+            <w:tcW w:type="dxa" w:w="2200"/>
+            <w:shd w:fill="FAFBFC"/>
+          </w:tcPr>
+          <w:p>
+            <w:r>
+              <w:rPr>
+                <w:rFonts w:ascii="Calibri" w:hAnsi="Calibri"/>
+                <w:b w:val="0"/>
+                <w:i w:val="0"/>
+                <w:color w:val="1F2937"/>
+                <w:sz w:val="15"/>
+              </w:rPr>
+              <w:t>quit quitting resign leaving tell today</w:t>
+            </w:r>
+          </w:p>
+        </w:tc>
+        <w:tc>
+          <w:tcPr>
+            <w:tcW w:type="dxa" w:w="4800"/>
+            <w:shd w:fill="FAFBFC"/>
+          </w:tcPr>
+          <w:p>
+            <w:r>
+              <w:rPr>
+                <w:rFonts w:ascii="Calibri" w:hAnsi="Calibri"/>
+                <w:b w:val="0"/>
+                <w:i w:val="0"/>
+                <w:color w:val="1F2937"/>
+                <w:sz w:val="15"/>
+              </w:rPr>
+              <w:t>Career precarity and exit</w:t>
+              <w:br/>
+              <w:t>Quitting decisions</w:t>
+            </w:r>
+          </w:p>
+        </w:tc>
+        <w:tc>
+          <w:tcPr>
+            <w:tcW w:type="dxa" w:w="1740"/>
+            <w:shd w:fill="E2F0D9"/>
+          </w:tcPr>
+          <w:p>
+            <w:r>
+              <w:rPr>
+                <w:rFonts w:ascii="Calibri" w:hAnsi="Calibri"/>
+                <w:b w:val="0"/>
+                <w:i w:val="0"/>
+                <w:color w:val="1F2937"/>
+                <w:sz w:val="15"/>
+              </w:rPr>
+              <w:t>Include</w:t>
+              <w:br/>
+              <w:t>high confidence</w:t>
+            </w:r>
+          </w:p>
+        </w:tc>
+      </w:tr>
+      <w:tr>
+        <w:tc>
+          <w:tcPr>
+            <w:tcW w:type="dxa" w:w="620"/>
+          </w:tcPr>
+          <w:p>
+            <w:r>
+              <w:rPr>
+                <w:rFonts w:ascii="Calibri" w:hAnsi="Calibri"/>
+                <w:b/>
+                <w:i w:val="0"/>
+                <w:color w:val="1F2937"/>
+                <w:sz w:val="15"/>
+              </w:rPr>
+              <w:t>19</w:t>
+            </w:r>
+          </w:p>
+        </w:tc>
+        <w:tc>
+          <w:tcPr>
+            <w:tcW w:type="dxa" w:w="2200"/>
+          </w:tcPr>
+          <w:p>
+            <w:r>
+              <w:rPr>
+                <w:rFonts w:ascii="Calibri" w:hAnsi="Calibri"/>
+                <w:b w:val="0"/>
+                <w:i w:val="0"/>
+                <w:color w:val="1F2937"/>
+                <w:sz w:val="15"/>
+              </w:rPr>
+              <w:t>funeral bereavement died mom passed family</w:t>
+            </w:r>
+          </w:p>
+        </w:tc>
+        <w:tc>
+          <w:tcPr>
+            <w:tcW w:type="dxa" w:w="4800"/>
+          </w:tcPr>
+          <w:p>
+            <w:r>
+              <w:rPr>
+                <w:rFonts w:ascii="Calibri" w:hAnsi="Calibri"/>
+                <w:b w:val="0"/>
+                <w:i w:val="0"/>
+                <w:color w:val="1F2937"/>
+                <w:sz w:val="15"/>
+              </w:rPr>
+              <w:t>Health safety and attendance</w:t>
+              <w:br/>
+              <w:t>Bereavement and compassionate leave</w:t>
+            </w:r>
+          </w:p>
+        </w:tc>
+        <w:tc>
+          <w:tcPr>
+            <w:tcW w:type="dxa" w:w="1740"/>
+            <w:shd w:fill="E2F0D9"/>
+          </w:tcPr>
+          <w:p>
+            <w:r>
+              <w:rPr>
+                <w:rFonts w:ascii="Calibri" w:hAnsi="Calibri"/>
+                <w:b w:val="0"/>
+                <w:i w:val="0"/>
+                <w:color w:val="1F2937"/>
+                <w:sz w:val="15"/>
+              </w:rPr>
+              <w:t>Include</w:t>
+              <w:br/>
+              <w:t>high confidence</w:t>
+            </w:r>
+          </w:p>
+        </w:tc>
+      </w:tr>
+      <w:tr>
+        <w:tc>
+          <w:tcPr>
+            <w:tcW w:type="dxa" w:w="620"/>
+            <w:shd w:fill="FAFBFC"/>
+          </w:tcPr>
+          <w:p>
+            <w:r>
+              <w:rPr>
+                <w:rFonts w:ascii="Calibri" w:hAnsi="Calibri"/>
+                <w:b/>
+                <w:i w:val="0"/>
+                <w:color w:val="1F2937"/>
+                <w:sz w:val="15"/>
+              </w:rPr>
+              <w:t>20</w:t>
+            </w:r>
+          </w:p>
+        </w:tc>
+        <w:tc>
+          <w:tcPr>
+            <w:tcW w:type="dxa" w:w="2200"/>
+            <w:shd w:fill="FAFBFC"/>
+          </w:tcPr>
+          <w:p>
+            <w:r>
+              <w:rPr>
+                <w:rFonts w:ascii="Calibri" w:hAnsi="Calibri"/>
+                <w:b w:val="0"/>
+                <w:i w:val="0"/>
+                <w:color w:val="1F2937"/>
+                <w:sz w:val="15"/>
+              </w:rPr>
+              <w:t>promotion promoted position role team level</w:t>
+            </w:r>
+          </w:p>
+        </w:tc>
+        <w:tc>
+          <w:tcPr>
+            <w:tcW w:type="dxa" w:w="4800"/>
+            <w:shd w:fill="FAFBFC"/>
+          </w:tcPr>
+          <w:p>
+            <w:r>
+              <w:rPr>
+                <w:rFonts w:ascii="Calibri" w:hAnsi="Calibri"/>
+                <w:b w:val="0"/>
+                <w:i w:val="0"/>
+                <w:color w:val="1F2937"/>
+                <w:sz w:val="15"/>
+              </w:rPr>
+              <w:t>Career precarity and exit</w:t>
+              <w:br/>
+              <w:t>Promotion and advancement</w:t>
+            </w:r>
+          </w:p>
+        </w:tc>
+        <w:tc>
+          <w:tcPr>
+            <w:tcW w:type="dxa" w:w="1740"/>
+            <w:shd w:fill="E2F0D9"/>
+          </w:tcPr>
+          <w:p>
+            <w:r>
+              <w:rPr>
+                <w:rFonts w:ascii="Calibri" w:hAnsi="Calibri"/>
+                <w:b w:val="0"/>
+                <w:i w:val="0"/>
+                <w:color w:val="1F2937"/>
+                <w:sz w:val="15"/>
+              </w:rPr>
+              <w:t>Include</w:t>
+              <w:br/>
+              <w:t>high confidence</w:t>
+            </w:r>
+          </w:p>
+        </w:tc>
+      </w:tr>
+      <w:tr>
+        <w:tc>
+          <w:tcPr>
+            <w:tcW w:type="dxa" w:w="620"/>
+          </w:tcPr>
+          <w:p>
+            <w:r>
+              <w:rPr>
+                <w:rFonts w:ascii="Calibri" w:hAnsi="Calibri"/>
+                <w:b/>
+                <w:i w:val="0"/>
+                <w:color w:val="1F2937"/>
+                <w:sz w:val="15"/>
+              </w:rPr>
+              <w:t>21</w:t>
+            </w:r>
+          </w:p>
+        </w:tc>
+        <w:tc>
+          <w:tcPr>
+            <w:tcW w:type="dxa" w:w="2200"/>
+          </w:tcPr>
+          <w:p>
+            <w:r>
+              <w:rPr>
+                <w:rFonts w:ascii="Calibri" w:hAnsi="Calibri"/>
+                <w:b w:val="0"/>
+                <w:i w:val="0"/>
+                <w:color w:val="1F2937"/>
+                <w:sz w:val="15"/>
+              </w:rPr>
+              <w:t>mental health autistic disability autism disabled</w:t>
+            </w:r>
+          </w:p>
+        </w:tc>
+        <w:tc>
+          <w:tcPr>
+            <w:tcW w:type="dxa" w:w="4800"/>
+          </w:tcPr>
+          <w:p>
+            <w:r>
+              <w:rPr>
+                <w:rFonts w:ascii="Calibri" w:hAnsi="Calibri"/>
+                <w:b w:val="0"/>
+                <w:i w:val="0"/>
+                <w:color w:val="1F2937"/>
+                <w:sz w:val="15"/>
+              </w:rPr>
+              <w:t>Health safety and attendance</w:t>
+              <w:br/>
+              <w:t>Mental health and disability</w:t>
+            </w:r>
+          </w:p>
+        </w:tc>
+        <w:tc>
+          <w:tcPr>
+            <w:tcW w:type="dxa" w:w="1740"/>
+            <w:shd w:fill="E2F0D9"/>
+          </w:tcPr>
+          <w:p>
+            <w:r>
+              <w:rPr>
+                <w:rFonts w:ascii="Calibri" w:hAnsi="Calibri"/>
+                <w:b w:val="0"/>
+                <w:i w:val="0"/>
+                <w:color w:val="1F2937"/>
+                <w:sz w:val="15"/>
+              </w:rPr>
+              <w:t>Include</w:t>
+              <w:br/>
+              <w:t>high confidence</w:t>
+            </w:r>
+          </w:p>
+        </w:tc>
+      </w:tr>
+      <w:tr>
+        <w:tc>
+          <w:tcPr>
+            <w:tcW w:type="dxa" w:w="620"/>
+            <w:shd w:fill="FAFBFC"/>
+          </w:tcPr>
+          <w:p>
+            <w:r>
+              <w:rPr>
+                <w:rFonts w:ascii="Calibri" w:hAnsi="Calibri"/>
+                <w:b/>
+                <w:i w:val="0"/>
+                <w:color w:val="1F2937"/>
+                <w:sz w:val="15"/>
+              </w:rPr>
+              <w:t>22</w:t>
+            </w:r>
+          </w:p>
+        </w:tc>
+        <w:tc>
+          <w:tcPr>
+            <w:tcW w:type="dxa" w:w="2200"/>
+            <w:shd w:fill="FAFBFC"/>
+          </w:tcPr>
+          <w:p>
+            <w:r>
+              <w:rPr>
+                <w:rFonts w:ascii="Calibri" w:hAnsi="Calibri"/>
+                <w:b w:val="0"/>
+                <w:i w:val="0"/>
+                <w:color w:val="1F2937"/>
+                <w:sz w:val="15"/>
+              </w:rPr>
+              <w:t>wages discuss discussing illegal nlrb pay</w:t>
+            </w:r>
+          </w:p>
+        </w:tc>
+        <w:tc>
+          <w:tcPr>
+            <w:tcW w:type="dxa" w:w="4800"/>
+            <w:shd w:fill="FAFBFC"/>
+          </w:tcPr>
+          <w:p>
+            <w:r>
+              <w:rPr>
+                <w:rFonts w:ascii="Calibri" w:hAnsi="Calibri"/>
+                <w:b w:val="0"/>
+                <w:i w:val="0"/>
+                <w:color w:val="1F2937"/>
+                <w:sz w:val="15"/>
+              </w:rPr>
+              <w:t>Compensation and pay rights</w:t>
+              <w:br/>
+              <w:t>Pay transparency and wage discussion rights</w:t>
+            </w:r>
+          </w:p>
+        </w:tc>
+        <w:tc>
+          <w:tcPr>
+            <w:tcW w:type="dxa" w:w="1740"/>
+            <w:shd w:fill="E2F0D9"/>
+          </w:tcPr>
+          <w:p>
+            <w:r>
+              <w:rPr>
+                <w:rFonts w:ascii="Calibri" w:hAnsi="Calibri"/>
+                <w:b w:val="0"/>
+                <w:i w:val="0"/>
+                <w:color w:val="1F2937"/>
+                <w:sz w:val="15"/>
+              </w:rPr>
+              <w:t>Include</w:t>
+              <w:br/>
+              <w:t>high confidence</w:t>
+            </w:r>
+          </w:p>
+        </w:tc>
+      </w:tr>
+      <w:tr>
+        <w:tc>
+          <w:tcPr>
+            <w:tcW w:type="dxa" w:w="620"/>
+          </w:tcPr>
+          <w:p>
+            <w:r>
+              <w:rPr>
+                <w:rFonts w:ascii="Calibri" w:hAnsi="Calibri"/>
+                <w:b/>
+                <w:i w:val="0"/>
+                <w:color w:val="1F2937"/>
+                <w:sz w:val="15"/>
+              </w:rPr>
+              <w:t>23</w:t>
+            </w:r>
+          </w:p>
+        </w:tc>
+        <w:tc>
+          <w:tcPr>
+            <w:tcW w:type="dxa" w:w="2200"/>
+          </w:tcPr>
+          <w:p>
+            <w:r>
+              <w:rPr>
+                <w:rFonts w:ascii="Calibri" w:hAnsi="Calibri"/>
+                <w:b w:val="0"/>
+                <w:i w:val="0"/>
+                <w:color w:val="1F2937"/>
+                <w:sz w:val="15"/>
+              </w:rPr>
+              <w:t>pregnant pregnancy baby maternity leave paternity</w:t>
+            </w:r>
+          </w:p>
+        </w:tc>
+        <w:tc>
+          <w:tcPr>
+            <w:tcW w:type="dxa" w:w="4800"/>
+          </w:tcPr>
+          <w:p>
+            <w:r>
+              <w:rPr>
+                <w:rFonts w:ascii="Calibri" w:hAnsi="Calibri"/>
+                <w:b w:val="0"/>
+                <w:i w:val="0"/>
+                <w:color w:val="1F2937"/>
+                <w:sz w:val="15"/>
+              </w:rPr>
+              <w:t>Health safety and attendance</w:t>
+              <w:br/>
+              <w:t>Pregnancy and parental leave</w:t>
+            </w:r>
+          </w:p>
+        </w:tc>
+        <w:tc>
+          <w:tcPr>
+            <w:tcW w:type="dxa" w:w="1740"/>
+            <w:shd w:fill="E2F0D9"/>
+          </w:tcPr>
+          <w:p>
+            <w:r>
+              <w:rPr>
+                <w:rFonts w:ascii="Calibri" w:hAnsi="Calibri"/>
+                <w:b w:val="0"/>
+                <w:i w:val="0"/>
+                <w:color w:val="1F2937"/>
+                <w:sz w:val="15"/>
+              </w:rPr>
+              <w:t>Include</w:t>
+              <w:br/>
+              <w:t>high confidence</w:t>
+            </w:r>
+          </w:p>
+        </w:tc>
+      </w:tr>
+      <w:tr>
+        <w:tc>
+          <w:tcPr>
+            <w:tcW w:type="dxa" w:w="620"/>
+            <w:shd w:fill="FAFBFC"/>
+          </w:tcPr>
+          <w:p>
+            <w:r>
+              <w:rPr>
+                <w:rFonts w:ascii="Calibri" w:hAnsi="Calibri"/>
+                <w:b/>
+                <w:i w:val="0"/>
+                <w:color w:val="1F2937"/>
+                <w:sz w:val="15"/>
+              </w:rPr>
+              <w:t>24</w:t>
+            </w:r>
+          </w:p>
+        </w:tc>
+        <w:tc>
+          <w:tcPr>
+            <w:tcW w:type="dxa" w:w="2200"/>
+            <w:shd w:fill="FAFBFC"/>
+          </w:tcPr>
+          <w:p>
+            <w:r>
+              <w:rPr>
+                <w:rFonts w:ascii="Calibri" w:hAnsi="Calibri"/>
+                <w:b w:val="0"/>
+                <w:i w:val="0"/>
+                <w:color w:val="1F2937"/>
+                <w:sz w:val="15"/>
+              </w:rPr>
+              <w:t>snow weather storm roads hurricane ice</w:t>
+            </w:r>
+          </w:p>
+        </w:tc>
+        <w:tc>
+          <w:tcPr>
+            <w:tcW w:type="dxa" w:w="4800"/>
+            <w:shd w:fill="FAFBFC"/>
+          </w:tcPr>
+          <w:p>
+            <w:r>
+              <w:rPr>
+                <w:rFonts w:ascii="Calibri" w:hAnsi="Calibri"/>
+                <w:b w:val="0"/>
+                <w:i w:val="0"/>
+                <w:color w:val="1F2937"/>
+                <w:sz w:val="15"/>
+              </w:rPr>
+              <w:t>Health safety and attendance</w:t>
+              <w:br/>
+              <w:t>Weather and commute safety</w:t>
+            </w:r>
+          </w:p>
+        </w:tc>
+        <w:tc>
+          <w:tcPr>
+            <w:tcW w:type="dxa" w:w="1740"/>
+            <w:shd w:fill="E2F0D9"/>
+          </w:tcPr>
+          <w:p>
+            <w:r>
+              <w:rPr>
+                <w:rFonts w:ascii="Calibri" w:hAnsi="Calibri"/>
+                <w:b w:val="0"/>
+                <w:i w:val="0"/>
+                <w:color w:val="1F2937"/>
+                <w:sz w:val="15"/>
+              </w:rPr>
+              <w:t>Include</w:t>
+              <w:br/>
+              <w:t>high confidence</w:t>
+            </w:r>
+          </w:p>
+        </w:tc>
+      </w:tr>
+      <w:tr>
+        <w:tc>
+          <w:tcPr>
+            <w:tcW w:type="dxa" w:w="620"/>
+          </w:tcPr>
+          <w:p>
+            <w:r>
+              <w:rPr>
+                <w:rFonts w:ascii="Calibri" w:hAnsi="Calibri"/>
+                <w:b/>
+                <w:i w:val="0"/>
+                <w:color w:val="1F2937"/>
+                <w:sz w:val="15"/>
+              </w:rPr>
+              <w:t>25</w:t>
+            </w:r>
+          </w:p>
+        </w:tc>
+        <w:tc>
+          <w:tcPr>
+            <w:tcW w:type="dxa" w:w="2200"/>
+          </w:tcPr>
+          <w:p>
+            <w:r>
+              <w:rPr>
+                <w:rFonts w:ascii="Calibri" w:hAnsi="Calibri"/>
+                <w:b w:val="0"/>
+                <w:i w:val="0"/>
+                <w:color w:val="1F2937"/>
+                <w:sz w:val="15"/>
+              </w:rPr>
+              <w:t>sick calling called come days feeling</w:t>
+            </w:r>
+          </w:p>
+        </w:tc>
+        <w:tc>
+          <w:tcPr>
+            <w:tcW w:type="dxa" w:w="4800"/>
+          </w:tcPr>
+          <w:p>
+            <w:r>
+              <w:rPr>
+                <w:rFonts w:ascii="Calibri" w:hAnsi="Calibri"/>
+                <w:b w:val="0"/>
+                <w:i w:val="0"/>
+                <w:color w:val="1F2937"/>
+                <w:sz w:val="15"/>
+              </w:rPr>
+              <w:t>Health safety and attendance</w:t>
+              <w:br/>
+              <w:t>Sick leave and attendance pressure</w:t>
+            </w:r>
+          </w:p>
+        </w:tc>
+        <w:tc>
+          <w:tcPr>
+            <w:tcW w:type="dxa" w:w="1740"/>
+            <w:shd w:fill="E2F0D9"/>
+          </w:tcPr>
+          <w:p>
+            <w:r>
+              <w:rPr>
+                <w:rFonts w:ascii="Calibri" w:hAnsi="Calibri"/>
+                <w:b w:val="0"/>
+                <w:i w:val="0"/>
+                <w:color w:val="1F2937"/>
+                <w:sz w:val="15"/>
+              </w:rPr>
+              <w:t>Include</w:t>
+              <w:br/>
+              <w:t>high confidence</w:t>
+            </w:r>
+          </w:p>
+        </w:tc>
+      </w:tr>
+      <w:tr>
+        <w:tc>
+          <w:tcPr>
+            <w:tcW w:type="dxa" w:w="620"/>
+            <w:shd w:fill="FAFBFC"/>
+          </w:tcPr>
+          <w:p>
+            <w:r>
+              <w:rPr>
+                <w:rFonts w:ascii="Calibri" w:hAnsi="Calibri"/>
+                <w:b/>
+                <w:i w:val="0"/>
+                <w:color w:val="1F2937"/>
+                <w:sz w:val="15"/>
+              </w:rPr>
+              <w:t>26</w:t>
+            </w:r>
+          </w:p>
+        </w:tc>
+        <w:tc>
+          <w:tcPr>
+            <w:tcW w:type="dxa" w:w="2200"/>
+            <w:shd w:fill="FAFBFC"/>
+          </w:tcPr>
+          <w:p>
+            <w:r>
+              <w:rPr>
+                <w:rFonts w:ascii="Calibri" w:hAnsi="Calibri"/>
+                <w:b w:val="0"/>
+                <w:i w:val="0"/>
+                <w:color w:val="1F2937"/>
+                <w:sz w:val="15"/>
+              </w:rPr>
+              <w:t>fired firing got adverse threatened activity</w:t>
+            </w:r>
+          </w:p>
+        </w:tc>
+        <w:tc>
+          <w:tcPr>
+            <w:tcW w:type="dxa" w:w="4800"/>
+            <w:shd w:fill="FAFBFC"/>
+          </w:tcPr>
+          <w:p>
+            <w:r>
+              <w:rPr>
+                <w:rFonts w:ascii="Calibri" w:hAnsi="Calibri"/>
+                <w:b w:val="0"/>
+                <w:i w:val="0"/>
+                <w:color w:val="1F2937"/>
+                <w:sz w:val="15"/>
+              </w:rPr>
+              <w:t>Career precarity and exit</w:t>
+              <w:br/>
+              <w:t>Firing retaliation and termination</w:t>
+            </w:r>
+          </w:p>
+        </w:tc>
+        <w:tc>
+          <w:tcPr>
+            <w:tcW w:type="dxa" w:w="1740"/>
+            <w:shd w:fill="E2F0D9"/>
+          </w:tcPr>
+          <w:p>
+            <w:r>
+              <w:rPr>
+                <w:rFonts w:ascii="Calibri" w:hAnsi="Calibri"/>
+                <w:b w:val="0"/>
+                <w:i w:val="0"/>
+                <w:color w:val="1F2937"/>
+                <w:sz w:val="15"/>
+              </w:rPr>
+              <w:t>Include</w:t>
+              <w:br/>
+              <w:t>medium confidence</w:t>
+            </w:r>
+          </w:p>
+        </w:tc>
+      </w:tr>
+      <w:tr>
+        <w:tc>
+          <w:tcPr>
+            <w:tcW w:type="dxa" w:w="620"/>
+          </w:tcPr>
+          <w:p>
+            <w:r>
+              <w:rPr>
+                <w:rFonts w:ascii="Calibri" w:hAnsi="Calibri"/>
+                <w:b/>
+                <w:i w:val="0"/>
+                <w:color w:val="1F2937"/>
+                <w:sz w:val="15"/>
+              </w:rPr>
+              <w:t>27</w:t>
+            </w:r>
+          </w:p>
+        </w:tc>
+        <w:tc>
+          <w:tcPr>
+            <w:tcW w:type="dxa" w:w="2200"/>
+          </w:tcPr>
+          <w:p>
+            <w:r>
+              <w:rPr>
+                <w:rFonts w:ascii="Calibri" w:hAnsi="Calibri"/>
+                <w:b w:val="0"/>
+                <w:i w:val="0"/>
+                <w:color w:val="1F2937"/>
+                <w:sz w:val="15"/>
+              </w:rPr>
+              <w:t>overtime exempt ot hours salaried 40</w:t>
+            </w:r>
+          </w:p>
+        </w:tc>
+        <w:tc>
+          <w:tcPr>
+            <w:tcW w:type="dxa" w:w="4800"/>
+          </w:tcPr>
+          <w:p>
+            <w:r>
+              <w:rPr>
+                <w:rFonts w:ascii="Calibri" w:hAnsi="Calibri"/>
+                <w:b w:val="0"/>
+                <w:i w:val="0"/>
+                <w:color w:val="1F2937"/>
+                <w:sz w:val="15"/>
+              </w:rPr>
+              <w:t>Compensation and pay rights</w:t>
+              <w:br/>
+              <w:t>Overtime and exempt status</w:t>
+            </w:r>
+          </w:p>
+        </w:tc>
+        <w:tc>
+          <w:tcPr>
+            <w:tcW w:type="dxa" w:w="1740"/>
+            <w:shd w:fill="E2F0D9"/>
+          </w:tcPr>
+          <w:p>
+            <w:r>
+              <w:rPr>
+                <w:rFonts w:ascii="Calibri" w:hAnsi="Calibri"/>
+                <w:b w:val="0"/>
+                <w:i w:val="0"/>
+                <w:color w:val="1F2937"/>
+                <w:sz w:val="15"/>
+              </w:rPr>
+              <w:t>Include</w:t>
+              <w:br/>
+              <w:t>high confidence</w:t>
+            </w:r>
+          </w:p>
+        </w:tc>
+      </w:tr>
+      <w:tr>
+        <w:tc>
+          <w:tcPr>
+            <w:tcW w:type="dxa" w:w="620"/>
+            <w:shd w:fill="FAFBFC"/>
+          </w:tcPr>
+          <w:p>
+            <w:r>
+              <w:rPr>
+                <w:rFonts w:ascii="Calibri" w:hAnsi="Calibri"/>
+                <w:b/>
+                <w:i w:val="0"/>
+                <w:color w:val="1F2937"/>
+                <w:sz w:val="15"/>
+              </w:rPr>
+              <w:t>28</w:t>
+            </w:r>
+          </w:p>
+        </w:tc>
+        <w:tc>
+          <w:tcPr>
+            <w:tcW w:type="dxa" w:w="2200"/>
+            <w:shd w:fill="FAFBFC"/>
+          </w:tcPr>
+          <w:p>
+            <w:r>
+              <w:rPr>
+                <w:rFonts w:ascii="Calibri" w:hAnsi="Calibri"/>
+                <w:b w:val="0"/>
+                <w:i w:val="0"/>
+                <w:color w:val="1F2937"/>
+                <w:sz w:val="15"/>
+              </w:rPr>
+              <w:t>phone phones personal cell app number</w:t>
+            </w:r>
+          </w:p>
+        </w:tc>
+        <w:tc>
+          <w:tcPr>
+            <w:tcW w:type="dxa" w:w="4800"/>
+            <w:shd w:fill="FAFBFC"/>
+          </w:tcPr>
+          <w:p>
+            <w:r>
+              <w:rPr>
+                <w:rFonts w:ascii="Calibri" w:hAnsi="Calibri"/>
+                <w:b w:val="0"/>
+                <w:i w:val="0"/>
+                <w:color w:val="1F2937"/>
+                <w:sz w:val="15"/>
+              </w:rPr>
+              <w:t>Work arrangements and control</w:t>
+              <w:br/>
+              <w:t>Personal-phone and off-hours boundaries</w:t>
+            </w:r>
+          </w:p>
+        </w:tc>
+        <w:tc>
+          <w:tcPr>
+            <w:tcW w:type="dxa" w:w="1740"/>
+            <w:shd w:fill="E2F0D9"/>
+          </w:tcPr>
+          <w:p>
+            <w:r>
+              <w:rPr>
+                <w:rFonts w:ascii="Calibri" w:hAnsi="Calibri"/>
+                <w:b w:val="0"/>
+                <w:i w:val="0"/>
+                <w:color w:val="1F2937"/>
+                <w:sz w:val="15"/>
+              </w:rPr>
+              <w:t>Include</w:t>
+              <w:br/>
+              <w:t>high confidence</w:t>
+            </w:r>
+          </w:p>
+        </w:tc>
+      </w:tr>
+      <w:tr>
+        <w:tc>
+          <w:tcPr>
+            <w:tcW w:type="dxa" w:w="620"/>
+          </w:tcPr>
+          <w:p>
+            <w:r>
+              <w:rPr>
+                <w:rFonts w:ascii="Calibri" w:hAnsi="Calibri"/>
+                <w:b/>
+                <w:i w:val="0"/>
+                <w:color w:val="1F2937"/>
+                <w:sz w:val="15"/>
+              </w:rPr>
+              <w:t>29</w:t>
+            </w:r>
+          </w:p>
+        </w:tc>
+        <w:tc>
+          <w:tcPr>
+            <w:tcW w:type="dxa" w:w="2200"/>
+          </w:tcPr>
+          <w:p>
+            <w:r>
+              <w:rPr>
+                <w:rFonts w:ascii="Calibri" w:hAnsi="Calibri"/>
+                <w:b w:val="0"/>
+                <w:i w:val="0"/>
+                <w:color w:val="1F2937"/>
+                <w:sz w:val="15"/>
+              </w:rPr>
+              <w:t>antiwork sub anti movement subreddit society</w:t>
+            </w:r>
+          </w:p>
+        </w:tc>
+        <w:tc>
+          <w:tcPr>
+            <w:tcW w:type="dxa" w:w="4800"/>
+          </w:tcPr>
+          <w:p>
+            <w:r>
+              <w:rPr>
+                <w:rFonts w:ascii="Calibri" w:hAnsi="Calibri"/>
+                <w:b w:val="0"/>
+                <w:i w:val="0"/>
+                <w:color w:val="1F2937"/>
+                <w:sz w:val="15"/>
+              </w:rPr>
+              <w:t>Other</w:t>
+              <w:br/>
+              <w:t>Community meta-discussion</w:t>
+            </w:r>
+          </w:p>
+        </w:tc>
+        <w:tc>
+          <w:tcPr>
+            <w:tcW w:type="dxa" w:w="1740"/>
+            <w:shd w:fill="F2F4F7"/>
+          </w:tcPr>
+          <w:p>
+            <w:r>
+              <w:rPr>
+                <w:rFonts w:ascii="Calibri" w:hAnsi="Calibri"/>
+                <w:b w:val="0"/>
+                <w:i w:val="0"/>
+                <w:color w:val="1F2937"/>
+                <w:sz w:val="15"/>
+              </w:rPr>
+              <w:t>Exclude</w:t>
+              <w:br/>
+              <w:t>high confidence</w:t>
+            </w:r>
+          </w:p>
+        </w:tc>
+      </w:tr>
+    </w:tbl>
     <w:sectPr>
       <w:headerReference w:type="default" r:id="rId9"/>
       <w:headerReference w:type="even" r:id="rId10"/>
@@ -2075,7 +4664,7 @@
         <w:color w:val="5D6B7A"/>
         <w:sz w:val="16"/>
       </w:rPr>
-      <w:t>Prepared 1 September 2026 | Exploratory evidence package</w:t>
+      <w:t>Updated 2 September 2026 | Exploratory evidence package</w:t>
     </w:r>
   </w:p>
 </w:ftr>
@@ -2096,7 +4685,7 @@
         <w:color w:val="5D6B7A"/>
         <w:sz w:val="16"/>
       </w:rPr>
-      <w:t>Prepared 1 September 2026 | Exploratory evidence package</w:t>
+      <w:t>Updated 2 September 2026 | Exploratory evidence package</w:t>
     </w:r>
   </w:p>
 </w:ftr>

</xml_diff>

<commit_message>
Publish reproducible exploratory analysis package
</commit_message>
<xml_diff>
--- a/deliverables/Antiwork_Exploratory_Analysis_Brief.docx
+++ b/deliverables/Antiwork_Exploratory_Analysis_Brief.docx
@@ -187,6 +187,8 @@
                 <w:sz w:val="16"/>
               </w:rPr>
               <w:t>topic assignment</w:t>
+              <w:br/>
+              <w:t>n=37,536 of 97,254</w:t>
             </w:r>
           </w:p>
         </w:tc>
@@ -230,6 +232,8 @@
                 <w:sz w:val="16"/>
               </w:rPr>
               <w:t>theme-map coverage</w:t>
+              <w:br/>
+              <w:t>n=18,506 of 97,254</w:t>
             </w:r>
           </w:p>
         </w:tc>
@@ -262,7 +266,7 @@
           <w:color w:val="1F2937"/>
           <w:sz w:val="21"/>
         </w:rPr>
-        <w:t>Across 97,254 management-related r/antiwork posts from March 2021 through February 2025, the updated BERTopic analysis identifies a descriptive shift away from COVID-centered health and safety discussion and toward scheduling and time-off discussion. Compensation, career precarity, and recruitment remain present across the four rolling windows.</w:t>
+        <w:t>Across 577,190 archived r/antiwork submission records retrieved from March 2021 through February 2025, the management-term filter retained 97,254 unique posts for analysis. The updated BERTopic analysis identifies a descriptive shift away from COVID-centered health and safety discussion and toward scheduling and time-off discussion. Compensation, career precarity, and recruitment remain present across the four rolling windows.</w:t>
       </w:r>
     </w:p>
     <w:tbl>
@@ -429,6 +433,8 @@
                 <w:sz w:val="18"/>
               </w:rPr>
               <w:t>Y1</w:t>
+              <w:br/>
+              <w:t>(n=28,276)</w:t>
             </w:r>
           </w:p>
         </w:tc>
@@ -454,6 +460,8 @@
                 <w:sz w:val="18"/>
               </w:rPr>
               <w:t>Y4</w:t>
+              <w:br/>
+              <w:t>(n=11,960)</w:t>
             </w:r>
           </w:p>
         </w:tc>
@@ -515,6 +523,8 @@
                 <w:sz w:val="17"/>
               </w:rPr>
               <w:t>4.97%</w:t>
+              <w:br/>
+              <w:t>(n=1,406)</w:t>
             </w:r>
           </w:p>
         </w:tc>
@@ -532,6 +542,8 @@
                 <w:sz w:val="17"/>
               </w:rPr>
               <w:t>2.50%</w:t>
+              <w:br/>
+              <w:t>(n=299)</w:t>
             </w:r>
           </w:p>
         </w:tc>
@@ -548,7 +560,7 @@
                 <w:color w:val="1F2937"/>
                 <w:sz w:val="17"/>
               </w:rPr>
-              <w:t>Down 2.47 pp; early COVID/illness concentration contracts.</w:t>
+              <w:t>Early COVID/illness concentration contracts.</w:t>
             </w:r>
           </w:p>
         </w:tc>
@@ -587,6 +599,8 @@
                 <w:sz w:val="17"/>
               </w:rPr>
               <w:t>1.71%</w:t>
+              <w:br/>
+              <w:t>(n=484)</w:t>
             </w:r>
           </w:p>
         </w:tc>
@@ -605,6 +619,8 @@
                 <w:sz w:val="17"/>
               </w:rPr>
               <w:t>3.20%</w:t>
+              <w:br/>
+              <w:t>(n=383)</w:t>
             </w:r>
           </w:p>
         </w:tc>
@@ -622,7 +638,7 @@
                 <w:color w:val="1F2937"/>
                 <w:sz w:val="17"/>
               </w:rPr>
-              <w:t>Up 1.49 pp; largest mapped theme in Y4.</w:t>
+              <w:t>Largest mapped theme in Y4.</w:t>
             </w:r>
           </w:p>
         </w:tc>
@@ -659,6 +675,8 @@
                 <w:sz w:val="17"/>
               </w:rPr>
               <w:t>3.52%</w:t>
+              <w:br/>
+              <w:t>(n=994)</w:t>
             </w:r>
           </w:p>
         </w:tc>
@@ -676,6 +694,8 @@
                 <w:sz w:val="17"/>
               </w:rPr>
               <w:t>3.04%</w:t>
+              <w:br/>
+              <w:t>(n=363)</w:t>
             </w:r>
           </w:p>
         </w:tc>
@@ -731,6 +751,8 @@
                 <w:sz w:val="17"/>
               </w:rPr>
               <w:t>2.54%</w:t>
+              <w:br/>
+              <w:t>(n=718)</w:t>
             </w:r>
           </w:p>
         </w:tc>
@@ -749,6 +771,8 @@
                 <w:sz w:val="17"/>
               </w:rPr>
               <w:t>2.47%</w:t>
+              <w:br/>
+              <w:t>(n=295)</w:t>
             </w:r>
           </w:p>
         </w:tc>
@@ -814,7 +838,7 @@
           <w:color w:val="1F2937"/>
           <w:sz w:val="18"/>
         </w:rPr>
-        <w:t>Public r/antiwork submissions were retrieved through the Arctic Shift archive API in monthly UTC batches from 1 March 2021 through 1 March 2025. The analysis retained unique posts whose title or body matched the established management terms boss, manager, supervisor, or team lead, including plural variants. The resulting corpus is an archive-based sample of public discourse, not a representative sample of employees or an author-level panel. Archive records may differ from content displayed on Reddit after collection.</w:t>
+        <w:t>Public r/antiwork submissions were retrieved through the Arctic Shift archive API in 48 monthly UTC batches from 1 March 2021 through 1 March 2025. This collection yielded 577,190 archived submission records before filtering. The analysis retained 97,254 unique posts whose title or body matched the established management terms boss, manager, supervisor, or team lead, including plural variants. The resulting corpus is an archive-based sample of public discourse, not a representative sample of employees or an author-level panel. Archive records may differ from content displayed on Reddit after collection.</w:t>
       </w:r>
     </w:p>
     <w:p>
@@ -864,7 +888,7 @@
           <w:color w:val="17365D"/>
           <w:sz w:val="20"/>
         </w:rPr>
-        <w:t xml:space="preserve">1. Freeze and audit the corpus. </w:t>
+        <w:t xml:space="preserve">1. Collect, filter, and audit the corpus. </w:t>
       </w:r>
       <w:r>
         <w:rPr>
@@ -874,7 +898,7 @@
           <w:color w:val="1F2937"/>
           <w:sz w:val="19"/>
         </w:rPr>
-        <w:t>Matched the management-related filter to the preprocessed analysis corpus and confirmed 97,254 unique post IDs. A duplicate audit found 1.2% residual duplicate non-placeholder texts; this is reported rather than silently removed.</w:t>
+        <w:t>Retrieved 577,190 archived submission records across 48 monthly pulls, then applied the management-term filter and confirmed 97,254 unique retained post IDs. A duplicate audit found 1.2% residual duplicate non-placeholder texts; this is reported rather than silently removed.</w:t>
       </w:r>
     </w:p>
     <w:p>
@@ -999,7 +1023,7 @@
           <w:color w:val="1F2937"/>
           <w:sz w:val="19"/>
         </w:rPr>
-        <w:t>Ran seed-stability checks, title-only sensitivity, and one-to-one top-term alignment checks across rolling-window fits. Sentiment was intentionally not analyzed, and the paper will make no causal or full-conversation prevalence claims.</w:t>
+        <w:t>Ran seed-stability checks, title-only sensitivity, and one-to-one top-term alignment checks across rolling-window fits. A fixed RoBERTa whole-post polarity check then scored all 97,254 retained posts and was joined to the reviewed map without refitting either model; causal, human-validated sentiment, and full-conversation prevalence claims remain out of scope.</w:t>
       </w:r>
     </w:p>
     <w:p>
@@ -1113,7 +1137,7 @@
       <w:r>
         <w:drawing>
           <wp:inline xmlns:a="http://schemas.openxmlformats.org/drawingml/2006/main" xmlns:pic="http://schemas.openxmlformats.org/drawingml/2006/picture">
-            <wp:extent cx="5760720" cy="2704529"/>
+            <wp:extent cx="5760720" cy="1712771"/>
             <wp:docPr id="2" name="Picture 2"/>
             <wp:cNvGraphicFramePr>
               <a:graphicFrameLocks noChangeAspect="1"/>
@@ -1134,7 +1158,7 @@
                   <pic:spPr>
                     <a:xfrm>
                       <a:off x="0" y="0"/>
-                      <a:ext cx="5760720" cy="2704529"/>
+                      <a:ext cx="5760720" cy="1712771"/>
                     </a:xfrm>
                     <a:prstGeom prst="rect"/>
                   </pic:spPr>
@@ -1177,7 +1201,22 @@
           <w:color w:val="17365D"/>
           <w:sz w:val="30"/>
         </w:rPr>
-        <w:t>All reviewed themes by rolling window</w:t>
+        <w:t>Month-by-month longitudinal patterns in the ten largest reviewed clusters</w:t>
+      </w:r>
+    </w:p>
+    <w:p>
+      <w:pPr>
+        <w:spacing w:after="80"/>
+      </w:pPr>
+      <w:r>
+        <w:rPr>
+          <w:rFonts w:ascii="Calibri" w:hAnsi="Calibri"/>
+          <w:b w:val="0"/>
+          <w:i w:val="0"/>
+          <w:color w:val="1F2937"/>
+          <w:sz w:val="18"/>
+        </w:rPr>
+        <w:t>The top-level candidate map contains nine themes, so a literal top-ten theme chart would be mislabeled. For the requested month-by-month longitudinal view, the figure below shows the ten largest included BERTopic clusters, nested within the nine-theme map and labeled as subthemes rather than as additional themes. Each panel uses the full filtered monthly corpus as its denominator.</w:t>
       </w:r>
     </w:p>
     <w:p>
@@ -1187,7 +1226,7 @@
       <w:r>
         <w:drawing>
           <wp:inline xmlns:a="http://schemas.openxmlformats.org/drawingml/2006/main" xmlns:pic="http://schemas.openxmlformats.org/drawingml/2006/picture">
-            <wp:extent cx="4160520" cy="2277728"/>
+            <wp:extent cx="5760720" cy="2694496"/>
             <wp:docPr id="3" name="Picture 3"/>
             <wp:cNvGraphicFramePr>
               <a:graphicFrameLocks noChangeAspect="1"/>
@@ -1196,7 +1235,7 @@
               <a:graphicData uri="http://schemas.openxmlformats.org/drawingml/2006/picture">
                 <pic:pic>
                   <pic:nvPicPr>
-                    <pic:cNvPr id="0" name="candidate_theme_rolling_window_prevalence.png"/>
+                    <pic:cNvPr id="0" name="top10_reviewed_subtheme_monthly_prevalence.png"/>
                     <pic:cNvPicPr/>
                   </pic:nvPicPr>
                   <pic:blipFill>
@@ -1208,7 +1247,7 @@
                   <pic:spPr>
                     <a:xfrm>
                       <a:off x="0" y="0"/>
-                      <a:ext cx="4160520" cy="2277728"/>
+                      <a:ext cx="5760720" cy="2694496"/>
                     </a:xfrm>
                     <a:prstGeom prst="rect"/>
                   </pic:spPr>
@@ -1231,7 +1270,1605 @@
           <w:color w:val="5D6B7A"/>
           <w:sz w:val="16"/>
         </w:rPr>
-        <w:t>Figure 3. Exploratory prevalence by rolling window. The 27-cluster map excludes generic, deleted, and community-meta clusters.</w:t>
+        <w:t>Figure 3. Month-by-month longitudinal prevalence of the ten largest reviewed clusters, with each cluster's parent candidate theme in its label. The shaded period is the Y1 Great Resignation window, March 2021 through February 2022. Panel n values are full-period cluster sizes.</w:t>
+      </w:r>
+    </w:p>
+    <w:p>
+      <w:r>
+        <w:br w:type="page"/>
+      </w:r>
+    </w:p>
+    <w:p>
+      <w:pPr>
+        <w:pStyle w:val="Heading1"/>
+      </w:pPr>
+      <w:r>
+        <w:rPr>
+          <w:rFonts w:ascii="Calibri" w:hAnsi="Calibri"/>
+          <w:b/>
+          <w:i w:val="0"/>
+          <w:color w:val="17365D"/>
+          <w:sz w:val="30"/>
+        </w:rPr>
+        <w:t>All reviewed themes by rolling window</w:t>
+      </w:r>
+    </w:p>
+    <w:p>
+      <w:pPr>
+        <w:jc w:val="center"/>
+      </w:pPr>
+      <w:r>
+        <w:drawing>
+          <wp:inline xmlns:a="http://schemas.openxmlformats.org/drawingml/2006/main" xmlns:pic="http://schemas.openxmlformats.org/drawingml/2006/picture">
+            <wp:extent cx="4160520" cy="2187277"/>
+            <wp:docPr id="4" name="Picture 4"/>
+            <wp:cNvGraphicFramePr>
+              <a:graphicFrameLocks noChangeAspect="1"/>
+            </wp:cNvGraphicFramePr>
+            <a:graphic>
+              <a:graphicData uri="http://schemas.openxmlformats.org/drawingml/2006/picture">
+                <pic:pic>
+                  <pic:nvPicPr>
+                    <pic:cNvPr id="0" name="candidate_theme_rolling_window_prevalence.png"/>
+                    <pic:cNvPicPr/>
+                  </pic:nvPicPr>
+                  <pic:blipFill>
+                    <a:blip r:embed="rId16"/>
+                    <a:stretch>
+                      <a:fillRect/>
+                    </a:stretch>
+                  </pic:blipFill>
+                  <pic:spPr>
+                    <a:xfrm>
+                      <a:off x="0" y="0"/>
+                      <a:ext cx="4160520" cy="2187277"/>
+                    </a:xfrm>
+                    <a:prstGeom prst="rect"/>
+                  </pic:spPr>
+                </pic:pic>
+              </a:graphicData>
+            </a:graphic>
+          </wp:inline>
+        </w:drawing>
+      </w:r>
+    </w:p>
+    <w:p>
+      <w:pPr>
+        <w:spacing w:after="0"/>
+      </w:pPr>
+      <w:r>
+        <w:rPr>
+          <w:rFonts w:ascii="Calibri" w:hAnsi="Calibri"/>
+          <w:b w:val="0"/>
+          <w:i/>
+          <w:color w:val="5D6B7A"/>
+          <w:sz w:val="16"/>
+        </w:rPr>
+        <w:t>Figure 4. Exploratory prevalence by rolling window. The legend gives each window denominator; Table 1 gives the numerator n behind every displayed percentage. The 27-cluster map excludes generic, deleted, and community-meta clusters.</w:t>
+      </w:r>
+    </w:p>
+    <w:p>
+      <w:r>
+        <w:br w:type="page"/>
+      </w:r>
+    </w:p>
+    <w:p>
+      <w:pPr>
+        <w:pStyle w:val="Heading1"/>
+      </w:pPr>
+      <w:r>
+        <w:rPr>
+          <w:rFonts w:ascii="Calibri" w:hAnsi="Calibri"/>
+          <w:b/>
+          <w:i w:val="0"/>
+          <w:color w:val="17365D"/>
+          <w:sz w:val="30"/>
+        </w:rPr>
+        <w:t>Counts behind rolling-window percentages</w:t>
+      </w:r>
+    </w:p>
+    <w:p>
+      <w:pPr>
+        <w:spacing w:after="100"/>
+      </w:pPr>
+      <w:r>
+        <w:rPr>
+          <w:rFonts w:ascii="Calibri" w:hAnsi="Calibri"/>
+          <w:b w:val="0"/>
+          <w:i w:val="0"/>
+          <w:color w:val="1F2937"/>
+          <w:sz w:val="18"/>
+        </w:rPr>
+        <w:t>Each cell gives the theme share of all filtered posts in that rolling window followed by its numerator n. The column-header n is the all-filtered-post denominator for that window.</w:t>
+      </w:r>
+    </w:p>
+    <w:tbl>
+      <w:tblPr>
+        <w:tblW w:type="dxa" w:w="9360"/>
+        <w:jc w:val="left"/>
+        <w:tblLayout w:type="fixed"/>
+        <w:tblLook w:firstColumn="1" w:firstRow="1" w:lastColumn="0" w:lastRow="0" w:noHBand="0" w:noVBand="1" w:val="04A0"/>
+      </w:tblPr>
+      <w:tblGrid>
+        <w:gridCol w:w="3000"/>
+        <w:gridCol w:w="1590"/>
+        <w:gridCol w:w="1590"/>
+        <w:gridCol w:w="1590"/>
+        <w:gridCol w:w="1590"/>
+      </w:tblGrid>
+      <w:tr>
+        <w:tc>
+          <w:tcPr>
+            <w:tcW w:type="dxa" w:w="3000"/>
+            <w:tcMar>
+              <w:top w:w="80" w:type="dxa"/>
+              <w:start w:w="120" w:type="dxa"/>
+              <w:bottom w:w="80" w:type="dxa"/>
+              <w:end w:w="120" w:type="dxa"/>
+            </w:tcMar>
+            <w:vAlign w:val="center"/>
+            <w:shd w:fill="E8EEF5"/>
+          </w:tcPr>
+          <w:p>
+            <w:r>
+              <w:rPr>
+                <w:rFonts w:ascii="Calibri" w:hAnsi="Calibri"/>
+                <w:b/>
+                <w:i w:val="0"/>
+                <w:color w:val="17365D"/>
+                <w:sz w:val="15"/>
+              </w:rPr>
+              <w:t>Candidate theme</w:t>
+            </w:r>
+          </w:p>
+        </w:tc>
+        <w:tc>
+          <w:tcPr>
+            <w:tcW w:type="dxa" w:w="1590"/>
+            <w:tcMar>
+              <w:top w:w="80" w:type="dxa"/>
+              <w:start w:w="120" w:type="dxa"/>
+              <w:bottom w:w="80" w:type="dxa"/>
+              <w:end w:w="120" w:type="dxa"/>
+            </w:tcMar>
+            <w:vAlign w:val="center"/>
+            <w:shd w:fill="E8EEF5"/>
+          </w:tcPr>
+          <w:p>
+            <w:r>
+              <w:rPr>
+                <w:rFonts w:ascii="Calibri" w:hAnsi="Calibri"/>
+                <w:b/>
+                <w:i w:val="0"/>
+                <w:color w:val="17365D"/>
+                <w:sz w:val="15"/>
+              </w:rPr>
+              <w:t>Y1 2021-22</w:t>
+              <w:br/>
+              <w:t>(n=28,276)</w:t>
+            </w:r>
+          </w:p>
+        </w:tc>
+        <w:tc>
+          <w:tcPr>
+            <w:tcW w:type="dxa" w:w="1590"/>
+            <w:tcMar>
+              <w:top w:w="80" w:type="dxa"/>
+              <w:start w:w="120" w:type="dxa"/>
+              <w:bottom w:w="80" w:type="dxa"/>
+              <w:end w:w="120" w:type="dxa"/>
+            </w:tcMar>
+            <w:vAlign w:val="center"/>
+            <w:shd w:fill="E8EEF5"/>
+          </w:tcPr>
+          <w:p>
+            <w:r>
+              <w:rPr>
+                <w:rFonts w:ascii="Calibri" w:hAnsi="Calibri"/>
+                <w:b/>
+                <w:i w:val="0"/>
+                <w:color w:val="17365D"/>
+                <w:sz w:val="15"/>
+              </w:rPr>
+              <w:t>Y2 2022-23</w:t>
+              <w:br/>
+              <w:t>(n=34,410)</w:t>
+            </w:r>
+          </w:p>
+        </w:tc>
+        <w:tc>
+          <w:tcPr>
+            <w:tcW w:type="dxa" w:w="1590"/>
+            <w:tcMar>
+              <w:top w:w="80" w:type="dxa"/>
+              <w:start w:w="120" w:type="dxa"/>
+              <w:bottom w:w="80" w:type="dxa"/>
+              <w:end w:w="120" w:type="dxa"/>
+            </w:tcMar>
+            <w:vAlign w:val="center"/>
+            <w:shd w:fill="E8EEF5"/>
+          </w:tcPr>
+          <w:p>
+            <w:r>
+              <w:rPr>
+                <w:rFonts w:ascii="Calibri" w:hAnsi="Calibri"/>
+                <w:b/>
+                <w:i w:val="0"/>
+                <w:color w:val="17365D"/>
+                <w:sz w:val="15"/>
+              </w:rPr>
+              <w:t>Y3 2023-24</w:t>
+              <w:br/>
+              <w:t>(n=22,608)</w:t>
+            </w:r>
+          </w:p>
+        </w:tc>
+        <w:tc>
+          <w:tcPr>
+            <w:tcW w:type="dxa" w:w="1590"/>
+            <w:tcMar>
+              <w:top w:w="80" w:type="dxa"/>
+              <w:start w:w="120" w:type="dxa"/>
+              <w:bottom w:w="80" w:type="dxa"/>
+              <w:end w:w="120" w:type="dxa"/>
+            </w:tcMar>
+            <w:vAlign w:val="center"/>
+            <w:shd w:fill="E8EEF5"/>
+          </w:tcPr>
+          <w:p>
+            <w:r>
+              <w:rPr>
+                <w:rFonts w:ascii="Calibri" w:hAnsi="Calibri"/>
+                <w:b/>
+                <w:i w:val="0"/>
+                <w:color w:val="17365D"/>
+                <w:sz w:val="15"/>
+              </w:rPr>
+              <w:t>Y4 2024-25</w:t>
+              <w:br/>
+              <w:t>(n=11,960)</w:t>
+            </w:r>
+          </w:p>
+        </w:tc>
+      </w:tr>
+      <w:tr>
+        <w:tc>
+          <w:tcPr>
+            <w:tcW w:type="dxa" w:w="3000"/>
+          </w:tcPr>
+          <w:p>
+            <w:r>
+              <w:rPr>
+                <w:rFonts w:ascii="Calibri" w:hAnsi="Calibri"/>
+                <w:b/>
+                <w:i w:val="0"/>
+                <w:color w:val="1F2937"/>
+                <w:sz w:val="15"/>
+              </w:rPr>
+              <w:t>Compensation and pay rights</w:t>
+            </w:r>
+          </w:p>
+        </w:tc>
+        <w:tc>
+          <w:tcPr>
+            <w:tcW w:type="dxa" w:w="1590"/>
+          </w:tcPr>
+          <w:p>
+            <w:r>
+              <w:rPr>
+                <w:rFonts w:ascii="Calibri" w:hAnsi="Calibri"/>
+                <w:b w:val="0"/>
+                <w:i w:val="0"/>
+                <w:color w:val="1F2937"/>
+                <w:sz w:val="15"/>
+              </w:rPr>
+              <w:t>3.52%</w:t>
+              <w:br/>
+              <w:t>(n=994)</w:t>
+            </w:r>
+          </w:p>
+        </w:tc>
+        <w:tc>
+          <w:tcPr>
+            <w:tcW w:type="dxa" w:w="1590"/>
+          </w:tcPr>
+          <w:p>
+            <w:r>
+              <w:rPr>
+                <w:rFonts w:ascii="Calibri" w:hAnsi="Calibri"/>
+                <w:b w:val="0"/>
+                <w:i w:val="0"/>
+                <w:color w:val="1F2937"/>
+                <w:sz w:val="15"/>
+              </w:rPr>
+              <w:t>4.01%</w:t>
+              <w:br/>
+              <w:t>(n=1,379)</w:t>
+            </w:r>
+          </w:p>
+        </w:tc>
+        <w:tc>
+          <w:tcPr>
+            <w:tcW w:type="dxa" w:w="1590"/>
+          </w:tcPr>
+          <w:p>
+            <w:r>
+              <w:rPr>
+                <w:rFonts w:ascii="Calibri" w:hAnsi="Calibri"/>
+                <w:b w:val="0"/>
+                <w:i w:val="0"/>
+                <w:color w:val="1F2937"/>
+                <w:sz w:val="15"/>
+              </w:rPr>
+              <w:t>3.79%</w:t>
+              <w:br/>
+              <w:t>(n=856)</w:t>
+            </w:r>
+          </w:p>
+        </w:tc>
+        <w:tc>
+          <w:tcPr>
+            <w:tcW w:type="dxa" w:w="1590"/>
+          </w:tcPr>
+          <w:p>
+            <w:r>
+              <w:rPr>
+                <w:rFonts w:ascii="Calibri" w:hAnsi="Calibri"/>
+                <w:b w:val="0"/>
+                <w:i w:val="0"/>
+                <w:color w:val="1F2937"/>
+                <w:sz w:val="15"/>
+              </w:rPr>
+              <w:t>3.04%</w:t>
+              <w:br/>
+              <w:t>(n=363)</w:t>
+            </w:r>
+          </w:p>
+        </w:tc>
+      </w:tr>
+      <w:tr>
+        <w:tc>
+          <w:tcPr>
+            <w:tcW w:type="dxa" w:w="3000"/>
+            <w:shd w:fill="FAFBFC"/>
+          </w:tcPr>
+          <w:p>
+            <w:r>
+              <w:rPr>
+                <w:rFonts w:ascii="Calibri" w:hAnsi="Calibri"/>
+                <w:b/>
+                <w:i w:val="0"/>
+                <w:color w:val="1F2937"/>
+                <w:sz w:val="15"/>
+              </w:rPr>
+              <w:t>Health safety and attendance</w:t>
+            </w:r>
+          </w:p>
+        </w:tc>
+        <w:tc>
+          <w:tcPr>
+            <w:tcW w:type="dxa" w:w="1590"/>
+            <w:shd w:fill="FAFBFC"/>
+          </w:tcPr>
+          <w:p>
+            <w:r>
+              <w:rPr>
+                <w:rFonts w:ascii="Calibri" w:hAnsi="Calibri"/>
+                <w:b w:val="0"/>
+                <w:i w:val="0"/>
+                <w:color w:val="1F2937"/>
+                <w:sz w:val="15"/>
+              </w:rPr>
+              <w:t>4.97%</w:t>
+              <w:br/>
+              <w:t>(n=1,406)</w:t>
+            </w:r>
+          </w:p>
+        </w:tc>
+        <w:tc>
+          <w:tcPr>
+            <w:tcW w:type="dxa" w:w="1590"/>
+            <w:shd w:fill="FAFBFC"/>
+          </w:tcPr>
+          <w:p>
+            <w:r>
+              <w:rPr>
+                <w:rFonts w:ascii="Calibri" w:hAnsi="Calibri"/>
+                <w:b w:val="0"/>
+                <w:i w:val="0"/>
+                <w:color w:val="1F2937"/>
+                <w:sz w:val="15"/>
+              </w:rPr>
+              <w:t>2.97%</w:t>
+              <w:br/>
+              <w:t>(n=1,023)</w:t>
+            </w:r>
+          </w:p>
+        </w:tc>
+        <w:tc>
+          <w:tcPr>
+            <w:tcW w:type="dxa" w:w="1590"/>
+            <w:shd w:fill="FAFBFC"/>
+          </w:tcPr>
+          <w:p>
+            <w:r>
+              <w:rPr>
+                <w:rFonts w:ascii="Calibri" w:hAnsi="Calibri"/>
+                <w:b w:val="0"/>
+                <w:i w:val="0"/>
+                <w:color w:val="1F2937"/>
+                <w:sz w:val="15"/>
+              </w:rPr>
+              <w:t>2.54%</w:t>
+              <w:br/>
+              <w:t>(n=574)</w:t>
+            </w:r>
+          </w:p>
+        </w:tc>
+        <w:tc>
+          <w:tcPr>
+            <w:tcW w:type="dxa" w:w="1590"/>
+            <w:shd w:fill="FAFBFC"/>
+          </w:tcPr>
+          <w:p>
+            <w:r>
+              <w:rPr>
+                <w:rFonts w:ascii="Calibri" w:hAnsi="Calibri"/>
+                <w:b w:val="0"/>
+                <w:i w:val="0"/>
+                <w:color w:val="1F2937"/>
+                <w:sz w:val="15"/>
+              </w:rPr>
+              <w:t>2.50%</w:t>
+              <w:br/>
+              <w:t>(n=299)</w:t>
+            </w:r>
+          </w:p>
+        </w:tc>
+      </w:tr>
+      <w:tr>
+        <w:tc>
+          <w:tcPr>
+            <w:tcW w:type="dxa" w:w="3000"/>
+          </w:tcPr>
+          <w:p>
+            <w:r>
+              <w:rPr>
+                <w:rFonts w:ascii="Calibri" w:hAnsi="Calibri"/>
+                <w:b/>
+                <w:i w:val="0"/>
+                <w:color w:val="1F2937"/>
+                <w:sz w:val="15"/>
+              </w:rPr>
+              <w:t>Career precarity and exit</w:t>
+            </w:r>
+          </w:p>
+        </w:tc>
+        <w:tc>
+          <w:tcPr>
+            <w:tcW w:type="dxa" w:w="1590"/>
+          </w:tcPr>
+          <w:p>
+            <w:r>
+              <w:rPr>
+                <w:rFonts w:ascii="Calibri" w:hAnsi="Calibri"/>
+                <w:b w:val="0"/>
+                <w:i w:val="0"/>
+                <w:color w:val="1F2937"/>
+                <w:sz w:val="15"/>
+              </w:rPr>
+              <w:t>2.54%</w:t>
+              <w:br/>
+              <w:t>(n=718)</w:t>
+            </w:r>
+          </w:p>
+        </w:tc>
+        <w:tc>
+          <w:tcPr>
+            <w:tcW w:type="dxa" w:w="1590"/>
+          </w:tcPr>
+          <w:p>
+            <w:r>
+              <w:rPr>
+                <w:rFonts w:ascii="Calibri" w:hAnsi="Calibri"/>
+                <w:b w:val="0"/>
+                <w:i w:val="0"/>
+                <w:color w:val="1F2937"/>
+                <w:sz w:val="15"/>
+              </w:rPr>
+              <w:t>2.78%</w:t>
+              <w:br/>
+              <w:t>(n=956)</w:t>
+            </w:r>
+          </w:p>
+        </w:tc>
+        <w:tc>
+          <w:tcPr>
+            <w:tcW w:type="dxa" w:w="1590"/>
+          </w:tcPr>
+          <w:p>
+            <w:r>
+              <w:rPr>
+                <w:rFonts w:ascii="Calibri" w:hAnsi="Calibri"/>
+                <w:b w:val="0"/>
+                <w:i w:val="0"/>
+                <w:color w:val="1F2937"/>
+                <w:sz w:val="15"/>
+              </w:rPr>
+              <w:t>2.85%</w:t>
+              <w:br/>
+              <w:t>(n=644)</w:t>
+            </w:r>
+          </w:p>
+        </w:tc>
+        <w:tc>
+          <w:tcPr>
+            <w:tcW w:type="dxa" w:w="1590"/>
+          </w:tcPr>
+          <w:p>
+            <w:r>
+              <w:rPr>
+                <w:rFonts w:ascii="Calibri" w:hAnsi="Calibri"/>
+                <w:b w:val="0"/>
+                <w:i w:val="0"/>
+                <w:color w:val="1F2937"/>
+                <w:sz w:val="15"/>
+              </w:rPr>
+              <w:t>2.47%</w:t>
+              <w:br/>
+              <w:t>(n=295)</w:t>
+            </w:r>
+          </w:p>
+        </w:tc>
+      </w:tr>
+      <w:tr>
+        <w:tc>
+          <w:tcPr>
+            <w:tcW w:type="dxa" w:w="3000"/>
+            <w:shd w:fill="FAFBFC"/>
+          </w:tcPr>
+          <w:p>
+            <w:r>
+              <w:rPr>
+                <w:rFonts w:ascii="Calibri" w:hAnsi="Calibri"/>
+                <w:b/>
+                <w:i w:val="0"/>
+                <w:color w:val="1F2937"/>
+                <w:sz w:val="15"/>
+              </w:rPr>
+              <w:t>Scheduling hours and time off</w:t>
+            </w:r>
+          </w:p>
+        </w:tc>
+        <w:tc>
+          <w:tcPr>
+            <w:tcW w:type="dxa" w:w="1590"/>
+            <w:shd w:fill="FAFBFC"/>
+          </w:tcPr>
+          <w:p>
+            <w:r>
+              <w:rPr>
+                <w:rFonts w:ascii="Calibri" w:hAnsi="Calibri"/>
+                <w:b w:val="0"/>
+                <w:i w:val="0"/>
+                <w:color w:val="1F2937"/>
+                <w:sz w:val="15"/>
+              </w:rPr>
+              <w:t>1.71%</w:t>
+              <w:br/>
+              <w:t>(n=484)</w:t>
+            </w:r>
+          </w:p>
+        </w:tc>
+        <w:tc>
+          <w:tcPr>
+            <w:tcW w:type="dxa" w:w="1590"/>
+            <w:shd w:fill="FAFBFC"/>
+          </w:tcPr>
+          <w:p>
+            <w:r>
+              <w:rPr>
+                <w:rFonts w:ascii="Calibri" w:hAnsi="Calibri"/>
+                <w:b w:val="0"/>
+                <w:i w:val="0"/>
+                <w:color w:val="1F2937"/>
+                <w:sz w:val="15"/>
+              </w:rPr>
+              <w:t>2.55%</w:t>
+              <w:br/>
+              <w:t>(n=878)</w:t>
+            </w:r>
+          </w:p>
+        </w:tc>
+        <w:tc>
+          <w:tcPr>
+            <w:tcW w:type="dxa" w:w="1590"/>
+            <w:shd w:fill="FAFBFC"/>
+          </w:tcPr>
+          <w:p>
+            <w:r>
+              <w:rPr>
+                <w:rFonts w:ascii="Calibri" w:hAnsi="Calibri"/>
+                <w:b w:val="0"/>
+                <w:i w:val="0"/>
+                <w:color w:val="1F2937"/>
+                <w:sz w:val="15"/>
+              </w:rPr>
+              <w:t>3.11%</w:t>
+              <w:br/>
+              <w:t>(n=704)</w:t>
+            </w:r>
+          </w:p>
+        </w:tc>
+        <w:tc>
+          <w:tcPr>
+            <w:tcW w:type="dxa" w:w="1590"/>
+            <w:shd w:fill="FAFBFC"/>
+          </w:tcPr>
+          <w:p>
+            <w:r>
+              <w:rPr>
+                <w:rFonts w:ascii="Calibri" w:hAnsi="Calibri"/>
+                <w:b w:val="0"/>
+                <w:i w:val="0"/>
+                <w:color w:val="1F2937"/>
+                <w:sz w:val="15"/>
+              </w:rPr>
+              <w:t>3.20%</w:t>
+              <w:br/>
+              <w:t>(n=383)</w:t>
+            </w:r>
+          </w:p>
+        </w:tc>
+      </w:tr>
+      <w:tr>
+        <w:tc>
+          <w:tcPr>
+            <w:tcW w:type="dxa" w:w="3000"/>
+          </w:tcPr>
+          <w:p>
+            <w:r>
+              <w:rPr>
+                <w:rFonts w:ascii="Calibri" w:hAnsi="Calibri"/>
+                <w:b/>
+                <w:i w:val="0"/>
+                <w:color w:val="1F2937"/>
+                <w:sz w:val="15"/>
+              </w:rPr>
+              <w:t>Recruitment and labor market</w:t>
+            </w:r>
+          </w:p>
+        </w:tc>
+        <w:tc>
+          <w:tcPr>
+            <w:tcW w:type="dxa" w:w="1590"/>
+          </w:tcPr>
+          <w:p>
+            <w:r>
+              <w:rPr>
+                <w:rFonts w:ascii="Calibri" w:hAnsi="Calibri"/>
+                <w:b w:val="0"/>
+                <w:i w:val="0"/>
+                <w:color w:val="1F2937"/>
+                <w:sz w:val="15"/>
+              </w:rPr>
+              <w:t>1.98%</w:t>
+              <w:br/>
+              <w:t>(n=560)</w:t>
+            </w:r>
+          </w:p>
+        </w:tc>
+        <w:tc>
+          <w:tcPr>
+            <w:tcW w:type="dxa" w:w="1590"/>
+          </w:tcPr>
+          <w:p>
+            <w:r>
+              <w:rPr>
+                <w:rFonts w:ascii="Calibri" w:hAnsi="Calibri"/>
+                <w:b w:val="0"/>
+                <w:i w:val="0"/>
+                <w:color w:val="1F2937"/>
+                <w:sz w:val="15"/>
+              </w:rPr>
+              <w:t>2.27%</w:t>
+              <w:br/>
+              <w:t>(n=780)</w:t>
+            </w:r>
+          </w:p>
+        </w:tc>
+        <w:tc>
+          <w:tcPr>
+            <w:tcW w:type="dxa" w:w="1590"/>
+          </w:tcPr>
+          <w:p>
+            <w:r>
+              <w:rPr>
+                <w:rFonts w:ascii="Calibri" w:hAnsi="Calibri"/>
+                <w:b w:val="0"/>
+                <w:i w:val="0"/>
+                <w:color w:val="1F2937"/>
+                <w:sz w:val="15"/>
+              </w:rPr>
+              <w:t>2.44%</w:t>
+              <w:br/>
+              <w:t>(n=551)</w:t>
+            </w:r>
+          </w:p>
+        </w:tc>
+        <w:tc>
+          <w:tcPr>
+            <w:tcW w:type="dxa" w:w="1590"/>
+          </w:tcPr>
+          <w:p>
+            <w:r>
+              <w:rPr>
+                <w:rFonts w:ascii="Calibri" w:hAnsi="Calibri"/>
+                <w:b w:val="0"/>
+                <w:i w:val="0"/>
+                <w:color w:val="1F2937"/>
+                <w:sz w:val="15"/>
+              </w:rPr>
+              <w:t>2.33%</w:t>
+              <w:br/>
+              <w:t>(n=279)</w:t>
+            </w:r>
+          </w:p>
+        </w:tc>
+      </w:tr>
+      <w:tr>
+        <w:tc>
+          <w:tcPr>
+            <w:tcW w:type="dxa" w:w="3000"/>
+            <w:shd w:fill="FAFBFC"/>
+          </w:tcPr>
+          <w:p>
+            <w:r>
+              <w:rPr>
+                <w:rFonts w:ascii="Calibri" w:hAnsi="Calibri"/>
+                <w:b/>
+                <w:i w:val="0"/>
+                <w:color w:val="1F2937"/>
+                <w:sz w:val="15"/>
+              </w:rPr>
+              <w:t>Work arrangements and control</w:t>
+            </w:r>
+          </w:p>
+        </w:tc>
+        <w:tc>
+          <w:tcPr>
+            <w:tcW w:type="dxa" w:w="1590"/>
+            <w:shd w:fill="FAFBFC"/>
+          </w:tcPr>
+          <w:p>
+            <w:r>
+              <w:rPr>
+                <w:rFonts w:ascii="Calibri" w:hAnsi="Calibri"/>
+                <w:b w:val="0"/>
+                <w:i w:val="0"/>
+                <w:color w:val="1F2937"/>
+                <w:sz w:val="15"/>
+              </w:rPr>
+              <w:t>1.01%</w:t>
+              <w:br/>
+              <w:t>(n=286)</w:t>
+            </w:r>
+          </w:p>
+        </w:tc>
+        <w:tc>
+          <w:tcPr>
+            <w:tcW w:type="dxa" w:w="1590"/>
+            <w:shd w:fill="FAFBFC"/>
+          </w:tcPr>
+          <w:p>
+            <w:r>
+              <w:rPr>
+                <w:rFonts w:ascii="Calibri" w:hAnsi="Calibri"/>
+                <w:b w:val="0"/>
+                <w:i w:val="0"/>
+                <w:color w:val="1F2937"/>
+                <w:sz w:val="15"/>
+              </w:rPr>
+              <w:t>1.49%</w:t>
+              <w:br/>
+              <w:t>(n=513)</w:t>
+            </w:r>
+          </w:p>
+        </w:tc>
+        <w:tc>
+          <w:tcPr>
+            <w:tcW w:type="dxa" w:w="1590"/>
+            <w:shd w:fill="FAFBFC"/>
+          </w:tcPr>
+          <w:p>
+            <w:r>
+              <w:rPr>
+                <w:rFonts w:ascii="Calibri" w:hAnsi="Calibri"/>
+                <w:b w:val="0"/>
+                <w:i w:val="0"/>
+                <w:color w:val="1F2937"/>
+                <w:sz w:val="15"/>
+              </w:rPr>
+              <w:t>1.46%</w:t>
+              <w:br/>
+              <w:t>(n=330)</w:t>
+            </w:r>
+          </w:p>
+        </w:tc>
+        <w:tc>
+          <w:tcPr>
+            <w:tcW w:type="dxa" w:w="1590"/>
+            <w:shd w:fill="FAFBFC"/>
+          </w:tcPr>
+          <w:p>
+            <w:r>
+              <w:rPr>
+                <w:rFonts w:ascii="Calibri" w:hAnsi="Calibri"/>
+                <w:b w:val="0"/>
+                <w:i w:val="0"/>
+                <w:color w:val="1F2937"/>
+                <w:sz w:val="15"/>
+              </w:rPr>
+              <w:t>1.35%</w:t>
+              <w:br/>
+              <w:t>(n=162)</w:t>
+            </w:r>
+          </w:p>
+        </w:tc>
+      </w:tr>
+      <w:tr>
+        <w:tc>
+          <w:tcPr>
+            <w:tcW w:type="dxa" w:w="3000"/>
+          </w:tcPr>
+          <w:p>
+            <w:r>
+              <w:rPr>
+                <w:rFonts w:ascii="Calibri" w:hAnsi="Calibri"/>
+                <w:b/>
+                <w:i w:val="0"/>
+                <w:color w:val="1F2937"/>
+                <w:sz w:val="15"/>
+              </w:rPr>
+              <w:t>Workplace authority and interpersonal conflict</w:t>
+            </w:r>
+          </w:p>
+        </w:tc>
+        <w:tc>
+          <w:tcPr>
+            <w:tcW w:type="dxa" w:w="1590"/>
+          </w:tcPr>
+          <w:p>
+            <w:r>
+              <w:rPr>
+                <w:rFonts w:ascii="Calibri" w:hAnsi="Calibri"/>
+                <w:b w:val="0"/>
+                <w:i w:val="0"/>
+                <w:color w:val="1F2937"/>
+                <w:sz w:val="15"/>
+              </w:rPr>
+              <w:t>0.74%</w:t>
+              <w:br/>
+              <w:t>(n=208)</w:t>
+            </w:r>
+          </w:p>
+        </w:tc>
+        <w:tc>
+          <w:tcPr>
+            <w:tcW w:type="dxa" w:w="1590"/>
+          </w:tcPr>
+          <w:p>
+            <w:r>
+              <w:rPr>
+                <w:rFonts w:ascii="Calibri" w:hAnsi="Calibri"/>
+                <w:b w:val="0"/>
+                <w:i w:val="0"/>
+                <w:color w:val="1F2937"/>
+                <w:sz w:val="15"/>
+              </w:rPr>
+              <w:t>1.17%</w:t>
+              <w:br/>
+              <w:t>(n=404)</w:t>
+            </w:r>
+          </w:p>
+        </w:tc>
+        <w:tc>
+          <w:tcPr>
+            <w:tcW w:type="dxa" w:w="1590"/>
+          </w:tcPr>
+          <w:p>
+            <w:r>
+              <w:rPr>
+                <w:rFonts w:ascii="Calibri" w:hAnsi="Calibri"/>
+                <w:b w:val="0"/>
+                <w:i w:val="0"/>
+                <w:color w:val="1F2937"/>
+                <w:sz w:val="15"/>
+              </w:rPr>
+              <w:t>1.69%</w:t>
+              <w:br/>
+              <w:t>(n=382)</w:t>
+            </w:r>
+          </w:p>
+        </w:tc>
+        <w:tc>
+          <w:tcPr>
+            <w:tcW w:type="dxa" w:w="1590"/>
+          </w:tcPr>
+          <w:p>
+            <w:r>
+              <w:rPr>
+                <w:rFonts w:ascii="Calibri" w:hAnsi="Calibri"/>
+                <w:b w:val="0"/>
+                <w:i w:val="0"/>
+                <w:color w:val="1F2937"/>
+                <w:sz w:val="15"/>
+              </w:rPr>
+              <w:t>2.06%</w:t>
+              <w:br/>
+              <w:t>(n=246)</w:t>
+            </w:r>
+          </w:p>
+        </w:tc>
+      </w:tr>
+      <w:tr>
+        <w:tc>
+          <w:tcPr>
+            <w:tcW w:type="dxa" w:w="3000"/>
+            <w:shd w:fill="FAFBFC"/>
+          </w:tcPr>
+          <w:p>
+            <w:r>
+              <w:rPr>
+                <w:rFonts w:ascii="Calibri" w:hAnsi="Calibri"/>
+                <w:b/>
+                <w:i w:val="0"/>
+                <w:color w:val="1F2937"/>
+                <w:sz w:val="15"/>
+              </w:rPr>
+              <w:t>Service work and tips</w:t>
+            </w:r>
+          </w:p>
+        </w:tc>
+        <w:tc>
+          <w:tcPr>
+            <w:tcW w:type="dxa" w:w="1590"/>
+            <w:shd w:fill="FAFBFC"/>
+          </w:tcPr>
+          <w:p>
+            <w:r>
+              <w:rPr>
+                <w:rFonts w:ascii="Calibri" w:hAnsi="Calibri"/>
+                <w:b w:val="0"/>
+                <w:i w:val="0"/>
+                <w:color w:val="1F2937"/>
+                <w:sz w:val="15"/>
+              </w:rPr>
+              <w:t>1.32%</w:t>
+              <w:br/>
+              <w:t>(n=374)</w:t>
+            </w:r>
+          </w:p>
+        </w:tc>
+        <w:tc>
+          <w:tcPr>
+            <w:tcW w:type="dxa" w:w="1590"/>
+            <w:shd w:fill="FAFBFC"/>
+          </w:tcPr>
+          <w:p>
+            <w:r>
+              <w:rPr>
+                <w:rFonts w:ascii="Calibri" w:hAnsi="Calibri"/>
+                <w:b w:val="0"/>
+                <w:i w:val="0"/>
+                <w:color w:val="1F2937"/>
+                <w:sz w:val="15"/>
+              </w:rPr>
+              <w:t>1.38%</w:t>
+              <w:br/>
+              <w:t>(n=476)</w:t>
+            </w:r>
+          </w:p>
+        </w:tc>
+        <w:tc>
+          <w:tcPr>
+            <w:tcW w:type="dxa" w:w="1590"/>
+            <w:shd w:fill="FAFBFC"/>
+          </w:tcPr>
+          <w:p>
+            <w:r>
+              <w:rPr>
+                <w:rFonts w:ascii="Calibri" w:hAnsi="Calibri"/>
+                <w:b w:val="0"/>
+                <w:i w:val="0"/>
+                <w:color w:val="1F2937"/>
+                <w:sz w:val="15"/>
+              </w:rPr>
+              <w:t>1.21%</w:t>
+              <w:br/>
+              <w:t>(n=274)</w:t>
+            </w:r>
+          </w:p>
+        </w:tc>
+        <w:tc>
+          <w:tcPr>
+            <w:tcW w:type="dxa" w:w="1590"/>
+            <w:shd w:fill="FAFBFC"/>
+          </w:tcPr>
+          <w:p>
+            <w:r>
+              <w:rPr>
+                <w:rFonts w:ascii="Calibri" w:hAnsi="Calibri"/>
+                <w:b w:val="0"/>
+                <w:i w:val="0"/>
+                <w:color w:val="1F2937"/>
+                <w:sz w:val="15"/>
+              </w:rPr>
+              <w:t>0.93%</w:t>
+              <w:br/>
+              <w:t>(n=111)</w:t>
+            </w:r>
+          </w:p>
+        </w:tc>
+      </w:tr>
+      <w:tr>
+        <w:tc>
+          <w:tcPr>
+            <w:tcW w:type="dxa" w:w="3000"/>
+          </w:tcPr>
+          <w:p>
+            <w:r>
+              <w:rPr>
+                <w:rFonts w:ascii="Calibri" w:hAnsi="Calibri"/>
+                <w:b/>
+                <w:i w:val="0"/>
+                <w:color w:val="1F2937"/>
+                <w:sz w:val="15"/>
+              </w:rPr>
+              <w:t>Collective worker power and rights</w:t>
+            </w:r>
+          </w:p>
+        </w:tc>
+        <w:tc>
+          <w:tcPr>
+            <w:tcW w:type="dxa" w:w="1590"/>
+          </w:tcPr>
+          <w:p>
+            <w:r>
+              <w:rPr>
+                <w:rFonts w:ascii="Calibri" w:hAnsi="Calibri"/>
+                <w:b w:val="0"/>
+                <w:i w:val="0"/>
+                <w:color w:val="1F2937"/>
+                <w:sz w:val="15"/>
+              </w:rPr>
+              <w:t>0.82%</w:t>
+              <w:br/>
+              <w:t>(n=231)</w:t>
+            </w:r>
+          </w:p>
+        </w:tc>
+        <w:tc>
+          <w:tcPr>
+            <w:tcW w:type="dxa" w:w="1590"/>
+          </w:tcPr>
+          <w:p>
+            <w:r>
+              <w:rPr>
+                <w:rFonts w:ascii="Calibri" w:hAnsi="Calibri"/>
+                <w:b w:val="0"/>
+                <w:i w:val="0"/>
+                <w:color w:val="1F2937"/>
+                <w:sz w:val="15"/>
+              </w:rPr>
+              <w:t>0.66%</w:t>
+              <w:br/>
+              <w:t>(n=226)</w:t>
+            </w:r>
+          </w:p>
+        </w:tc>
+        <w:tc>
+          <w:tcPr>
+            <w:tcW w:type="dxa" w:w="1590"/>
+          </w:tcPr>
+          <w:p>
+            <w:r>
+              <w:rPr>
+                <w:rFonts w:ascii="Calibri" w:hAnsi="Calibri"/>
+                <w:b w:val="0"/>
+                <w:i w:val="0"/>
+                <w:color w:val="1F2937"/>
+                <w:sz w:val="15"/>
+              </w:rPr>
+              <w:t>0.47%</w:t>
+              <w:br/>
+              <w:t>(n=107)</w:t>
+            </w:r>
+          </w:p>
+        </w:tc>
+        <w:tc>
+          <w:tcPr>
+            <w:tcW w:type="dxa" w:w="1590"/>
+          </w:tcPr>
+          <w:p>
+            <w:r>
+              <w:rPr>
+                <w:rFonts w:ascii="Calibri" w:hAnsi="Calibri"/>
+                <w:b w:val="0"/>
+                <w:i w:val="0"/>
+                <w:color w:val="1F2937"/>
+                <w:sz w:val="15"/>
+              </w:rPr>
+              <w:t>0.42%</w:t>
+              <w:br/>
+              <w:t>(n=50)</w:t>
+            </w:r>
+          </w:p>
+        </w:tc>
+      </w:tr>
+    </w:tbl>
+    <w:p>
+      <w:pPr>
+        <w:spacing w:after="0"/>
+      </w:pPr>
+      <w:r>
+        <w:rPr>
+          <w:rFonts w:ascii="Calibri" w:hAnsi="Calibri"/>
+          <w:b w:val="0"/>
+          <w:i/>
+          <w:color w:val="5D6B7A"/>
+          <w:sz w:val="16"/>
+        </w:rPr>
+        <w:t>Table 1. Counts and prevalence for every reviewed candidate theme across the four rolling windows. Values describe the documented 27-cluster map, not all management-related discussion.</w:t>
+      </w:r>
+    </w:p>
+    <w:p>
+      <w:r>
+        <w:br w:type="page"/>
+      </w:r>
+    </w:p>
+    <w:p>
+      <w:pPr>
+        <w:pStyle w:val="Heading1"/>
+      </w:pPr>
+      <w:r>
+        <w:rPr>
+          <w:rFonts w:ascii="Calibri" w:hAnsi="Calibri"/>
+          <w:b/>
+          <w:i w:val="0"/>
+          <w:color w:val="17365D"/>
+          <w:sz w:val="30"/>
+        </w:rPr>
+        <w:t>Reviewed theme hierarchy</w:t>
+      </w:r>
+    </w:p>
+    <w:p>
+      <w:pPr>
+        <w:jc w:val="center"/>
+      </w:pPr>
+      <w:r>
+        <w:drawing>
+          <wp:inline xmlns:a="http://schemas.openxmlformats.org/drawingml/2006/main" xmlns:pic="http://schemas.openxmlformats.org/drawingml/2006/picture">
+            <wp:extent cx="4617720" cy="5821225"/>
+            <wp:docPr id="5" name="Picture 5"/>
+            <wp:cNvGraphicFramePr>
+              <a:graphicFrameLocks noChangeAspect="1"/>
+            </wp:cNvGraphicFramePr>
+            <a:graphic>
+              <a:graphicData uri="http://schemas.openxmlformats.org/drawingml/2006/picture">
+                <pic:pic>
+                  <pic:nvPicPr>
+                    <pic:cNvPr id="0" name="reviewed_theme_hierarchy.png"/>
+                    <pic:cNvPicPr/>
+                  </pic:nvPicPr>
+                  <pic:blipFill>
+                    <a:blip r:embed="rId17"/>
+                    <a:stretch>
+                      <a:fillRect/>
+                    </a:stretch>
+                  </pic:blipFill>
+                  <pic:spPr>
+                    <a:xfrm>
+                      <a:off x="0" y="0"/>
+                      <a:ext cx="4617720" cy="5821225"/>
+                    </a:xfrm>
+                    <a:prstGeom prst="rect"/>
+                  </pic:spPr>
+                </pic:pic>
+              </a:graphicData>
+            </a:graphic>
+          </wp:inline>
+        </w:drawing>
+      </w:r>
+    </w:p>
+    <w:p>
+      <w:pPr>
+        <w:spacing w:after="0"/>
+      </w:pPr>
+      <w:r>
+        <w:rPr>
+          <w:rFonts w:ascii="Calibri" w:hAnsi="Calibri"/>
+          <w:b w:val="0"/>
+          <w:i/>
+          <w:color w:val="5D6B7A"/>
+          <w:sz w:val="16"/>
+        </w:rPr>
+        <w:t>Figure 5. The nine candidate themes, their included subthemes, and full-corpus cluster sizes. Node area scales with n; this documented map covers 18,506 posts, or 19.0% of the filtered corpus.</w:t>
+      </w:r>
+    </w:p>
+    <w:p>
+      <w:r>
+        <w:br w:type="page"/>
+      </w:r>
+    </w:p>
+    <w:p>
+      <w:pPr>
+        <w:pStyle w:val="Heading1"/>
+      </w:pPr>
+      <w:r>
+        <w:rPr>
+          <w:rFonts w:ascii="Calibri" w:hAnsi="Calibri"/>
+          <w:b/>
+          <w:i w:val="0"/>
+          <w:color w:val="17365D"/>
+          <w:sz w:val="30"/>
+        </w:rPr>
+        <w:t>Exploratory Y1 and Y4 comparison</w:t>
+      </w:r>
+    </w:p>
+    <w:p>
+      <w:pPr>
+        <w:spacing w:after="80"/>
+      </w:pPr>
+      <w:r>
+        <w:rPr>
+          <w:rFonts w:ascii="Calibri" w:hAnsi="Calibri"/>
+          <w:b w:val="0"/>
+          <w:i w:val="0"/>
+          <w:color w:val="1F2937"/>
+          <w:sz w:val="18"/>
+        </w:rPr>
+        <w:t>The comparison below contrasts the user-defined Great Resignation period, March 2021 through February 2022, with the most recent March 2024 through February 2025 window. It is a descriptive comparison of the reviewed theme map, not an estimate of the Great Resignation's effect.</w:t>
+      </w:r>
+    </w:p>
+    <w:p>
+      <w:pPr>
+        <w:jc w:val="center"/>
+      </w:pPr>
+      <w:r>
+        <w:drawing>
+          <wp:inline xmlns:a="http://schemas.openxmlformats.org/drawingml/2006/main" xmlns:pic="http://schemas.openxmlformats.org/drawingml/2006/picture">
+            <wp:extent cx="5760720" cy="3000375"/>
+            <wp:docPr id="6" name="Picture 6"/>
+            <wp:cNvGraphicFramePr>
+              <a:graphicFrameLocks noChangeAspect="1"/>
+            </wp:cNvGraphicFramePr>
+            <a:graphic>
+              <a:graphicData uri="http://schemas.openxmlformats.org/drawingml/2006/picture">
+                <pic:pic>
+                  <pic:nvPicPr>
+                    <pic:cNvPr id="0" name="candidate_theme_y1_y4_comparison.png"/>
+                    <pic:cNvPicPr/>
+                  </pic:nvPicPr>
+                  <pic:blipFill>
+                    <a:blip r:embed="rId18"/>
+                    <a:stretch>
+                      <a:fillRect/>
+                    </a:stretch>
+                  </pic:blipFill>
+                  <pic:spPr>
+                    <a:xfrm>
+                      <a:off x="0" y="0"/>
+                      <a:ext cx="5760720" cy="3000375"/>
+                    </a:xfrm>
+                    <a:prstGeom prst="rect"/>
+                  </pic:spPr>
+                </pic:pic>
+              </a:graphicData>
+            </a:graphic>
+          </wp:inline>
+        </w:drawing>
+      </w:r>
+    </w:p>
+    <w:p>
+      <w:pPr>
+        <w:spacing w:after="0"/>
+      </w:pPr>
+      <w:r>
+        <w:rPr>
+          <w:rFonts w:ascii="Calibri" w:hAnsi="Calibri"/>
+          <w:b w:val="0"/>
+          <w:i/>
+          <w:color w:val="5D6B7A"/>
+          <w:sz w:val="16"/>
+        </w:rPr>
+        <w:t>Figure 6. Candidate-theme prevalence in Y1 and Y4. The legend gives the all-filtered-post denominator for each window; Table 1 gives each theme numerator n; labels show descriptive percentage-point differences.</w:t>
+      </w:r>
+    </w:p>
+    <w:p>
+      <w:r>
+        <w:br w:type="page"/>
+      </w:r>
+    </w:p>
+    <w:p>
+      <w:pPr>
+        <w:pStyle w:val="Heading1"/>
+      </w:pPr>
+      <w:r>
+        <w:rPr>
+          <w:rFonts w:ascii="Calibri" w:hAnsi="Calibri"/>
+          <w:b/>
+          <w:i w:val="0"/>
+          <w:color w:val="17365D"/>
+          <w:sz w:val="30"/>
+        </w:rPr>
+        <w:t>Whole-corpus polarity check</w:t>
+      </w:r>
+    </w:p>
+    <w:tbl>
+      <w:tblPr>
+        <w:tblW w:type="dxa" w:w="9360"/>
+        <w:jc w:val="left"/>
+        <w:tblLayout w:type="fixed"/>
+        <w:tblLook w:firstColumn="1" w:firstRow="1" w:lastColumn="0" w:lastRow="0" w:noHBand="0" w:noVBand="1" w:val="04A0"/>
+      </w:tblPr>
+      <w:tblGrid>
+        <w:gridCol w:w="4680"/>
+        <w:gridCol w:w="4680"/>
+      </w:tblGrid>
+      <w:tr>
+        <w:tc>
+          <w:tcPr>
+            <w:tcW w:type="dxa" w:w="4680"/>
+            <w:tcMar>
+              <w:top w:w="80" w:type="dxa"/>
+              <w:start w:w="120" w:type="dxa"/>
+              <w:bottom w:w="80" w:type="dxa"/>
+              <w:end w:w="120" w:type="dxa"/>
+            </w:tcMar>
+            <w:vAlign w:val="center"/>
+            <w:shd w:fill="FAFBFC"/>
+          </w:tcPr>
+          <w:p>
+            <w:r>
+              <w:rPr>
+                <w:rFonts w:ascii="Calibri" w:hAnsi="Calibri"/>
+                <w:b/>
+                <w:i w:val="0"/>
+                <w:color w:val="17365D"/>
+                <w:sz w:val="19"/>
+              </w:rPr>
+              <w:t>Context-aware model</w:t>
+            </w:r>
+          </w:p>
+          <w:p>
+            <w:r>
+              <w:rPr>
+                <w:rFonts w:ascii="Calibri" w:hAnsi="Calibri"/>
+                <w:b w:val="0"/>
+                <w:i w:val="0"/>
+                <w:color w:val="1F2937"/>
+                <w:sz w:val="18"/>
+              </w:rPr>
+              <w:t>A fixed social-media RoBERTa classifier estimated whole-post negative, neutral, and positive polarity across every retained post. This is a contextual transformer-based estimate, rather than a lexicon method such as VADER.</w:t>
+            </w:r>
+          </w:p>
+        </w:tc>
+        <w:tc>
+          <w:tcPr>
+            <w:tcW w:type="dxa" w:w="4680"/>
+            <w:tcMar>
+              <w:top w:w="80" w:type="dxa"/>
+              <w:start w:w="120" w:type="dxa"/>
+              <w:bottom w:w="80" w:type="dxa"/>
+              <w:end w:w="120" w:type="dxa"/>
+            </w:tcMar>
+            <w:vAlign w:val="center"/>
+            <w:shd w:fill="FAFBFC"/>
+          </w:tcPr>
+          <w:p>
+            <w:r>
+              <w:rPr>
+                <w:rFonts w:ascii="Calibri" w:hAnsi="Calibri"/>
+                <w:b/>
+                <w:i w:val="0"/>
+                <w:color w:val="17365D"/>
+                <w:sz w:val="19"/>
+              </w:rPr>
+              <w:t>Interpretive boundary</w:t>
+            </w:r>
+          </w:p>
+          <w:p>
+            <w:r>
+              <w:rPr>
+                <w:rFonts w:ascii="Calibri" w:hAnsi="Calibri"/>
+                <w:b w:val="0"/>
+                <w:i w:val="0"/>
+                <w:color w:val="1F2937"/>
+                <w:sz w:val="18"/>
+              </w:rPr>
+              <w:t>The check is model-based, not human-validated or targeted specifically to management. It tests whether the intentionally problem-oriented sample is predominantly negative under this classifier; it does not estimate average employee sentiment.</w:t>
+            </w:r>
+          </w:p>
+        </w:tc>
+      </w:tr>
+    </w:tbl>
+    <w:p>
+      <w:pPr>
+        <w:spacing w:after="80"/>
+      </w:pPr>
+      <w:r>
+        <w:rPr>
+          <w:rFonts w:ascii="Calibri" w:hAnsi="Calibri"/>
+          <w:b w:val="0"/>
+          <w:i w:val="0"/>
+          <w:color w:val="1F2937"/>
+          <w:sz w:val="18"/>
+        </w:rPr>
+        <w:t>Across 97,254 scored posts, the model's hard labels were 62.9% negative, 30.4% neutral, and 6.7% positive. Mean posterior probabilities were 54.1%, 35.7%, and 10.2%, respectively. Mean maximum class probability was 70.0%; 16.4% of posts reached the 512-token limit.</w:t>
+      </w:r>
+    </w:p>
+    <w:p>
+      <w:pPr>
+        <w:spacing w:after="80"/>
+      </w:pPr>
+      <w:r>
+        <w:rPr>
+          <w:rFonts w:ascii="Calibri" w:hAnsi="Calibri"/>
+          <w:b w:val="0"/>
+          <w:i w:val="0"/>
+          <w:color w:val="1F2937"/>
+          <w:sz w:val="18"/>
+        </w:rPr>
+        <w:t>The hard negative-label share was 59.8% (n=16,923 of 28,276) in Y1, the Great Resignation window, and 67.7% (n=8,096 of 11,960) in Y4. This descriptive increase is not a causal estimate and does not establish a change in employee sentiment.</w:t>
+      </w:r>
+    </w:p>
+    <w:p>
+      <w:pPr>
+        <w:jc w:val="center"/>
+      </w:pPr>
+      <w:r>
+        <w:drawing>
+          <wp:inline xmlns:a="http://schemas.openxmlformats.org/drawingml/2006/main" xmlns:pic="http://schemas.openxmlformats.org/drawingml/2006/picture">
+            <wp:extent cx="5760720" cy="2406190"/>
+            <wp:docPr id="7" name="Picture 7"/>
+            <wp:cNvGraphicFramePr>
+              <a:graphicFrameLocks noChangeAspect="1"/>
+            </wp:cNvGraphicFramePr>
+            <a:graphic>
+              <a:graphicData uri="http://schemas.openxmlformats.org/drawingml/2006/picture">
+                <pic:pic>
+                  <pic:nvPicPr>
+                    <pic:cNvPr id="0" name="sentiment_by_rolling_window.png"/>
+                    <pic:cNvPicPr/>
+                  </pic:nvPicPr>
+                  <pic:blipFill>
+                    <a:blip r:embed="rId19"/>
+                    <a:stretch>
+                      <a:fillRect/>
+                    </a:stretch>
+                  </pic:blipFill>
+                  <pic:spPr>
+                    <a:xfrm>
+                      <a:off x="0" y="0"/>
+                      <a:ext cx="5760720" cy="2406190"/>
+                    </a:xfrm>
+                    <a:prstGeom prst="rect"/>
+                  </pic:spPr>
+                </pic:pic>
+              </a:graphicData>
+            </a:graphic>
+          </wp:inline>
+        </w:drawing>
+      </w:r>
+    </w:p>
+    <w:p>
+      <w:pPr>
+        <w:spacing w:after="0"/>
+      </w:pPr>
+      <w:r>
+        <w:rPr>
+          <w:rFonts w:ascii="Calibri" w:hAnsi="Calibri"/>
+          <w:b w:val="0"/>
+          <w:i/>
+          <w:color w:val="5D6B7A"/>
+          <w:sz w:val="16"/>
+        </w:rPr>
+        <w:t>Figure 7. Whole-corpus RoBERTa polarity estimates across the four rolling windows. The hard-label and mean-posterior views are shown together because model uncertainty is material to interpretation.</w:t>
+      </w:r>
+    </w:p>
+    <w:p>
+      <w:r>
+        <w:br w:type="page"/>
+      </w:r>
+    </w:p>
+    <w:p>
+      <w:pPr>
+        <w:pStyle w:val="Heading1"/>
+      </w:pPr>
+      <w:r>
+        <w:rPr>
+          <w:rFonts w:ascii="Calibri" w:hAnsi="Calibri"/>
+          <w:b/>
+          <w:i w:val="0"/>
+          <w:color w:val="17365D"/>
+          <w:sz w:val="30"/>
+        </w:rPr>
+        <w:t>Polarity within reviewed themes</w:t>
+      </w:r>
+    </w:p>
+    <w:p>
+      <w:pPr>
+        <w:spacing w:after="80"/>
+      </w:pPr>
+      <w:r>
+        <w:rPr>
+          <w:rFonts w:ascii="Calibri" w:hAnsi="Calibri"/>
+          <w:b w:val="0"/>
+          <w:i w:val="0"/>
+          <w:color w:val="1F2937"/>
+          <w:sz w:val="18"/>
+        </w:rPr>
+        <w:t>The figure below joins the fixed post-level RoBERTa estimates to the existing reviewed BERTopic map. It does not refit either model. Values describe whole-post negative-polarity probability among posts assigned to each theme, while the prevalence figures above retain all filtered posts as their denominator.</w:t>
+      </w:r>
+    </w:p>
+    <w:p>
+      <w:pPr>
+        <w:jc w:val="center"/>
+      </w:pPr>
+      <w:r>
+        <w:drawing>
+          <wp:inline xmlns:a="http://schemas.openxmlformats.org/drawingml/2006/main" xmlns:pic="http://schemas.openxmlformats.org/drawingml/2006/picture">
+            <wp:extent cx="5760720" cy="3429608"/>
+            <wp:docPr id="8" name="Picture 8"/>
+            <wp:cNvGraphicFramePr>
+              <a:graphicFrameLocks noChangeAspect="1"/>
+            </wp:cNvGraphicFramePr>
+            <a:graphic>
+              <a:graphicData uri="http://schemas.openxmlformats.org/drawingml/2006/picture">
+                <pic:pic>
+                  <pic:nvPicPr>
+                    <pic:cNvPr id="0" name="candidate_theme_negative_probability_by_month.png"/>
+                    <pic:cNvPicPr/>
+                  </pic:nvPicPr>
+                  <pic:blipFill>
+                    <a:blip r:embed="rId20"/>
+                    <a:stretch>
+                      <a:fillRect/>
+                    </a:stretch>
+                  </pic:blipFill>
+                  <pic:spPr>
+                    <a:xfrm>
+                      <a:off x="0" y="0"/>
+                      <a:ext cx="5760720" cy="3429608"/>
+                    </a:xfrm>
+                    <a:prstGeom prst="rect"/>
+                  </pic:spPr>
+                </pic:pic>
+              </a:graphicData>
+            </a:graphic>
+          </wp:inline>
+        </w:drawing>
+      </w:r>
+    </w:p>
+    <w:p>
+      <w:pPr>
+        <w:spacing w:after="0"/>
+      </w:pPr>
+      <w:r>
+        <w:rPr>
+          <w:rFonts w:ascii="Calibri" w:hAnsi="Calibri"/>
+          <w:b w:val="0"/>
+          <w:i/>
+          <w:color w:val="5D6B7A"/>
+          <w:sz w:val="16"/>
+        </w:rPr>
+        <w:t>Figure 8. Three-month rolling mean of modeled negative-polarity probability within the nine reviewed themes. The theme map covers 18,506 posts, or 19.0% of the filtered corpus.</w:t>
+      </w:r>
+    </w:p>
+    <w:p>
+      <w:r>
+        <w:br w:type="page"/>
       </w:r>
     </w:p>
     <w:p>
@@ -1359,8 +2996,8 @@
       <w:r>
         <w:drawing>
           <wp:inline xmlns:a="http://schemas.openxmlformats.org/drawingml/2006/main" xmlns:pic="http://schemas.openxmlformats.org/drawingml/2006/picture">
-            <wp:extent cx="5303520" cy="3128606"/>
-            <wp:docPr id="4" name="Picture 4"/>
+            <wp:extent cx="5303520" cy="2667601"/>
+            <wp:docPr id="9" name="Picture 9"/>
             <wp:cNvGraphicFramePr>
               <a:graphicFrameLocks noChangeAspect="1"/>
             </wp:cNvGraphicFramePr>
@@ -1372,7 +3009,7 @@
                     <pic:cNvPicPr/>
                   </pic:nvPicPr>
                   <pic:blipFill>
-                    <a:blip r:embed="rId16"/>
+                    <a:blip r:embed="rId21"/>
                     <a:stretch>
                       <a:fillRect/>
                     </a:stretch>
@@ -1380,7 +3017,7 @@
                   <pic:spPr>
                     <a:xfrm>
                       <a:off x="0" y="0"/>
-                      <a:ext cx="5303520" cy="3128606"/>
+                      <a:ext cx="5303520" cy="2667601"/>
                     </a:xfrm>
                     <a:prstGeom prst="rect"/>
                   </pic:spPr>
@@ -1403,7 +3040,7 @@
           <w:color w:val="5D6B7A"/>
           <w:sz w:val="16"/>
         </w:rPr>
-        <w:t>Figure 4. Assignment coverage varied from 33.1% to 44.0% by month. Outliers are a coverage limitation, not a substantive category.</w:t>
+        <w:t>Figure 9. Assignment coverage varied from 33.1% to 44.0% by month. Outliers are a coverage limitation, not a substantive category.</w:t>
       </w:r>
     </w:p>
     <w:p>
@@ -1750,7 +3387,7 @@
                 <w:color w:val="1F2937"/>
                 <w:sz w:val="18"/>
               </w:rPr>
-              <w:t>These patterns describe changes in the composition of management-related public discussion. They identify domains for follow-up with representative employee data; they do not establish employee sentiment, turnover drivers, or policy effects.</w:t>
+              <w:t>The topic patterns describe changes in the composition of management-related public discussion and identify domains for follow-up with representative employee data. They do not establish employee sentiment, turnover drivers, or policy effects.</w:t>
             </w:r>
           </w:p>
         </w:tc>
@@ -1816,7 +3453,7 @@
                 <w:color w:val="1F2937"/>
                 <w:sz w:val="18"/>
               </w:rPr>
-              <w:t>Results, figures, a theme codebook, coverage diagnostics, seed stability, text-mode sensitivity, and a defined interpretive scope are ready for the manuscript.</w:t>
+              <w:t>Results, figures, a theme codebook, coverage diagnostics, seed stability, text-mode sensitivity, whole-corpus polarity estimates, and a defined interpretive scope are ready for the manuscript.</w:t>
             </w:r>
           </w:p>
         </w:tc>
@@ -1841,7 +3478,7 @@
                 <w:color w:val="17365D"/>
                 <w:sz w:val="19"/>
               </w:rPr>
-              <w:t>Out-of-scope extensions</w:t>
+              <w:t>Future validation</w:t>
             </w:r>
           </w:p>
           <w:p>
@@ -1853,7 +3490,7 @@
                 <w:color w:val="1F2937"/>
                 <w:sz w:val="18"/>
               </w:rPr>
-              <w:t>A broader cluster review, an independent encoder check when compute permits, or a future sentiment study with a validated human reference set can be considered separately. None are required for this paper.</w:t>
+              <w:t>A future target-specific sentiment study with a validated human reference set and an independent human-coding audit of a stratified topic subsample would test construct validity beyond the current exploratory evidence.</w:t>
             </w:r>
           </w:p>
         </w:tc>
@@ -1919,7 +3556,7 @@
                 <w:color w:val="1F2937"/>
                 <w:sz w:val="18"/>
               </w:rPr>
-              <w:t>The revised manuscript includes the title and abstract; current-study framing and research question; Methods, Results, Discussion, implications, limitations; figures; and primary BERTopic references.</w:t>
+              <w:t>The revised manuscript includes the title and abstract; current-study framing and research question; Methods, Results, Discussion, implications, limitations; figures; primary BERTopic references; and the collection-to-filtering count of 577,190 retrieved archive records followed by 97,254 analyzed posts.</w:t>
             </w:r>
           </w:p>
         </w:tc>
@@ -1956,7 +3593,7 @@
                 <w:color w:val="1F2937"/>
                 <w:sz w:val="18"/>
               </w:rPr>
-              <w:t>Correct the denominator language, add the archive-source statement and sampling-frame framing note, and harmonize retained Background language with the paper's exploratory, descriptive scope. Historical theory and prior turnover findings should remain context, not claims tested by this study.</w:t>
+              <w:t>Add the completed polarity method and its bounded exploratory results to the manuscript, then harmonize retained Background language with the paper's descriptive scope. Historical theory and prior turnover findings should remain context, not claims tested by this study.</w:t>
             </w:r>
           </w:p>
         </w:tc>
@@ -2092,7 +3729,7 @@
           <w:color w:val="1F2937"/>
           <w:sz w:val="18"/>
         </w:rPr>
-        <w:t>Draft in this order: method and sampling frame; coverage and descriptive results; limitations; then an exploratory discussion. Use the documented theme map and avoid causal, full-conversation, or sentiment claims.</w:t>
+        <w:t>Draft in this order: collection and sampling frame; coverage, theme-prevalence, and model-based polarity results; limitations; then an exploratory discussion. Use the documented theme map and avoid causal, full-conversation, or human-validated sentiment claims.</w:t>
       </w:r>
     </w:p>
     <w:p>
@@ -2109,7 +3746,7 @@
         </w:rPr>
         <w:t xml:space="preserve">Reproducible code and shareable evidence: </w:t>
       </w:r>
-      <w:hyperlink r:id="rId17">
+      <w:hyperlink r:id="rId22">
         <w:r>
           <w:rPr>
             <w:color w:val="2E74B5"/>
@@ -2146,7 +3783,7 @@
           <w:color w:val="17365D"/>
           <w:sz w:val="18"/>
         </w:rPr>
-        <w:t>Current status: the analysis outputs are complete. The manuscript needs a focused wording pass before circulation as a descriptive, exploratory topic-prevalence study.</w:t>
+        <w:t>Current status: the topic-modeling and full-corpus polarity analyses are complete. The manuscript is revised as a descriptive, exploratory topic-prevalence study and needs the completed polarity method and results incorporated before circulation.</w:t>
       </w:r>
     </w:p>
     <w:p>
@@ -2176,7 +3813,7 @@
           <w:color w:val="1F2937"/>
           <w:sz w:val="18"/>
         </w:rPr>
-        <w:t>The table below makes the review trail visible. It lists all 30 largest clusters examined for the candidate-theme map, their representative terms, the assigned candidate theme and subtheme, and the inclusion decision.</w:t>
+        <w:t>The table below makes the review trail visible. It lists all 30 largest clusters examined for the candidate-theme map, their full-corpus size (n), representative terms, assigned candidate theme and subtheme, and inclusion decision.</w:t>
       </w:r>
     </w:p>
     <w:p>
@@ -2203,9 +3840,10 @@
       </w:tblPr>
       <w:tblGrid>
         <w:gridCol w:w="620"/>
-        <w:gridCol w:w="2200"/>
-        <w:gridCol w:w="4800"/>
-        <w:gridCol w:w="1740"/>
+        <w:gridCol w:w="620"/>
+        <w:gridCol w:w="2050"/>
+        <w:gridCol w:w="4500"/>
+        <w:gridCol w:w="1570"/>
       </w:tblGrid>
       <w:tr>
         <w:tc>
@@ -2235,7 +3873,32 @@
         </w:tc>
         <w:tc>
           <w:tcPr>
-            <w:tcW w:type="dxa" w:w="2200"/>
+            <w:tcW w:type="dxa" w:w="620"/>
+            <w:tcMar>
+              <w:top w:w="80" w:type="dxa"/>
+              <w:start w:w="120" w:type="dxa"/>
+              <w:bottom w:w="80" w:type="dxa"/>
+              <w:end w:w="120" w:type="dxa"/>
+            </w:tcMar>
+            <w:vAlign w:val="center"/>
+            <w:shd w:fill="E8EEF5"/>
+          </w:tcPr>
+          <w:p>
+            <w:r>
+              <w:rPr>
+                <w:rFonts w:ascii="Calibri" w:hAnsi="Calibri"/>
+                <w:b/>
+                <w:i w:val="0"/>
+                <w:color w:val="17365D"/>
+                <w:sz w:val="16"/>
+              </w:rPr>
+              <w:t>n</w:t>
+            </w:r>
+          </w:p>
+        </w:tc>
+        <w:tc>
+          <w:tcPr>
+            <w:tcW w:type="dxa" w:w="2050"/>
             <w:tcMar>
               <w:top w:w="80" w:type="dxa"/>
               <w:start w:w="120" w:type="dxa"/>
@@ -2260,7 +3923,7 @@
         </w:tc>
         <w:tc>
           <w:tcPr>
-            <w:tcW w:type="dxa" w:w="4800"/>
+            <w:tcW w:type="dxa" w:w="4500"/>
             <w:tcMar>
               <w:top w:w="80" w:type="dxa"/>
               <w:start w:w="120" w:type="dxa"/>
@@ -2285,7 +3948,7 @@
         </w:tc>
         <w:tc>
           <w:tcPr>
-            <w:tcW w:type="dxa" w:w="1740"/>
+            <w:tcW w:type="dxa" w:w="1570"/>
             <w:tcMar>
               <w:top w:w="80" w:type="dxa"/>
               <w:start w:w="120" w:type="dxa"/>
@@ -2329,7 +3992,24 @@
         </w:tc>
         <w:tc>
           <w:tcPr>
-            <w:tcW w:type="dxa" w:w="2200"/>
+            <w:tcW w:type="dxa" w:w="620"/>
+          </w:tcPr>
+          <w:p>
+            <w:r>
+              <w:rPr>
+                <w:rFonts w:ascii="Calibri" w:hAnsi="Calibri"/>
+                <w:b/>
+                <w:i w:val="0"/>
+                <w:color w:val="1F2937"/>
+                <w:sz w:val="15"/>
+              </w:rPr>
+              <w:t>2,170</w:t>
+            </w:r>
+          </w:p>
+        </w:tc>
+        <w:tc>
+          <w:tcPr>
+            <w:tcW w:type="dxa" w:w="2050"/>
           </w:tcPr>
           <w:p>
             <w:r>
@@ -2346,7 +4026,8 @@
         </w:tc>
         <w:tc>
           <w:tcPr>
-            <w:tcW w:type="dxa" w:w="4800"/>
+            <w:tcW w:type="dxa" w:w="4500"/>
+            <w:shd w:fill="E2F0D9"/>
           </w:tcPr>
           <w:p>
             <w:r>
@@ -2365,8 +4046,7 @@
         </w:tc>
         <w:tc>
           <w:tcPr>
-            <w:tcW w:type="dxa" w:w="1740"/>
-            <w:shd w:fill="E2F0D9"/>
+            <w:tcW w:type="dxa" w:w="1570"/>
           </w:tcPr>
           <w:p>
             <w:r>
@@ -2405,7 +4085,25 @@
         </w:tc>
         <w:tc>
           <w:tcPr>
-            <w:tcW w:type="dxa" w:w="2200"/>
+            <w:tcW w:type="dxa" w:w="620"/>
+            <w:shd w:fill="FAFBFC"/>
+          </w:tcPr>
+          <w:p>
+            <w:r>
+              <w:rPr>
+                <w:rFonts w:ascii="Calibri" w:hAnsi="Calibri"/>
+                <w:b/>
+                <w:i w:val="0"/>
+                <w:color w:val="1F2937"/>
+                <w:sz w:val="15"/>
+              </w:rPr>
+              <w:t>2,078</w:t>
+            </w:r>
+          </w:p>
+        </w:tc>
+        <w:tc>
+          <w:tcPr>
+            <w:tcW w:type="dxa" w:w="2050"/>
             <w:shd w:fill="FAFBFC"/>
           </w:tcPr>
           <w:p>
@@ -2423,8 +4121,8 @@
         </w:tc>
         <w:tc>
           <w:tcPr>
-            <w:tcW w:type="dxa" w:w="4800"/>
-            <w:shd w:fill="FAFBFC"/>
+            <w:tcW w:type="dxa" w:w="4500"/>
+            <w:shd w:fill="F2F4F7"/>
           </w:tcPr>
           <w:p>
             <w:r>
@@ -2443,8 +4141,8 @@
         </w:tc>
         <w:tc>
           <w:tcPr>
-            <w:tcW w:type="dxa" w:w="1740"/>
-            <w:shd w:fill="F2F4F7"/>
+            <w:tcW w:type="dxa" w:w="1570"/>
+            <w:shd w:fill="FAFBFC"/>
           </w:tcPr>
           <w:p>
             <w:r>
@@ -2482,7 +4180,24 @@
         </w:tc>
         <w:tc>
           <w:tcPr>
-            <w:tcW w:type="dxa" w:w="2200"/>
+            <w:tcW w:type="dxa" w:w="620"/>
+          </w:tcPr>
+          <w:p>
+            <w:r>
+              <w:rPr>
+                <w:rFonts w:ascii="Calibri" w:hAnsi="Calibri"/>
+                <w:b/>
+                <w:i w:val="0"/>
+                <w:color w:val="1F2937"/>
+                <w:sz w:val="15"/>
+              </w:rPr>
+              <w:t>1,737</w:t>
+            </w:r>
+          </w:p>
+        </w:tc>
+        <w:tc>
+          <w:tcPr>
+            <w:tcW w:type="dxa" w:w="2050"/>
           </w:tcPr>
           <w:p>
             <w:r>
@@ -2499,7 +4214,8 @@
         </w:tc>
         <w:tc>
           <w:tcPr>
-            <w:tcW w:type="dxa" w:w="4800"/>
+            <w:tcW w:type="dxa" w:w="4500"/>
+            <w:shd w:fill="E2F0D9"/>
           </w:tcPr>
           <w:p>
             <w:r>
@@ -2518,8 +4234,7 @@
         </w:tc>
         <w:tc>
           <w:tcPr>
-            <w:tcW w:type="dxa" w:w="1740"/>
-            <w:shd w:fill="E2F0D9"/>
+            <w:tcW w:type="dxa" w:w="1570"/>
           </w:tcPr>
           <w:p>
             <w:r>
@@ -2558,7 +4273,25 @@
         </w:tc>
         <w:tc>
           <w:tcPr>
-            <w:tcW w:type="dxa" w:w="2200"/>
+            <w:tcW w:type="dxa" w:w="620"/>
+            <w:shd w:fill="FAFBFC"/>
+          </w:tcPr>
+          <w:p>
+            <w:r>
+              <w:rPr>
+                <w:rFonts w:ascii="Calibri" w:hAnsi="Calibri"/>
+                <w:b/>
+                <w:i w:val="0"/>
+                <w:color w:val="1F2937"/>
+                <w:sz w:val="15"/>
+              </w:rPr>
+              <w:t>1,477</w:t>
+            </w:r>
+          </w:p>
+        </w:tc>
+        <w:tc>
+          <w:tcPr>
+            <w:tcW w:type="dxa" w:w="2050"/>
             <w:shd w:fill="FAFBFC"/>
           </w:tcPr>
           <w:p>
@@ -2576,8 +4309,8 @@
         </w:tc>
         <w:tc>
           <w:tcPr>
-            <w:tcW w:type="dxa" w:w="4800"/>
-            <w:shd w:fill="FAFBFC"/>
+            <w:tcW w:type="dxa" w:w="4500"/>
+            <w:shd w:fill="F2F4F7"/>
           </w:tcPr>
           <w:p>
             <w:r>
@@ -2596,8 +4329,8 @@
         </w:tc>
         <w:tc>
           <w:tcPr>
-            <w:tcW w:type="dxa" w:w="1740"/>
-            <w:shd w:fill="F2F4F7"/>
+            <w:tcW w:type="dxa" w:w="1570"/>
+            <w:shd w:fill="FAFBFC"/>
           </w:tcPr>
           <w:p>
             <w:r>
@@ -2635,7 +4368,24 @@
         </w:tc>
         <w:tc>
           <w:tcPr>
-            <w:tcW w:type="dxa" w:w="2200"/>
+            <w:tcW w:type="dxa" w:w="620"/>
+          </w:tcPr>
+          <w:p>
+            <w:r>
+              <w:rPr>
+                <w:rFonts w:ascii="Calibri" w:hAnsi="Calibri"/>
+                <w:b/>
+                <w:i w:val="0"/>
+                <w:color w:val="1F2937"/>
+                <w:sz w:val="15"/>
+              </w:rPr>
+              <w:t>1,329</w:t>
+            </w:r>
+          </w:p>
+        </w:tc>
+        <w:tc>
+          <w:tcPr>
+            <w:tcW w:type="dxa" w:w="2050"/>
           </w:tcPr>
           <w:p>
             <w:r>
@@ -2652,7 +4402,8 @@
         </w:tc>
         <w:tc>
           <w:tcPr>
-            <w:tcW w:type="dxa" w:w="4800"/>
+            <w:tcW w:type="dxa" w:w="4500"/>
+            <w:shd w:fill="E2F0D9"/>
           </w:tcPr>
           <w:p>
             <w:r>
@@ -2671,8 +4422,7 @@
         </w:tc>
         <w:tc>
           <w:tcPr>
-            <w:tcW w:type="dxa" w:w="1740"/>
-            <w:shd w:fill="E2F0D9"/>
+            <w:tcW w:type="dxa" w:w="1570"/>
           </w:tcPr>
           <w:p>
             <w:r>
@@ -2711,7 +4461,25 @@
         </w:tc>
         <w:tc>
           <w:tcPr>
-            <w:tcW w:type="dxa" w:w="2200"/>
+            <w:tcW w:type="dxa" w:w="620"/>
+            <w:shd w:fill="FAFBFC"/>
+          </w:tcPr>
+          <w:p>
+            <w:r>
+              <w:rPr>
+                <w:rFonts w:ascii="Calibri" w:hAnsi="Calibri"/>
+                <w:b/>
+                <w:i w:val="0"/>
+                <w:color w:val="1F2937"/>
+                <w:sz w:val="15"/>
+              </w:rPr>
+              <w:t>1,130</w:t>
+            </w:r>
+          </w:p>
+        </w:tc>
+        <w:tc>
+          <w:tcPr>
+            <w:tcW w:type="dxa" w:w="2050"/>
             <w:shd w:fill="FAFBFC"/>
           </w:tcPr>
           <w:p>
@@ -2729,8 +4497,8 @@
         </w:tc>
         <w:tc>
           <w:tcPr>
-            <w:tcW w:type="dxa" w:w="4800"/>
-            <w:shd w:fill="FAFBFC"/>
+            <w:tcW w:type="dxa" w:w="4500"/>
+            <w:shd w:fill="E2F0D9"/>
           </w:tcPr>
           <w:p>
             <w:r>
@@ -2749,8 +4517,8 @@
         </w:tc>
         <w:tc>
           <w:tcPr>
-            <w:tcW w:type="dxa" w:w="1740"/>
-            <w:shd w:fill="E2F0D9"/>
+            <w:tcW w:type="dxa" w:w="1570"/>
+            <w:shd w:fill="FAFBFC"/>
           </w:tcPr>
           <w:p>
             <w:r>
@@ -2788,7 +4556,24 @@
         </w:tc>
         <w:tc>
           <w:tcPr>
-            <w:tcW w:type="dxa" w:w="2200"/>
+            <w:tcW w:type="dxa" w:w="620"/>
+          </w:tcPr>
+          <w:p>
+            <w:r>
+              <w:rPr>
+                <w:rFonts w:ascii="Calibri" w:hAnsi="Calibri"/>
+                <w:b/>
+                <w:i w:val="0"/>
+                <w:color w:val="1F2937"/>
+                <w:sz w:val="15"/>
+              </w:rPr>
+              <w:t>963</w:t>
+            </w:r>
+          </w:p>
+        </w:tc>
+        <w:tc>
+          <w:tcPr>
+            <w:tcW w:type="dxa" w:w="2050"/>
           </w:tcPr>
           <w:p>
             <w:r>
@@ -2805,7 +4590,8 @@
         </w:tc>
         <w:tc>
           <w:tcPr>
-            <w:tcW w:type="dxa" w:w="4800"/>
+            <w:tcW w:type="dxa" w:w="4500"/>
+            <w:shd w:fill="E2F0D9"/>
           </w:tcPr>
           <w:p>
             <w:r>
@@ -2824,8 +4610,7 @@
         </w:tc>
         <w:tc>
           <w:tcPr>
-            <w:tcW w:type="dxa" w:w="1740"/>
-            <w:shd w:fill="E2F0D9"/>
+            <w:tcW w:type="dxa" w:w="1570"/>
           </w:tcPr>
           <w:p>
             <w:r>
@@ -2864,7 +4649,25 @@
         </w:tc>
         <w:tc>
           <w:tcPr>
-            <w:tcW w:type="dxa" w:w="2200"/>
+            <w:tcW w:type="dxa" w:w="620"/>
+            <w:shd w:fill="FAFBFC"/>
+          </w:tcPr>
+          <w:p>
+            <w:r>
+              <w:rPr>
+                <w:rFonts w:ascii="Calibri" w:hAnsi="Calibri"/>
+                <w:b/>
+                <w:i w:val="0"/>
+                <w:color w:val="1F2937"/>
+                <w:sz w:val="15"/>
+              </w:rPr>
+              <w:t>767</w:t>
+            </w:r>
+          </w:p>
+        </w:tc>
+        <w:tc>
+          <w:tcPr>
+            <w:tcW w:type="dxa" w:w="2050"/>
             <w:shd w:fill="FAFBFC"/>
           </w:tcPr>
           <w:p>
@@ -2882,8 +4685,8 @@
         </w:tc>
         <w:tc>
           <w:tcPr>
-            <w:tcW w:type="dxa" w:w="4800"/>
-            <w:shd w:fill="FAFBFC"/>
+            <w:tcW w:type="dxa" w:w="4500"/>
+            <w:shd w:fill="E2F0D9"/>
           </w:tcPr>
           <w:p>
             <w:r>
@@ -2902,8 +4705,8 @@
         </w:tc>
         <w:tc>
           <w:tcPr>
-            <w:tcW w:type="dxa" w:w="1740"/>
-            <w:shd w:fill="E2F0D9"/>
+            <w:tcW w:type="dxa" w:w="1570"/>
+            <w:shd w:fill="FAFBFC"/>
           </w:tcPr>
           <w:p>
             <w:r>
@@ -2941,7 +4744,24 @@
         </w:tc>
         <w:tc>
           <w:tcPr>
-            <w:tcW w:type="dxa" w:w="2200"/>
+            <w:tcW w:type="dxa" w:w="620"/>
+          </w:tcPr>
+          <w:p>
+            <w:r>
+              <w:rPr>
+                <w:rFonts w:ascii="Calibri" w:hAnsi="Calibri"/>
+                <w:b/>
+                <w:i w:val="0"/>
+                <w:color w:val="1F2937"/>
+                <w:sz w:val="15"/>
+              </w:rPr>
+              <w:t>689</w:t>
+            </w:r>
+          </w:p>
+        </w:tc>
+        <w:tc>
+          <w:tcPr>
+            <w:tcW w:type="dxa" w:w="2050"/>
           </w:tcPr>
           <w:p>
             <w:r>
@@ -2958,7 +4778,8 @@
         </w:tc>
         <w:tc>
           <w:tcPr>
-            <w:tcW w:type="dxa" w:w="4800"/>
+            <w:tcW w:type="dxa" w:w="4500"/>
+            <w:shd w:fill="E2F0D9"/>
           </w:tcPr>
           <w:p>
             <w:r>
@@ -2977,8 +4798,7 @@
         </w:tc>
         <w:tc>
           <w:tcPr>
-            <w:tcW w:type="dxa" w:w="1740"/>
-            <w:shd w:fill="E2F0D9"/>
+            <w:tcW w:type="dxa" w:w="1570"/>
           </w:tcPr>
           <w:p>
             <w:r>
@@ -3017,7 +4837,25 @@
         </w:tc>
         <w:tc>
           <w:tcPr>
-            <w:tcW w:type="dxa" w:w="2200"/>
+            <w:tcW w:type="dxa" w:w="620"/>
+            <w:shd w:fill="FAFBFC"/>
+          </w:tcPr>
+          <w:p>
+            <w:r>
+              <w:rPr>
+                <w:rFonts w:ascii="Calibri" w:hAnsi="Calibri"/>
+                <w:b/>
+                <w:i w:val="0"/>
+                <w:color w:val="1F2937"/>
+                <w:sz w:val="15"/>
+              </w:rPr>
+              <w:t>664</w:t>
+            </w:r>
+          </w:p>
+        </w:tc>
+        <w:tc>
+          <w:tcPr>
+            <w:tcW w:type="dxa" w:w="2050"/>
             <w:shd w:fill="FAFBFC"/>
           </w:tcPr>
           <w:p>
@@ -3035,8 +4873,8 @@
         </w:tc>
         <w:tc>
           <w:tcPr>
-            <w:tcW w:type="dxa" w:w="4800"/>
-            <w:shd w:fill="FAFBFC"/>
+            <w:tcW w:type="dxa" w:w="4500"/>
+            <w:shd w:fill="E2F0D9"/>
           </w:tcPr>
           <w:p>
             <w:r>
@@ -3055,8 +4893,8 @@
         </w:tc>
         <w:tc>
           <w:tcPr>
-            <w:tcW w:type="dxa" w:w="1740"/>
-            <w:shd w:fill="E2F0D9"/>
+            <w:tcW w:type="dxa" w:w="1570"/>
+            <w:shd w:fill="FAFBFC"/>
           </w:tcPr>
           <w:p>
             <w:r>
@@ -3094,7 +4932,24 @@
         </w:tc>
         <w:tc>
           <w:tcPr>
-            <w:tcW w:type="dxa" w:w="2200"/>
+            <w:tcW w:type="dxa" w:w="620"/>
+          </w:tcPr>
+          <w:p>
+            <w:r>
+              <w:rPr>
+                <w:rFonts w:ascii="Calibri" w:hAnsi="Calibri"/>
+                <w:b/>
+                <w:i w:val="0"/>
+                <w:color w:val="1F2937"/>
+                <w:sz w:val="15"/>
+              </w:rPr>
+              <w:t>661</w:t>
+            </w:r>
+          </w:p>
+        </w:tc>
+        <w:tc>
+          <w:tcPr>
+            <w:tcW w:type="dxa" w:w="2050"/>
           </w:tcPr>
           <w:p>
             <w:r>
@@ -3111,7 +4966,8 @@
         </w:tc>
         <w:tc>
           <w:tcPr>
-            <w:tcW w:type="dxa" w:w="4800"/>
+            <w:tcW w:type="dxa" w:w="4500"/>
+            <w:shd w:fill="E2F0D9"/>
           </w:tcPr>
           <w:p>
             <w:r>
@@ -3130,8 +4986,7 @@
         </w:tc>
         <w:tc>
           <w:tcPr>
-            <w:tcW w:type="dxa" w:w="1740"/>
-            <w:shd w:fill="E2F0D9"/>
+            <w:tcW w:type="dxa" w:w="1570"/>
           </w:tcPr>
           <w:p>
             <w:r>
@@ -3170,7 +5025,25 @@
         </w:tc>
         <w:tc>
           <w:tcPr>
-            <w:tcW w:type="dxa" w:w="2200"/>
+            <w:tcW w:type="dxa" w:w="620"/>
+            <w:shd w:fill="FAFBFC"/>
+          </w:tcPr>
+          <w:p>
+            <w:r>
+              <w:rPr>
+                <w:rFonts w:ascii="Calibri" w:hAnsi="Calibri"/>
+                <w:b/>
+                <w:i w:val="0"/>
+                <w:color w:val="1F2937"/>
+                <w:sz w:val="15"/>
+              </w:rPr>
+              <w:t>655</w:t>
+            </w:r>
+          </w:p>
+        </w:tc>
+        <w:tc>
+          <w:tcPr>
+            <w:tcW w:type="dxa" w:w="2050"/>
             <w:shd w:fill="FAFBFC"/>
           </w:tcPr>
           <w:p>
@@ -3188,8 +5061,8 @@
         </w:tc>
         <w:tc>
           <w:tcPr>
-            <w:tcW w:type="dxa" w:w="4800"/>
-            <w:shd w:fill="FAFBFC"/>
+            <w:tcW w:type="dxa" w:w="4500"/>
+            <w:shd w:fill="E2F0D9"/>
           </w:tcPr>
           <w:p>
             <w:r>
@@ -3208,8 +5081,8 @@
         </w:tc>
         <w:tc>
           <w:tcPr>
-            <w:tcW w:type="dxa" w:w="1740"/>
-            <w:shd w:fill="E2F0D9"/>
+            <w:tcW w:type="dxa" w:w="1570"/>
+            <w:shd w:fill="FAFBFC"/>
           </w:tcPr>
           <w:p>
             <w:r>
@@ -3247,7 +5120,24 @@
         </w:tc>
         <w:tc>
           <w:tcPr>
-            <w:tcW w:type="dxa" w:w="2200"/>
+            <w:tcW w:type="dxa" w:w="620"/>
+          </w:tcPr>
+          <w:p>
+            <w:r>
+              <w:rPr>
+                <w:rFonts w:ascii="Calibri" w:hAnsi="Calibri"/>
+                <w:b/>
+                <w:i w:val="0"/>
+                <w:color w:val="1F2937"/>
+                <w:sz w:val="15"/>
+              </w:rPr>
+              <w:t>632</w:t>
+            </w:r>
+          </w:p>
+        </w:tc>
+        <w:tc>
+          <w:tcPr>
+            <w:tcW w:type="dxa" w:w="2050"/>
           </w:tcPr>
           <w:p>
             <w:r>
@@ -3264,7 +5154,8 @@
         </w:tc>
         <w:tc>
           <w:tcPr>
-            <w:tcW w:type="dxa" w:w="4800"/>
+            <w:tcW w:type="dxa" w:w="4500"/>
+            <w:shd w:fill="E2F0D9"/>
           </w:tcPr>
           <w:p>
             <w:r>
@@ -3283,8 +5174,7 @@
         </w:tc>
         <w:tc>
           <w:tcPr>
-            <w:tcW w:type="dxa" w:w="1740"/>
-            <w:shd w:fill="E2F0D9"/>
+            <w:tcW w:type="dxa" w:w="1570"/>
           </w:tcPr>
           <w:p>
             <w:r>
@@ -3323,7 +5213,25 @@
         </w:tc>
         <w:tc>
           <w:tcPr>
-            <w:tcW w:type="dxa" w:w="2200"/>
+            <w:tcW w:type="dxa" w:w="620"/>
+            <w:shd w:fill="FAFBFC"/>
+          </w:tcPr>
+          <w:p>
+            <w:r>
+              <w:rPr>
+                <w:rFonts w:ascii="Calibri" w:hAnsi="Calibri"/>
+                <w:b/>
+                <w:i w:val="0"/>
+                <w:color w:val="1F2937"/>
+                <w:sz w:val="15"/>
+              </w:rPr>
+              <w:t>630</w:t>
+            </w:r>
+          </w:p>
+        </w:tc>
+        <w:tc>
+          <w:tcPr>
+            <w:tcW w:type="dxa" w:w="2050"/>
             <w:shd w:fill="FAFBFC"/>
           </w:tcPr>
           <w:p>
@@ -3341,8 +5249,8 @@
         </w:tc>
         <w:tc>
           <w:tcPr>
-            <w:tcW w:type="dxa" w:w="4800"/>
-            <w:shd w:fill="FAFBFC"/>
+            <w:tcW w:type="dxa" w:w="4500"/>
+            <w:shd w:fill="E2F0D9"/>
           </w:tcPr>
           <w:p>
             <w:r>
@@ -3361,8 +5269,8 @@
         </w:tc>
         <w:tc>
           <w:tcPr>
-            <w:tcW w:type="dxa" w:w="1740"/>
-            <w:shd w:fill="E2F0D9"/>
+            <w:tcW w:type="dxa" w:w="1570"/>
+            <w:shd w:fill="FAFBFC"/>
           </w:tcPr>
           <w:p>
             <w:r>
@@ -3400,7 +5308,24 @@
         </w:tc>
         <w:tc>
           <w:tcPr>
-            <w:tcW w:type="dxa" w:w="2200"/>
+            <w:tcW w:type="dxa" w:w="620"/>
+          </w:tcPr>
+          <w:p>
+            <w:r>
+              <w:rPr>
+                <w:rFonts w:ascii="Calibri" w:hAnsi="Calibri"/>
+                <w:b/>
+                <w:i w:val="0"/>
+                <w:color w:val="1F2937"/>
+                <w:sz w:val="15"/>
+              </w:rPr>
+              <w:t>614</w:t>
+            </w:r>
+          </w:p>
+        </w:tc>
+        <w:tc>
+          <w:tcPr>
+            <w:tcW w:type="dxa" w:w="2050"/>
           </w:tcPr>
           <w:p>
             <w:r>
@@ -3417,7 +5342,8 @@
         </w:tc>
         <w:tc>
           <w:tcPr>
-            <w:tcW w:type="dxa" w:w="4800"/>
+            <w:tcW w:type="dxa" w:w="4500"/>
+            <w:shd w:fill="E2F0D9"/>
           </w:tcPr>
           <w:p>
             <w:r>
@@ -3436,8 +5362,7 @@
         </w:tc>
         <w:tc>
           <w:tcPr>
-            <w:tcW w:type="dxa" w:w="1740"/>
-            <w:shd w:fill="E2F0D9"/>
+            <w:tcW w:type="dxa" w:w="1570"/>
           </w:tcPr>
           <w:p>
             <w:r>
@@ -3485,9 +5410,10 @@
       </w:tblPr>
       <w:tblGrid>
         <w:gridCol w:w="620"/>
-        <w:gridCol w:w="2200"/>
-        <w:gridCol w:w="4800"/>
-        <w:gridCol w:w="1740"/>
+        <w:gridCol w:w="620"/>
+        <w:gridCol w:w="2050"/>
+        <w:gridCol w:w="4500"/>
+        <w:gridCol w:w="1570"/>
       </w:tblGrid>
       <w:tr>
         <w:tc>
@@ -3517,7 +5443,32 @@
         </w:tc>
         <w:tc>
           <w:tcPr>
-            <w:tcW w:type="dxa" w:w="2200"/>
+            <w:tcW w:type="dxa" w:w="620"/>
+            <w:tcMar>
+              <w:top w:w="80" w:type="dxa"/>
+              <w:start w:w="120" w:type="dxa"/>
+              <w:bottom w:w="80" w:type="dxa"/>
+              <w:end w:w="120" w:type="dxa"/>
+            </w:tcMar>
+            <w:vAlign w:val="center"/>
+            <w:shd w:fill="E8EEF5"/>
+          </w:tcPr>
+          <w:p>
+            <w:r>
+              <w:rPr>
+                <w:rFonts w:ascii="Calibri" w:hAnsi="Calibri"/>
+                <w:b/>
+                <w:i w:val="0"/>
+                <w:color w:val="17365D"/>
+                <w:sz w:val="16"/>
+              </w:rPr>
+              <w:t>n</w:t>
+            </w:r>
+          </w:p>
+        </w:tc>
+        <w:tc>
+          <w:tcPr>
+            <w:tcW w:type="dxa" w:w="2050"/>
             <w:tcMar>
               <w:top w:w="80" w:type="dxa"/>
               <w:start w:w="120" w:type="dxa"/>
@@ -3542,7 +5493,7 @@
         </w:tc>
         <w:tc>
           <w:tcPr>
-            <w:tcW w:type="dxa" w:w="4800"/>
+            <w:tcW w:type="dxa" w:w="4500"/>
             <w:tcMar>
               <w:top w:w="80" w:type="dxa"/>
               <w:start w:w="120" w:type="dxa"/>
@@ -3567,7 +5518,7 @@
         </w:tc>
         <w:tc>
           <w:tcPr>
-            <w:tcW w:type="dxa" w:w="1740"/>
+            <w:tcW w:type="dxa" w:w="1570"/>
             <w:tcMar>
               <w:top w:w="80" w:type="dxa"/>
               <w:start w:w="120" w:type="dxa"/>
@@ -3611,7 +5562,24 @@
         </w:tc>
         <w:tc>
           <w:tcPr>
-            <w:tcW w:type="dxa" w:w="2200"/>
+            <w:tcW w:type="dxa" w:w="620"/>
+          </w:tcPr>
+          <w:p>
+            <w:r>
+              <w:rPr>
+                <w:rFonts w:ascii="Calibri" w:hAnsi="Calibri"/>
+                <w:b/>
+                <w:i w:val="0"/>
+                <w:color w:val="1F2937"/>
+                <w:sz w:val="15"/>
+              </w:rPr>
+              <w:t>603</w:t>
+            </w:r>
+          </w:p>
+        </w:tc>
+        <w:tc>
+          <w:tcPr>
+            <w:tcW w:type="dxa" w:w="2050"/>
           </w:tcPr>
           <w:p>
             <w:r>
@@ -3628,7 +5596,8 @@
         </w:tc>
         <w:tc>
           <w:tcPr>
-            <w:tcW w:type="dxa" w:w="4800"/>
+            <w:tcW w:type="dxa" w:w="4500"/>
+            <w:shd w:fill="E2F0D9"/>
           </w:tcPr>
           <w:p>
             <w:r>
@@ -3647,8 +5616,7 @@
         </w:tc>
         <w:tc>
           <w:tcPr>
-            <w:tcW w:type="dxa" w:w="1740"/>
-            <w:shd w:fill="E2F0D9"/>
+            <w:tcW w:type="dxa" w:w="1570"/>
           </w:tcPr>
           <w:p>
             <w:r>
@@ -3687,7 +5655,25 @@
         </w:tc>
         <w:tc>
           <w:tcPr>
-            <w:tcW w:type="dxa" w:w="2200"/>
+            <w:tcW w:type="dxa" w:w="620"/>
+            <w:shd w:fill="FAFBFC"/>
+          </w:tcPr>
+          <w:p>
+            <w:r>
+              <w:rPr>
+                <w:rFonts w:ascii="Calibri" w:hAnsi="Calibri"/>
+                <w:b/>
+                <w:i w:val="0"/>
+                <w:color w:val="1F2937"/>
+                <w:sz w:val="15"/>
+              </w:rPr>
+              <w:t>503</w:t>
+            </w:r>
+          </w:p>
+        </w:tc>
+        <w:tc>
+          <w:tcPr>
+            <w:tcW w:type="dxa" w:w="2050"/>
             <w:shd w:fill="FAFBFC"/>
           </w:tcPr>
           <w:p>
@@ -3705,8 +5691,8 @@
         </w:tc>
         <w:tc>
           <w:tcPr>
-            <w:tcW w:type="dxa" w:w="4800"/>
-            <w:shd w:fill="FAFBFC"/>
+            <w:tcW w:type="dxa" w:w="4500"/>
+            <w:shd w:fill="E2F0D9"/>
           </w:tcPr>
           <w:p>
             <w:r>
@@ -3725,8 +5711,8 @@
         </w:tc>
         <w:tc>
           <w:tcPr>
-            <w:tcW w:type="dxa" w:w="1740"/>
-            <w:shd w:fill="E2F0D9"/>
+            <w:tcW w:type="dxa" w:w="1570"/>
+            <w:shd w:fill="FAFBFC"/>
           </w:tcPr>
           <w:p>
             <w:r>
@@ -3764,7 +5750,24 @@
         </w:tc>
         <w:tc>
           <w:tcPr>
-            <w:tcW w:type="dxa" w:w="2200"/>
+            <w:tcW w:type="dxa" w:w="620"/>
+          </w:tcPr>
+          <w:p>
+            <w:r>
+              <w:rPr>
+                <w:rFonts w:ascii="Calibri" w:hAnsi="Calibri"/>
+                <w:b/>
+                <w:i w:val="0"/>
+                <w:color w:val="1F2937"/>
+                <w:sz w:val="15"/>
+              </w:rPr>
+              <w:t>473</w:t>
+            </w:r>
+          </w:p>
+        </w:tc>
+        <w:tc>
+          <w:tcPr>
+            <w:tcW w:type="dxa" w:w="2050"/>
           </w:tcPr>
           <w:p>
             <w:r>
@@ -3781,7 +5784,8 @@
         </w:tc>
         <w:tc>
           <w:tcPr>
-            <w:tcW w:type="dxa" w:w="4800"/>
+            <w:tcW w:type="dxa" w:w="4500"/>
+            <w:shd w:fill="E2F0D9"/>
           </w:tcPr>
           <w:p>
             <w:r>
@@ -3800,8 +5804,7 @@
         </w:tc>
         <w:tc>
           <w:tcPr>
-            <w:tcW w:type="dxa" w:w="1740"/>
-            <w:shd w:fill="E2F0D9"/>
+            <w:tcW w:type="dxa" w:w="1570"/>
           </w:tcPr>
           <w:p>
             <w:r>
@@ -3840,7 +5843,25 @@
         </w:tc>
         <w:tc>
           <w:tcPr>
-            <w:tcW w:type="dxa" w:w="2200"/>
+            <w:tcW w:type="dxa" w:w="620"/>
+            <w:shd w:fill="FAFBFC"/>
+          </w:tcPr>
+          <w:p>
+            <w:r>
+              <w:rPr>
+                <w:rFonts w:ascii="Calibri" w:hAnsi="Calibri"/>
+                <w:b/>
+                <w:i w:val="0"/>
+                <w:color w:val="1F2937"/>
+                <w:sz w:val="15"/>
+              </w:rPr>
+              <w:t>469</w:t>
+            </w:r>
+          </w:p>
+        </w:tc>
+        <w:tc>
+          <w:tcPr>
+            <w:tcW w:type="dxa" w:w="2050"/>
             <w:shd w:fill="FAFBFC"/>
           </w:tcPr>
           <w:p>
@@ -3858,8 +5879,8 @@
         </w:tc>
         <w:tc>
           <w:tcPr>
-            <w:tcW w:type="dxa" w:w="4800"/>
-            <w:shd w:fill="FAFBFC"/>
+            <w:tcW w:type="dxa" w:w="4500"/>
+            <w:shd w:fill="E2F0D9"/>
           </w:tcPr>
           <w:p>
             <w:r>
@@ -3878,8 +5899,8 @@
         </w:tc>
         <w:tc>
           <w:tcPr>
-            <w:tcW w:type="dxa" w:w="1740"/>
-            <w:shd w:fill="E2F0D9"/>
+            <w:tcW w:type="dxa" w:w="1570"/>
+            <w:shd w:fill="FAFBFC"/>
           </w:tcPr>
           <w:p>
             <w:r>
@@ -3917,7 +5938,24 @@
         </w:tc>
         <w:tc>
           <w:tcPr>
-            <w:tcW w:type="dxa" w:w="2200"/>
+            <w:tcW w:type="dxa" w:w="620"/>
+          </w:tcPr>
+          <w:p>
+            <w:r>
+              <w:rPr>
+                <w:rFonts w:ascii="Calibri" w:hAnsi="Calibri"/>
+                <w:b/>
+                <w:i w:val="0"/>
+                <w:color w:val="1F2937"/>
+                <w:sz w:val="15"/>
+              </w:rPr>
+              <w:t>466</w:t>
+            </w:r>
+          </w:p>
+        </w:tc>
+        <w:tc>
+          <w:tcPr>
+            <w:tcW w:type="dxa" w:w="2050"/>
           </w:tcPr>
           <w:p>
             <w:r>
@@ -3934,7 +5972,8 @@
         </w:tc>
         <w:tc>
           <w:tcPr>
-            <w:tcW w:type="dxa" w:w="4800"/>
+            <w:tcW w:type="dxa" w:w="4500"/>
+            <w:shd w:fill="E2F0D9"/>
           </w:tcPr>
           <w:p>
             <w:r>
@@ -3953,8 +5992,7 @@
         </w:tc>
         <w:tc>
           <w:tcPr>
-            <w:tcW w:type="dxa" w:w="1740"/>
-            <w:shd w:fill="E2F0D9"/>
+            <w:tcW w:type="dxa" w:w="1570"/>
           </w:tcPr>
           <w:p>
             <w:r>
@@ -3993,7 +6031,25 @@
         </w:tc>
         <w:tc>
           <w:tcPr>
-            <w:tcW w:type="dxa" w:w="2200"/>
+            <w:tcW w:type="dxa" w:w="620"/>
+            <w:shd w:fill="FAFBFC"/>
+          </w:tcPr>
+          <w:p>
+            <w:r>
+              <w:rPr>
+                <w:rFonts w:ascii="Calibri" w:hAnsi="Calibri"/>
+                <w:b/>
+                <w:i w:val="0"/>
+                <w:color w:val="1F2937"/>
+                <w:sz w:val="15"/>
+              </w:rPr>
+              <w:t>428</w:t>
+            </w:r>
+          </w:p>
+        </w:tc>
+        <w:tc>
+          <w:tcPr>
+            <w:tcW w:type="dxa" w:w="2050"/>
             <w:shd w:fill="FAFBFC"/>
           </w:tcPr>
           <w:p>
@@ -4011,8 +6067,8 @@
         </w:tc>
         <w:tc>
           <w:tcPr>
-            <w:tcW w:type="dxa" w:w="4800"/>
-            <w:shd w:fill="FAFBFC"/>
+            <w:tcW w:type="dxa" w:w="4500"/>
+            <w:shd w:fill="E2F0D9"/>
           </w:tcPr>
           <w:p>
             <w:r>
@@ -4031,8 +6087,8 @@
         </w:tc>
         <w:tc>
           <w:tcPr>
-            <w:tcW w:type="dxa" w:w="1740"/>
-            <w:shd w:fill="E2F0D9"/>
+            <w:tcW w:type="dxa" w:w="1570"/>
+            <w:shd w:fill="FAFBFC"/>
           </w:tcPr>
           <w:p>
             <w:r>
@@ -4070,7 +6126,24 @@
         </w:tc>
         <w:tc>
           <w:tcPr>
-            <w:tcW w:type="dxa" w:w="2200"/>
+            <w:tcW w:type="dxa" w:w="620"/>
+          </w:tcPr>
+          <w:p>
+            <w:r>
+              <w:rPr>
+                <w:rFonts w:ascii="Calibri" w:hAnsi="Calibri"/>
+                <w:b/>
+                <w:i w:val="0"/>
+                <w:color w:val="1F2937"/>
+                <w:sz w:val="15"/>
+              </w:rPr>
+              <w:t>394</w:t>
+            </w:r>
+          </w:p>
+        </w:tc>
+        <w:tc>
+          <w:tcPr>
+            <w:tcW w:type="dxa" w:w="2050"/>
           </w:tcPr>
           <w:p>
             <w:r>
@@ -4087,7 +6160,8 @@
         </w:tc>
         <w:tc>
           <w:tcPr>
-            <w:tcW w:type="dxa" w:w="4800"/>
+            <w:tcW w:type="dxa" w:w="4500"/>
+            <w:shd w:fill="E2F0D9"/>
           </w:tcPr>
           <w:p>
             <w:r>
@@ -4106,8 +6180,7 @@
         </w:tc>
         <w:tc>
           <w:tcPr>
-            <w:tcW w:type="dxa" w:w="1740"/>
-            <w:shd w:fill="E2F0D9"/>
+            <w:tcW w:type="dxa" w:w="1570"/>
           </w:tcPr>
           <w:p>
             <w:r>
@@ -4146,7 +6219,25 @@
         </w:tc>
         <w:tc>
           <w:tcPr>
-            <w:tcW w:type="dxa" w:w="2200"/>
+            <w:tcW w:type="dxa" w:w="620"/>
+            <w:shd w:fill="FAFBFC"/>
+          </w:tcPr>
+          <w:p>
+            <w:r>
+              <w:rPr>
+                <w:rFonts w:ascii="Calibri" w:hAnsi="Calibri"/>
+                <w:b/>
+                <w:i w:val="0"/>
+                <w:color w:val="1F2937"/>
+                <w:sz w:val="15"/>
+              </w:rPr>
+              <w:t>387</w:t>
+            </w:r>
+          </w:p>
+        </w:tc>
+        <w:tc>
+          <w:tcPr>
+            <w:tcW w:type="dxa" w:w="2050"/>
             <w:shd w:fill="FAFBFC"/>
           </w:tcPr>
           <w:p>
@@ -4164,8 +6255,8 @@
         </w:tc>
         <w:tc>
           <w:tcPr>
-            <w:tcW w:type="dxa" w:w="4800"/>
-            <w:shd w:fill="FAFBFC"/>
+            <w:tcW w:type="dxa" w:w="4500"/>
+            <w:shd w:fill="E2F0D9"/>
           </w:tcPr>
           <w:p>
             <w:r>
@@ -4184,8 +6275,8 @@
         </w:tc>
         <w:tc>
           <w:tcPr>
-            <w:tcW w:type="dxa" w:w="1740"/>
-            <w:shd w:fill="E2F0D9"/>
+            <w:tcW w:type="dxa" w:w="1570"/>
+            <w:shd w:fill="FAFBFC"/>
           </w:tcPr>
           <w:p>
             <w:r>
@@ -4223,7 +6314,24 @@
         </w:tc>
         <w:tc>
           <w:tcPr>
-            <w:tcW w:type="dxa" w:w="2200"/>
+            <w:tcW w:type="dxa" w:w="620"/>
+          </w:tcPr>
+          <w:p>
+            <w:r>
+              <w:rPr>
+                <w:rFonts w:ascii="Calibri" w:hAnsi="Calibri"/>
+                <w:b/>
+                <w:i w:val="0"/>
+                <w:color w:val="1F2937"/>
+                <w:sz w:val="15"/>
+              </w:rPr>
+              <w:t>383</w:t>
+            </w:r>
+          </w:p>
+        </w:tc>
+        <w:tc>
+          <w:tcPr>
+            <w:tcW w:type="dxa" w:w="2050"/>
           </w:tcPr>
           <w:p>
             <w:r>
@@ -4240,7 +6348,8 @@
         </w:tc>
         <w:tc>
           <w:tcPr>
-            <w:tcW w:type="dxa" w:w="4800"/>
+            <w:tcW w:type="dxa" w:w="4500"/>
+            <w:shd w:fill="E2F0D9"/>
           </w:tcPr>
           <w:p>
             <w:r>
@@ -4259,8 +6368,7 @@
         </w:tc>
         <w:tc>
           <w:tcPr>
-            <w:tcW w:type="dxa" w:w="1740"/>
-            <w:shd w:fill="E2F0D9"/>
+            <w:tcW w:type="dxa" w:w="1570"/>
           </w:tcPr>
           <w:p>
             <w:r>
@@ -4299,7 +6407,25 @@
         </w:tc>
         <w:tc>
           <w:tcPr>
-            <w:tcW w:type="dxa" w:w="2200"/>
+            <w:tcW w:type="dxa" w:w="620"/>
+            <w:shd w:fill="FAFBFC"/>
+          </w:tcPr>
+          <w:p>
+            <w:r>
+              <w:rPr>
+                <w:rFonts w:ascii="Calibri" w:hAnsi="Calibri"/>
+                <w:b/>
+                <w:i w:val="0"/>
+                <w:color w:val="1F2937"/>
+                <w:sz w:val="15"/>
+              </w:rPr>
+              <w:t>366</w:t>
+            </w:r>
+          </w:p>
+        </w:tc>
+        <w:tc>
+          <w:tcPr>
+            <w:tcW w:type="dxa" w:w="2050"/>
             <w:shd w:fill="FAFBFC"/>
           </w:tcPr>
           <w:p>
@@ -4317,8 +6443,8 @@
         </w:tc>
         <w:tc>
           <w:tcPr>
-            <w:tcW w:type="dxa" w:w="4800"/>
-            <w:shd w:fill="FAFBFC"/>
+            <w:tcW w:type="dxa" w:w="4500"/>
+            <w:shd w:fill="E2F0D9"/>
           </w:tcPr>
           <w:p>
             <w:r>
@@ -4337,8 +6463,8 @@
         </w:tc>
         <w:tc>
           <w:tcPr>
-            <w:tcW w:type="dxa" w:w="1740"/>
-            <w:shd w:fill="E2F0D9"/>
+            <w:tcW w:type="dxa" w:w="1570"/>
+            <w:shd w:fill="FAFBFC"/>
           </w:tcPr>
           <w:p>
             <w:r>
@@ -4376,7 +6502,24 @@
         </w:tc>
         <w:tc>
           <w:tcPr>
-            <w:tcW w:type="dxa" w:w="2200"/>
+            <w:tcW w:type="dxa" w:w="620"/>
+          </w:tcPr>
+          <w:p>
+            <w:r>
+              <w:rPr>
+                <w:rFonts w:ascii="Calibri" w:hAnsi="Calibri"/>
+                <w:b/>
+                <w:i w:val="0"/>
+                <w:color w:val="1F2937"/>
+                <w:sz w:val="15"/>
+              </w:rPr>
+              <w:t>364</w:t>
+            </w:r>
+          </w:p>
+        </w:tc>
+        <w:tc>
+          <w:tcPr>
+            <w:tcW w:type="dxa" w:w="2050"/>
           </w:tcPr>
           <w:p>
             <w:r>
@@ -4393,7 +6536,8 @@
         </w:tc>
         <w:tc>
           <w:tcPr>
-            <w:tcW w:type="dxa" w:w="4800"/>
+            <w:tcW w:type="dxa" w:w="4500"/>
+            <w:shd w:fill="E2F0D9"/>
           </w:tcPr>
           <w:p>
             <w:r>
@@ -4412,8 +6556,7 @@
         </w:tc>
         <w:tc>
           <w:tcPr>
-            <w:tcW w:type="dxa" w:w="1740"/>
-            <w:shd w:fill="E2F0D9"/>
+            <w:tcW w:type="dxa" w:w="1570"/>
           </w:tcPr>
           <w:p>
             <w:r>
@@ -4452,7 +6595,25 @@
         </w:tc>
         <w:tc>
           <w:tcPr>
-            <w:tcW w:type="dxa" w:w="2200"/>
+            <w:tcW w:type="dxa" w:w="620"/>
+            <w:shd w:fill="FAFBFC"/>
+          </w:tcPr>
+          <w:p>
+            <w:r>
+              <w:rPr>
+                <w:rFonts w:ascii="Calibri" w:hAnsi="Calibri"/>
+                <w:b/>
+                <w:i w:val="0"/>
+                <w:color w:val="1F2937"/>
+                <w:sz w:val="15"/>
+              </w:rPr>
+              <w:t>363</w:t>
+            </w:r>
+          </w:p>
+        </w:tc>
+        <w:tc>
+          <w:tcPr>
+            <w:tcW w:type="dxa" w:w="2050"/>
             <w:shd w:fill="FAFBFC"/>
           </w:tcPr>
           <w:p>
@@ -4470,8 +6631,8 @@
         </w:tc>
         <w:tc>
           <w:tcPr>
-            <w:tcW w:type="dxa" w:w="4800"/>
-            <w:shd w:fill="FAFBFC"/>
+            <w:tcW w:type="dxa" w:w="4500"/>
+            <w:shd w:fill="E2F0D9"/>
           </w:tcPr>
           <w:p>
             <w:r>
@@ -4490,8 +6651,8 @@
         </w:tc>
         <w:tc>
           <w:tcPr>
-            <w:tcW w:type="dxa" w:w="1740"/>
-            <w:shd w:fill="E2F0D9"/>
+            <w:tcW w:type="dxa" w:w="1570"/>
+            <w:shd w:fill="FAFBFC"/>
           </w:tcPr>
           <w:p>
             <w:r>
@@ -4529,7 +6690,24 @@
         </w:tc>
         <w:tc>
           <w:tcPr>
-            <w:tcW w:type="dxa" w:w="2200"/>
+            <w:tcW w:type="dxa" w:w="620"/>
+          </w:tcPr>
+          <w:p>
+            <w:r>
+              <w:rPr>
+                <w:rFonts w:ascii="Calibri" w:hAnsi="Calibri"/>
+                <w:b/>
+                <w:i w:val="0"/>
+                <w:color w:val="1F2937"/>
+                <w:sz w:val="15"/>
+              </w:rPr>
+              <w:t>338</w:t>
+            </w:r>
+          </w:p>
+        </w:tc>
+        <w:tc>
+          <w:tcPr>
+            <w:tcW w:type="dxa" w:w="2050"/>
           </w:tcPr>
           <w:p>
             <w:r>
@@ -4546,7 +6724,8 @@
         </w:tc>
         <w:tc>
           <w:tcPr>
-            <w:tcW w:type="dxa" w:w="4800"/>
+            <w:tcW w:type="dxa" w:w="4500"/>
+            <w:shd w:fill="E2F0D9"/>
           </w:tcPr>
           <w:p>
             <w:r>
@@ -4565,8 +6744,7 @@
         </w:tc>
         <w:tc>
           <w:tcPr>
-            <w:tcW w:type="dxa" w:w="1740"/>
-            <w:shd w:fill="E2F0D9"/>
+            <w:tcW w:type="dxa" w:w="1570"/>
           </w:tcPr>
           <w:p>
             <w:r>
@@ -4605,7 +6783,25 @@
         </w:tc>
         <w:tc>
           <w:tcPr>
-            <w:tcW w:type="dxa" w:w="2200"/>
+            <w:tcW w:type="dxa" w:w="620"/>
+            <w:shd w:fill="FAFBFC"/>
+          </w:tcPr>
+          <w:p>
+            <w:r>
+              <w:rPr>
+                <w:rFonts w:ascii="Calibri" w:hAnsi="Calibri"/>
+                <w:b/>
+                <w:i w:val="0"/>
+                <w:color w:val="1F2937"/>
+                <w:sz w:val="15"/>
+              </w:rPr>
+              <w:t>328</w:t>
+            </w:r>
+          </w:p>
+        </w:tc>
+        <w:tc>
+          <w:tcPr>
+            <w:tcW w:type="dxa" w:w="2050"/>
             <w:shd w:fill="FAFBFC"/>
           </w:tcPr>
           <w:p>
@@ -4623,8 +6819,8 @@
         </w:tc>
         <w:tc>
           <w:tcPr>
-            <w:tcW w:type="dxa" w:w="4800"/>
-            <w:shd w:fill="FAFBFC"/>
+            <w:tcW w:type="dxa" w:w="4500"/>
+            <w:shd w:fill="E2F0D9"/>
           </w:tcPr>
           <w:p>
             <w:r>
@@ -4643,8 +6839,8 @@
         </w:tc>
         <w:tc>
           <w:tcPr>
-            <w:tcW w:type="dxa" w:w="1740"/>
-            <w:shd w:fill="E2F0D9"/>
+            <w:tcW w:type="dxa" w:w="1570"/>
+            <w:shd w:fill="FAFBFC"/>
           </w:tcPr>
           <w:p>
             <w:r>
@@ -4682,7 +6878,24 @@
         </w:tc>
         <w:tc>
           <w:tcPr>
-            <w:tcW w:type="dxa" w:w="2200"/>
+            <w:tcW w:type="dxa" w:w="620"/>
+          </w:tcPr>
+          <w:p>
+            <w:r>
+              <w:rPr>
+                <w:rFonts w:ascii="Calibri" w:hAnsi="Calibri"/>
+                <w:b/>
+                <w:i w:val="0"/>
+                <w:color w:val="1F2937"/>
+                <w:sz w:val="15"/>
+              </w:rPr>
+              <w:t>321</w:t>
+            </w:r>
+          </w:p>
+        </w:tc>
+        <w:tc>
+          <w:tcPr>
+            <w:tcW w:type="dxa" w:w="2050"/>
           </w:tcPr>
           <w:p>
             <w:r>
@@ -4699,7 +6912,8 @@
         </w:tc>
         <w:tc>
           <w:tcPr>
-            <w:tcW w:type="dxa" w:w="4800"/>
+            <w:tcW w:type="dxa" w:w="4500"/>
+            <w:shd w:fill="F2F4F7"/>
           </w:tcPr>
           <w:p>
             <w:r>
@@ -4718,8 +6932,7 @@
         </w:tc>
         <w:tc>
           <w:tcPr>
-            <w:tcW w:type="dxa" w:w="1740"/>
-            <w:shd w:fill="F2F4F7"/>
+            <w:tcW w:type="dxa" w:w="1570"/>
           </w:tcPr>
           <w:p>
             <w:r>
@@ -4767,7 +6980,7 @@
         <w:color w:val="5D6B7A"/>
         <w:sz w:val="16"/>
       </w:rPr>
-      <w:t>Updated 8 September 2026 | Exploratory evidence package</w:t>
+      <w:t>Updated 10 September 2026 | Exploratory evidence package</w:t>
     </w:r>
   </w:p>
 </w:ftr>
@@ -4788,7 +7001,7 @@
         <w:color w:val="5D6B7A"/>
         <w:sz w:val="16"/>
       </w:rPr>
-      <w:t>Updated 8 September 2026 | Exploratory evidence package</w:t>
+      <w:t>Updated 10 September 2026 | Exploratory evidence package</w:t>
     </w:r>
   </w:p>
 </w:ftr>

</xml_diff>

<commit_message>
Document planned hybrid human validation
</commit_message>
<xml_diff>
--- a/deliverables/Antiwork_Exploratory_Analysis_Brief.docx
+++ b/deliverables/Antiwork_Exploratory_Analysis_Brief.docx
@@ -3490,12 +3490,102 @@
                 <w:color w:val="1F2937"/>
                 <w:sz w:val="18"/>
               </w:rPr>
-              <w:t>A future target-specific sentiment study with a validated human reference set and an independent human-coding audit of a stratified topic subsample would test construct validity beyond the current exploratory evidence.</w:t>
+              <w:t>The planned human-validation study below would test construct validity beyond the current exploratory evidence. It has not been conducted and is not a basis for any current result.</w:t>
             </w:r>
           </w:p>
         </w:tc>
       </w:tr>
     </w:tbl>
+    <w:p>
+      <w:pPr>
+        <w:pStyle w:val="Heading2"/>
+      </w:pPr>
+      <w:r>
+        <w:rPr>
+          <w:rFonts w:ascii="Calibri" w:hAnsi="Calibri"/>
+          <w:b/>
+          <w:i w:val="0"/>
+          <w:color w:val="17365D"/>
+          <w:sz w:val="25"/>
+        </w:rPr>
+        <w:t>Planned hybrid human-validation study</w:t>
+      </w:r>
+    </w:p>
+    <w:p>
+      <w:pPr>
+        <w:spacing w:after="80"/>
+      </w:pPr>
+      <w:r>
+        <w:rPr>
+          <w:rFonts w:ascii="Calibri" w:hAnsi="Calibri"/>
+          <w:b w:val="0"/>
+          <w:i w:val="0"/>
+          <w:color w:val="1F2937"/>
+          <w:sz w:val="18"/>
+        </w:rPr>
+        <w:t>The strongest next step is a two-stage hybrid validation study, not a single preset-topic yes-or-no check. The design separates discovery of human-meaningful concepts from direct evaluation of the frozen BERTopic theme map, while keeping coders blinded to model assignments during primary coding.</w:t>
+      </w:r>
+    </w:p>
+    <w:p>
+      <w:pPr>
+        <w:spacing w:after="60"/>
+      </w:pPr>
+      <w:r>
+        <w:rPr>
+          <w:rFonts w:ascii="Calibri" w:hAnsi="Calibri"/>
+          <w:b w:val="0"/>
+          <w:i w:val="0"/>
+          <w:color w:val="1F2937"/>
+          <w:sz w:val="17"/>
+        </w:rPr>
+        <w:t>1. Blinded inductive coding. Draw a stratified exploratory subsample across the major reviewed themes, HDBSCAN outliers or general posts, and the four rolling years. Two trained coders independently identify the dominant concern in each post without being shown the model topic or candidate theme. Approximately 30 to 50 posts per major theme, plus outlier and general-post strata, is a practical starting range; the final sample size should be set prospectively based on feasible coding capacity.</w:t>
+      </w:r>
+    </w:p>
+    <w:p>
+      <w:pPr>
+        <w:spacing w:after="60"/>
+      </w:pPr>
+      <w:r>
+        <w:rPr>
+          <w:rFonts w:ascii="Calibri" w:hAnsi="Calibri"/>
+          <w:b w:val="0"/>
+          <w:i w:val="0"/>
+          <w:color w:val="1F2937"/>
+          <w:sz w:val="17"/>
+        </w:rPr>
+        <w:t>2. Freeze a human-readable codebook. Use the first sample to document missing concepts, merged concepts, inclusion and exclusion rules, and examples. Freeze the nine-theme codebook before drawing a fresh, independent validation sample. Validate the nine top-level themes before attempting the more granular 27-cluster subtheme map.</w:t>
+      </w:r>
+    </w:p>
+    <w:p>
+      <w:pPr>
+        <w:spacing w:after="60"/>
+      </w:pPr>
+      <w:r>
+        <w:rPr>
+          <w:rFonts w:ascii="Calibri" w:hAnsi="Calibri"/>
+          <w:b w:val="0"/>
+          <w:i w:val="0"/>
+          <w:color w:val="1F2937"/>
+          <w:sz w:val="17"/>
+        </w:rPr>
+        <w:t>3. Independently validate the model map. On the fresh sample, coders apply the frozen codebook while still blinded to BERTopic assignments. Report raw agreement and Krippendorff's alpha before adjudication. Then compare adjudicated human codes with the BERTopic map using per-theme precision, recall, F1, confusion matrices, and coverage of outlier or other posts.</w:t>
+      </w:r>
+    </w:p>
+    <w:p>
+      <w:pPr>
+        <w:spacing w:after="100"/>
+      </w:pPr>
+      <w:r>
+        <w:rPr>
+          <w:rFonts w:ascii="Calibri" w:hAnsi="Calibri"/>
+          <w:b w:val="0"/>
+          <w:i w:val="0"/>
+          <w:color w:val="1F2937"/>
+          <w:sz w:val="17"/>
+        </w:rPr>
+        <w:t>4. Use preset fit ratings only as a secondary audit. After independent coding is complete, representative posts and random nonmatching controls may be rated for how well a displayed model label fits. This can assess coherence and interpretability, but it should not replace blind coding because showing the proposed theme first can anchor raters.</w:t>
+      </w:r>
+    </w:p>
     <w:p>
       <w:pPr>
         <w:pStyle w:val="Heading2"/>
@@ -6980,7 +7070,7 @@
         <w:color w:val="5D6B7A"/>
         <w:sz w:val="16"/>
       </w:rPr>
-      <w:t>Updated 10 September 2026 | Exploratory evidence package</w:t>
+      <w:t>Updated 11 September 2026 | Exploratory evidence package</w:t>
     </w:r>
   </w:p>
 </w:ftr>
@@ -7001,7 +7091,7 @@
         <w:color w:val="5D6B7A"/>
         <w:sz w:val="16"/>
       </w:rPr>
-      <w:t>Updated 10 September 2026 | Exploratory evidence package</w:t>
+      <w:t>Updated 11 September 2026 | Exploratory evidence package</w:t>
     </w:r>
   </w:p>
 </w:ftr>

</xml_diff>